<commit_message>
refactoring file and date
</commit_message>
<xml_diff>
--- a/OpenVLA_day01_stage_CCNB.docx
+++ b/OpenVLA_day01_stage_CCNB.docx
@@ -13,11 +13,10 @@
     </w:p>
     <w:p>
       <w:pPr>
-        <w:pStyle w:val="Title"/>
         <w:jc w:val="center"/>
       </w:pPr>
       <w:r>
-        <w:t>openVLA</w:t>
+        <w:t>Par : Fabrice Kouonang | Date : 14 mai 2026 | Jour : 01</w:t>
       </w:r>
     </w:p>
     <w:p>
@@ -122,17 +121,6 @@
       </w:r>
     </w:p>
     <w:p/>
-    <w:p>
-      <w:r>
-        <w:t>Programmeur : Fabrice Kouonang</w:t>
-        <w:br/>
-        <w:t>Projet : OpenVLA — Stage CCNB-INNOV</w:t>
-        <w:br/>
-        <w:t>Date : 14 mai 2026</w:t>
-        <w:br/>
-        <w:t>Jour : 01</w:t>
-      </w:r>
-    </w:p>
     <w:sectPr>
       <w:pgSz w:w="12240" w:h="15840"/>
       <w:pgMar w:top="1440" w:right="1800" w:bottom="1440" w:left="1800" w:header="720" w:footer="720" w:gutter="0"/>

</xml_diff>

<commit_message>
mise à jour rapport 3first point
</commit_message>
<xml_diff>
--- a/OpenVLA_day01_stage_CCNB.docx
+++ b/OpenVLA_day01_stage_CCNB.docx
@@ -24,15 +24,97 @@
         <w:pStyle w:val="Heading1"/>
       </w:pPr>
       <w:r>
-        <w:t>Intro stage</w:t>
+        <w:t>Rapport final de stage — Synthèse OpenVLA</w:t>
+      </w:r>
+    </w:p>
+    <w:p>
+      <w:r>
+        <w:t>Ce document constitue le rapport final du stage réalisé au CCNB-INNOV. Il présente la veille technologique, l'expérimentation pratique et l'intégration d'un démonstrateur OpenVLA couplant un robot collaboratif UR et une caméra Zivid 2+ MR130. Les trois premières parties répondent aux objectifs initiaux du stage : architecture OpenVLA, composantes de la pipeline et comparaison aux approches robotiques traditionnelles.</w:t>
       </w:r>
     </w:p>
     <w:p>
       <w:pPr>
-        <w:spacing w:after="240"/>
+        <w:pStyle w:val="Heading2"/>
       </w:pPr>
       <w:r>
-        <w:t>Développement d’un démonstrateur OpenVLA pour robot collaboratif UR et vision 2D ou 3D ZIVID</w:t>
+        <w:t>Contexte et question directrice</w:t>
+      </w:r>
+    </w:p>
+    <w:p>
+      <w:r>
+        <w:t>Quels sont les ingrédients de la « sauce OpenVLA » et en quoi cette approche diffère-t-elle des méthodes robotiques plus traditionnelles ? Le stage combine veille technologique, expérimentation sur banc réel (Windows 11 Pro, GPU NVIDIA, Python 3.11) et documentation technique.</w:t>
+      </w:r>
+    </w:p>
+    <w:p>
+      <w:pPr>
+        <w:pStyle w:val="Heading2"/>
+      </w:pPr>
+      <w:r>
+        <w:t>Objectifs du stage</w:t>
+      </w:r>
+    </w:p>
+    <w:p>
+      <w:pPr>
+        <w:pStyle w:val="ListBullet"/>
+      </w:pPr>
+      <w:r>
+        <w:t>Étudier l'architecture générale d'OpenVLA et en produire une description technique claire et structurée.</w:t>
+      </w:r>
+    </w:p>
+    <w:p>
+      <w:pPr>
+        <w:pStyle w:val="ListBullet"/>
+      </w:pPr>
+      <w:r>
+        <w:t>Identifier les différentes composantes de la pipeline : perception, inférence, génération d'actions et exécution robotique.</w:t>
+      </w:r>
+    </w:p>
+    <w:p>
+      <w:pPr>
+        <w:pStyle w:val="ListBullet"/>
+      </w:pPr>
+      <w:r>
+        <w:t>Comparer l'approche OpenVLA aux approches robotiques traditionnelles (programmation, perception, planification, contrôle).</w:t>
+      </w:r>
+    </w:p>
+    <w:p>
+      <w:pPr>
+        <w:pStyle w:val="ListBullet"/>
+      </w:pPr>
+      <w:r>
+        <w:t>Mettre en place un démonstrateur expérimental UR + Zivid.</w:t>
+      </w:r>
+    </w:p>
+    <w:p>
+      <w:pPr>
+        <w:pStyle w:val="ListBullet"/>
+      </w:pPr>
+      <w:r>
+        <w:t>Réaliser l'intégration logicielle et matérielle du démonstrateur.</w:t>
+      </w:r>
+    </w:p>
+    <w:p>
+      <w:pPr>
+        <w:pStyle w:val="ListBullet"/>
+      </w:pPr>
+      <w:r>
+        <w:t>Effectuer des essais, analyser les résultats et documenter limites et opportunités.</w:t>
+      </w:r>
+    </w:p>
+    <w:p>
+      <w:pPr>
+        <w:pStyle w:val="ListBullet"/>
+      </w:pPr>
+      <w:r>
+        <w:t>Produire une documentation technique et une synthèse pour l'équipe CCNB-INNOV.</w:t>
+      </w:r>
+    </w:p>
+    <w:p>
+      <w:pPr>
+        <w:pStyle w:val="ListBullet"/>
+      </w:pPr>
+      <w:r>
+        <w:t>Présenter les résultats sous forme de démonstration et présentation technique.</w:t>
       </w:r>
     </w:p>
     <w:p>
@@ -40,12 +122,132 @@
         <w:pStyle w:val="Heading1"/>
       </w:pPr>
       <w:r>
-        <w:t>Objectifs</w:t>
+        <w:t>Table des matières</w:t>
       </w:r>
     </w:p>
     <w:p>
       <w:r>
-        <w:t>Le projet visera en particulier à répondre à la question suivante : quels sont les ingrédients de la « sauce OpenVLA » et en quoi cette approche diffère-t-elle des méthodes robotiques plus traditionnelles ? Le stage permettra donc de combiner veille technologique, expérimentation pratique, intégration robotique et vulgarisation technique.</w:t>
+        <w:rPr>
+          <w:sz w:val="22"/>
+        </w:rPr>
+        <w:t>I. Architecture générale d'OpenVLA</w:t>
+      </w:r>
+    </w:p>
+    <w:p>
+      <w:r>
+        <w:rPr>
+          <w:sz w:val="22"/>
+        </w:rPr>
+        <w:t xml:space="preserve">   I.1  Définition et positionnement du modèle</w:t>
+      </w:r>
+    </w:p>
+    <w:p>
+      <w:r>
+        <w:rPr>
+          <w:sz w:val="22"/>
+        </w:rPr>
+        <w:t xml:space="preserve">   I.2  Architecture technique (encodeur, projecteur, LLM)</w:t>
+      </w:r>
+    </w:p>
+    <w:p>
+      <w:r>
+        <w:rPr>
+          <w:sz w:val="22"/>
+        </w:rPr>
+        <w:t xml:space="preserve">   I.3  Boucle Vision — Langage — Action</w:t>
+      </w:r>
+    </w:p>
+    <w:p>
+      <w:r>
+        <w:rPr>
+          <w:sz w:val="22"/>
+        </w:rPr>
+        <w:t xml:space="preserve">   I.4  Modèle openvla-7b et contraintes matérielles</w:t>
+      </w:r>
+    </w:p>
+    <w:p>
+      <w:r>
+        <w:rPr>
+          <w:sz w:val="22"/>
+        </w:rPr>
+        <w:t>II. Composantes de la pipeline du démonstrateur</w:t>
+      </w:r>
+    </w:p>
+    <w:p>
+      <w:r>
+        <w:rPr>
+          <w:sz w:val="22"/>
+        </w:rPr>
+        <w:t xml:space="preserve">   II.1  Perception : caméra Zivid MR130</w:t>
+      </w:r>
+    </w:p>
+    <w:p>
+      <w:r>
+        <w:rPr>
+          <w:sz w:val="22"/>
+        </w:rPr>
+        <w:t xml:space="preserve">   II.2  Inférence : OpenVLA (transformers, predict_action)</w:t>
+      </w:r>
+    </w:p>
+    <w:p>
+      <w:r>
+        <w:rPr>
+          <w:sz w:val="22"/>
+        </w:rPr>
+        <w:t xml:space="preserve">   II.3  Génération d'actions et format de sortie</w:t>
+      </w:r>
+    </w:p>
+    <w:p>
+      <w:r>
+        <w:rPr>
+          <w:sz w:val="22"/>
+        </w:rPr>
+        <w:t xml:space="preserve">   II.4  Exécution robotique : UR (URScript / ur-rtde)</w:t>
+      </w:r>
+    </w:p>
+    <w:p>
+      <w:r>
+        <w:rPr>
+          <w:sz w:val="22"/>
+        </w:rPr>
+        <w:t>III. Comparaison OpenVLA et robotique traditionnelle</w:t>
+      </w:r>
+    </w:p>
+    <w:p>
+      <w:r>
+        <w:rPr>
+          <w:sz w:val="22"/>
+        </w:rPr>
+        <w:t xml:space="preserve">   III.1  Programmation de tâches</w:t>
+      </w:r>
+    </w:p>
+    <w:p>
+      <w:r>
+        <w:rPr>
+          <w:sz w:val="22"/>
+        </w:rPr>
+        <w:t xml:space="preserve">   III.2  Perception et représentation de la scène</w:t>
+      </w:r>
+    </w:p>
+    <w:p>
+      <w:r>
+        <w:rPr>
+          <w:sz w:val="22"/>
+        </w:rPr>
+        <w:t xml:space="preserve">   III.3  Planification, contrôle et intégration</w:t>
+      </w:r>
+    </w:p>
+    <w:p>
+      <w:r>
+        <w:rPr>
+          <w:sz w:val="22"/>
+        </w:rPr>
+        <w:t xml:space="preserve">   III.4  Synthèse pour le démonstrateur CCNB-INNOV</w:t>
+      </w:r>
+    </w:p>
+    <w:p>
+      <w:r>
+        <w:br w:type="page"/>
       </w:r>
     </w:p>
     <w:p>
@@ -53,7 +255,20 @@
         <w:pStyle w:val="Heading1"/>
       </w:pPr>
       <w:r>
-        <w:t>Principales responsabilités</w:t>
+        <w:t>I. Architecture générale d'OpenVLA</w:t>
+      </w:r>
+    </w:p>
+    <w:p>
+      <w:pPr>
+        <w:pStyle w:val="Heading2"/>
+      </w:pPr>
+      <w:r>
+        <w:t>I.1 Définition et positionnement du modèle</w:t>
+      </w:r>
+    </w:p>
+    <w:p>
+      <w:r>
+        <w:t>OpenVLA (Open Vision-Language-Action) est un modèle open source de 7 milliards de paramètres, introduit en 2024 (Kim et al., arXiv:2406.09246). Il apprend à associer une observation visuelle, une consigne en langage naturel et une action robotique. Entraîné sur environ 970 000 démonstrations robotiques du jeu de données Open X-Embodiment, il vise le contrôle generaliste de manipulation : une seule politique peut être adaptée à plusieurs plateformes robotiques via fine-tuning.</w:t>
       </w:r>
     </w:p>
     <w:p>
@@ -61,7 +276,7 @@
         <w:pStyle w:val="ListBullet"/>
       </w:pPr>
       <w:r>
-        <w:t>Étudier l’architecture générale d’OpenVLA et en produire une description technique claire et structurée.</w:t>
+        <w:t>Entrées : image RGB de la scène (224×224 px) + instruction textuelle.</w:t>
       </w:r>
     </w:p>
     <w:p>
@@ -69,7 +284,7 @@
         <w:pStyle w:val="ListBullet"/>
       </w:pPr>
       <w:r>
-        <w:t>Identifier les différentes composantes de la pipeline : perception, représentation des données, traitement des entrées multimodales, inférence, génération d’actions et exécution robotique.</w:t>
+        <w:t>Sortie : action robotique discrétisée puis dé-normalisée (7 dimensions).</w:t>
       </w:r>
     </w:p>
     <w:p>
@@ -77,7 +292,7 @@
         <w:pStyle w:val="ListBullet"/>
       </w:pPr>
       <w:r>
-        <w:t>Comparer l’approche OpenVLA aux approches robotiques traditionnelles, notamment en ce qui concerne la programmation de tâches, la perception, la planification et le contrôle.</w:t>
+        <w:t>Checkpoint utilisé au stage : openvla/openvla-7b (Hugging Face, trust_remote_code=True).</w:t>
       </w:r>
     </w:p>
     <w:p>
@@ -85,7 +300,20 @@
         <w:pStyle w:val="ListBullet"/>
       </w:pPr>
       <w:r>
-        <w:t>Mettre en place un démonstrateur expérimental utilisant un robot collaboratif UR et une caméra Zivid.</w:t>
+        <w:t>Références : https://openvla.github.io/ | https://arxiv.org/abs/2406.09246</w:t>
+      </w:r>
+    </w:p>
+    <w:p>
+      <w:pPr>
+        <w:pStyle w:val="Heading2"/>
+      </w:pPr>
+      <w:r>
+        <w:t>I.2 Architecture technique (encodeur, projecteur, LLM)</w:t>
+      </w:r>
+    </w:p>
+    <w:p>
+      <w:r>
+        <w:t>L'architecture repose sur trois blocs, hérités du cadre Prismatic-7B VLM fine-tuné pour l'action :</w:t>
       </w:r>
     </w:p>
     <w:p>
@@ -93,7 +321,7 @@
         <w:pStyle w:val="ListBullet"/>
       </w:pPr>
       <w:r>
-        <w:t>Réaliser l’intégration logicielle et matérielle nécessaire au fonctionnement du démonstrateur.</w:t>
+        <w:t>Encodeur visuel fusionné : DINOv2 ViT-L/14 + SigLIP ViT-So400M/14. Les patches d'image passent dans les deux encodeurs ; les features sont concaténées. DINOv2 améliore le raisonnement spatial, SigLIP apporte des représentations sémantiques riches.</w:t>
       </w:r>
     </w:p>
     <w:p>
@@ -101,7 +329,7 @@
         <w:pStyle w:val="ListBullet"/>
       </w:pPr>
       <w:r>
-        <w:t>Effectuer des essais, analyser les résultats obtenus et documenter les limites, défis et opportunités de l’approche.</w:t>
+        <w:t>Projecteur (MLP 2 couches) : mappe les embeddings visuels vers l'espace d'entrée du modèle de langage.</w:t>
       </w:r>
     </w:p>
     <w:p>
@@ -109,7 +337,165 @@
         <w:pStyle w:val="ListBullet"/>
       </w:pPr>
       <w:r>
-        <w:t>Produire une documentation technique et une synthèse vulgarisée destinée à l’équipe de CCNB-INNOV.</w:t>
+        <w:t>LLM Llama 2 7B : prédit des jetons d'action (pas du texte conversationnel). Une tête d'action dé-quantifie ces jetons en commandes continues.</w:t>
+      </w:r>
+    </w:p>
+    <w:p>
+      <w:r>
+        <w:t>Figure 1 — Architecture conceptuelle OpenVLA (boucle VLA, entrées/sorties).</w:t>
+      </w:r>
+    </w:p>
+    <w:p>
+      <w:pPr>
+        <w:jc w:val="center"/>
+      </w:pPr>
+      <w:r>
+        <w:drawing>
+          <wp:inline xmlns:a="http://schemas.openxmlformats.org/drawingml/2006/main" xmlns:pic="http://schemas.openxmlformats.org/drawingml/2006/picture">
+            <wp:extent cx="5303520" cy="2895183"/>
+            <wp:docPr id="1" name="Picture 1"/>
+            <wp:cNvGraphicFramePr>
+              <a:graphicFrameLocks noChangeAspect="1"/>
+            </wp:cNvGraphicFramePr>
+            <a:graphic>
+              <a:graphicData uri="http://schemas.openxmlformats.org/drawingml/2006/picture">
+                <pic:pic>
+                  <pic:nvPicPr>
+                    <pic:cNvPr id="0" name="image.png"/>
+                    <pic:cNvPicPr/>
+                  </pic:nvPicPr>
+                  <pic:blipFill>
+                    <a:blip r:embed="rId9"/>
+                    <a:stretch>
+                      <a:fillRect/>
+                    </a:stretch>
+                  </pic:blipFill>
+                  <pic:spPr>
+                    <a:xfrm>
+                      <a:off x="0" y="0"/>
+                      <a:ext cx="5303520" cy="2895183"/>
+                    </a:xfrm>
+                    <a:prstGeom prst="rect"/>
+                  </pic:spPr>
+                </pic:pic>
+              </a:graphicData>
+            </a:graphic>
+          </wp:inline>
+        </w:drawing>
+      </w:r>
+    </w:p>
+    <w:p>
+      <w:r>
+        <w:t>Le décodeur LLM représente plus de 95 % du poids du modèle (~15 Go en FP16). Une GPU NVIDIA avec VRAM suffisante est donc indispensable pour l'inférence locale.</w:t>
+      </w:r>
+    </w:p>
+    <w:p>
+      <w:r>
+        <w:t>Figure 2 — Répartition des poids par composant (VRAM minimale selon précision).</w:t>
+      </w:r>
+    </w:p>
+    <w:p>
+      <w:pPr>
+        <w:jc w:val="center"/>
+      </w:pPr>
+      <w:r>
+        <w:drawing>
+          <wp:inline xmlns:a="http://schemas.openxmlformats.org/drawingml/2006/main" xmlns:pic="http://schemas.openxmlformats.org/drawingml/2006/picture">
+            <wp:extent cx="4754880" cy="3171468"/>
+            <wp:docPr id="2" name="Picture 2"/>
+            <wp:cNvGraphicFramePr>
+              <a:graphicFrameLocks noChangeAspect="1"/>
+            </wp:cNvGraphicFramePr>
+            <a:graphic>
+              <a:graphicData uri="http://schemas.openxmlformats.org/drawingml/2006/picture">
+                <pic:pic>
+                  <pic:nvPicPr>
+                    <pic:cNvPr id="0" name="image.png"/>
+                    <pic:cNvPicPr/>
+                  </pic:nvPicPr>
+                  <pic:blipFill>
+                    <a:blip r:embed="rId10"/>
+                    <a:stretch>
+                      <a:fillRect/>
+                    </a:stretch>
+                  </pic:blipFill>
+                  <pic:spPr>
+                    <a:xfrm>
+                      <a:off x="0" y="0"/>
+                      <a:ext cx="4754880" cy="3171468"/>
+                    </a:xfrm>
+                    <a:prstGeom prst="rect"/>
+                  </pic:spPr>
+                </pic:pic>
+              </a:graphicData>
+            </a:graphic>
+          </wp:inline>
+        </w:drawing>
+      </w:r>
+    </w:p>
+    <w:p>
+      <w:pPr>
+        <w:pStyle w:val="Heading2"/>
+      </w:pPr>
+      <w:r>
+        <w:t>I.3 Boucle Vision — Langage — Action</w:t>
+      </w:r>
+    </w:p>
+    <w:p>
+      <w:r>
+        <w:t>OpenVLA formalise la manipulation comme une boucle fermée : la vision capture l'état du monde, le langage fixe l'intention, l'action modifie l'environnement, puis une nouvelle observation alimente la décision suivante. Ce paradigme remplace une chaîne perception-planification-contrôle explicitement programmée par une inférence unifiée.</w:t>
+      </w:r>
+    </w:p>
+    <w:p>
+      <w:r>
+        <w:t>Figure 3 — Flux de données macro (instruction → capture → encodage → inférence → action → feedback).</w:t>
+      </w:r>
+    </w:p>
+    <w:p>
+      <w:pPr>
+        <w:jc w:val="center"/>
+      </w:pPr>
+      <w:r>
+        <w:drawing>
+          <wp:inline xmlns:a="http://schemas.openxmlformats.org/drawingml/2006/main" xmlns:pic="http://schemas.openxmlformats.org/drawingml/2006/picture">
+            <wp:extent cx="5303520" cy="3537406"/>
+            <wp:docPr id="3" name="Picture 3"/>
+            <wp:cNvGraphicFramePr>
+              <a:graphicFrameLocks noChangeAspect="1"/>
+            </wp:cNvGraphicFramePr>
+            <a:graphic>
+              <a:graphicData uri="http://schemas.openxmlformats.org/drawingml/2006/picture">
+                <pic:pic>
+                  <pic:nvPicPr>
+                    <pic:cNvPr id="0" name="image.jpg"/>
+                    <pic:cNvPicPr/>
+                  </pic:nvPicPr>
+                  <pic:blipFill>
+                    <a:blip r:embed="rId11"/>
+                    <a:stretch>
+                      <a:fillRect/>
+                    </a:stretch>
+                  </pic:blipFill>
+                  <pic:spPr>
+                    <a:xfrm>
+                      <a:off x="0" y="0"/>
+                      <a:ext cx="5303520" cy="3537406"/>
+                    </a:xfrm>
+                    <a:prstGeom prst="rect"/>
+                  </pic:spPr>
+                </pic:pic>
+              </a:graphicData>
+            </a:graphic>
+          </wp:inline>
+        </w:drawing>
+      </w:r>
+    </w:p>
+    <w:p>
+      <w:pPr>
+        <w:pStyle w:val="Heading2"/>
+      </w:pPr>
+      <w:r>
+        <w:t>I.4 Modèle openvla-7b et contraintes matérielles</w:t>
       </w:r>
     </w:p>
     <w:p>
@@ -117,10 +503,539 @@
         <w:pStyle w:val="ListBullet"/>
       </w:pPr>
       <w:r>
-        <w:t>Présenter les résultats du stage sous forme de démonstration et de présentation technique.</w:t>
+        <w:t>Installation validée sous Windows 11 Pro, Python 3.11, Conda (env_openvla).</w:t>
+      </w:r>
+    </w:p>
+    <w:p>
+      <w:pPr>
+        <w:pStyle w:val="ListBullet"/>
+      </w:pPr>
+      <w:r>
+        <w:t>PyTorch CUDA (nightly cu128 testé pour RTX 5090 / Blackwell).</w:t>
+      </w:r>
+    </w:p>
+    <w:p>
+      <w:pPr>
+        <w:pStyle w:val="ListBullet"/>
+      </w:pPr>
+      <w:r>
+        <w:t>transformers==4.40.1 imposé par OpenVLA.</w:t>
+      </w:r>
+    </w:p>
+    <w:p>
+      <w:pPr>
+        <w:pStyle w:val="ListBullet"/>
+      </w:pPr>
+      <w:r>
+        <w:t>Chargement local : ~15,13 Go VRAM en float16 (test_openvla.py).</w:t>
+      </w:r>
+    </w:p>
+    <w:p>
+      <w:pPr>
+        <w:pStyle w:val="ListBullet"/>
+      </w:pPr>
+      <w:r>
+        <w:t>Prompt type : « In: What action should the robot take to {instruction}? Out: »</w:t>
+      </w:r>
+    </w:p>
+    <w:p>
+      <w:r>
+        <w:br w:type="page"/>
+      </w:r>
+    </w:p>
+    <w:p>
+      <w:pPr>
+        <w:pStyle w:val="Heading1"/>
+      </w:pPr>
+      <w:r>
+        <w:t>II. Composantes de la pipeline du démonstrateur</w:t>
+      </w:r>
+    </w:p>
+    <w:p>
+      <w:pPr>
+        <w:pStyle w:val="Heading2"/>
+      </w:pPr>
+      <w:r>
+        <w:t>II.1 Perception : caméra Zivid MR130</w:t>
+      </w:r>
+    </w:p>
+    <w:p>
+      <w:r>
+        <w:t>La perception repose sur la caméra 3D Zivid 2+ MR130 (Ethernet). Le script scripts/zivid/capture.py réalise une acquisition 2D/3D via capture_2d_3d() et sauvegarde trois fichiers :</w:t>
+      </w:r>
+    </w:p>
+    <w:p>
+      <w:pPr>
+        <w:pStyle w:val="ListBullet"/>
+      </w:pPr>
+      <w:r>
+        <w:t>ColorImage.png — image couleur sRGB (RGBA).</w:t>
+      </w:r>
+    </w:p>
+    <w:p>
+      <w:pPr>
+        <w:pStyle w:val="ListBullet"/>
+      </w:pPr>
+      <w:r>
+        <w:t>Frame.zdf — frame native Zivid (réutilisable dans Zivid Studio).</w:t>
+      </w:r>
+    </w:p>
+    <w:p>
+      <w:pPr>
+        <w:pStyle w:val="ListBullet"/>
+      </w:pPr>
+      <w:r>
+        <w:t>PointCloud.ply — nuage de points 3D pour analyse géométrique.</w:t>
+      </w:r>
+    </w:p>
+    <w:p>
+      <w:r>
+        <w:t>Pour OpenVLA, l'image est convertie RGBA → RGB et redimensionnée à 224×224 px (scripts/integration/test/test_zivid_openvla.py). La géométrie 3D reste disponible pour calibration, alignement ou futures extensions du démonstrateur.</w:t>
+      </w:r>
+    </w:p>
+    <w:p>
+      <w:pPr>
+        <w:pStyle w:val="Heading2"/>
+      </w:pPr>
+      <w:r>
+        <w:t>II.2 Inférence : OpenVLA (transformers)</w:t>
+      </w:r>
+    </w:p>
+    <w:p>
+      <w:r>
+        <w:t>L'inférence utilise Hugging Face Transformers : AutoProcessor + AutoModelForVision2Seq. Le modèle est chargé en bfloat16 ou float16 sur cuda:0. La méthode predict_action() produit une action normalisée, dé-normalisée avec la clé unnorm_key="bridge_orig".</w:t>
+      </w:r>
+    </w:p>
+    <w:p>
+      <w:pPr>
+        <w:pStyle w:val="ListBullet"/>
+      </w:pPr>
+      <w:r>
+        <w:t>Packages : transformers, torch, Pillow, huggingface_hub, accelerate.</w:t>
+      </w:r>
+    </w:p>
+    <w:p>
+      <w:pPr>
+        <w:pStyle w:val="ListBullet"/>
+      </w:pPr>
+      <w:r>
+        <w:t>Téléchargement : huggingface-cli download openvla/openvla-7b.</w:t>
+      </w:r>
+    </w:p>
+    <w:p>
+      <w:pPr>
+        <w:pStyle w:val="ListBullet"/>
+      </w:pPr>
+      <w:r>
+        <w:t>Test isolé : scripts/integration/test/test_openvla.py.</w:t>
+      </w:r>
+    </w:p>
+    <w:p>
+      <w:pPr>
+        <w:pStyle w:val="ListBullet"/>
+      </w:pPr>
+      <w:r>
+        <w:t>Test intégré : scripts/integration/test/test_zivid_openvla.py.</w:t>
+      </w:r>
+    </w:p>
+    <w:p>
+      <w:pPr>
+        <w:pStyle w:val="Heading2"/>
+      </w:pPr>
+      <w:r>
+        <w:t>II.3 Génération d'actions et format de sortie</w:t>
+      </w:r>
+    </w:p>
+    <w:p>
+      <w:r>
+        <w:t>Chaque prédiction OpenVLA retourne 7 valeurs :</w:t>
+      </w:r>
+    </w:p>
+    <w:p>
+      <w:pPr>
+        <w:pStyle w:val="ListBullet"/>
+      </w:pPr>
+      <w:r>
+        <w:t>dx, dy, dz — déplacement cartésien de l'effecteur.</w:t>
+      </w:r>
+    </w:p>
+    <w:p>
+      <w:pPr>
+        <w:pStyle w:val="ListBullet"/>
+      </w:pPr>
+      <w:r>
+        <w:t>rx, ry, rz — variation d'orientation.</w:t>
+      </w:r>
+    </w:p>
+    <w:p>
+      <w:pPr>
+        <w:pStyle w:val="ListBullet"/>
+      </w:pPr>
+      <w:r>
+        <w:t>gripper — état de la pince (&lt; 0,5 : fermer ; ≥ 0,5 : ouvrir).</w:t>
+      </w:r>
+    </w:p>
+    <w:p>
+      <w:r>
+        <w:t>Consignes testées au stage : « pick up the object on the table », « grab the red object », « push the object to the left », « place the object in the bin ». L'action est un delta local : elle doit être convertie en commandes UR (RTDE ou URScript) dans le script d'intégration final (zivid_ur_robot_integration.py).</w:t>
+      </w:r>
+    </w:p>
+    <w:p>
+      <w:pPr>
+        <w:pStyle w:val="Heading2"/>
+      </w:pPr>
+      <w:r>
+        <w:t>II.4 Exécution robotique : UR (URScript / ur-rtde)</w:t>
+      </w:r>
+    </w:p>
+    <w:p>
+      <w:r>
+        <w:t>L'exécution repose sur un robot collaboratif Universal Robots. Deux modes coexistent :</w:t>
+      </w:r>
+    </w:p>
+    <w:p>
+      <w:pPr>
+        <w:pStyle w:val="ListBullet"/>
+      </w:pPr>
+      <w:r>
+        <w:t>URScript (.script) sur PolyScope : mouvements explicites movej (approche/retrait) et movel (traits linéaires). Exemple : tracé de la lettre A (URscriptLetterA.script, traceAOnce.script).</w:t>
+      </w:r>
+    </w:p>
+    <w:p>
+      <w:pPr>
+        <w:pStyle w:val="ListBullet"/>
+      </w:pPr>
+      <w:r>
+        <w:t>ur-rtde (Python) : connexion RTDE pour lire l'état du robot et envoyer des commandes depuis l'environnement env_integration.</w:t>
+      </w:r>
+    </w:p>
+    <w:p>
+      <w:r>
+        <w:t>Schéma cible du démonstrateur : Zivid (capture) → prétraitement image → OpenVLA (inférence) → conversion action → UR (exécution) → nouvelle capture (boucle fermée).</w:t>
+      </w:r>
+    </w:p>
+    <w:p>
+      <w:r>
+        <w:br w:type="page"/>
+      </w:r>
+    </w:p>
+    <w:p>
+      <w:pPr>
+        <w:pStyle w:val="Heading1"/>
+      </w:pPr>
+      <w:r>
+        <w:t>III. Comparaison OpenVLA et robotique traditionnelle</w:t>
+      </w:r>
+    </w:p>
+    <w:p>
+      <w:pPr>
+        <w:pStyle w:val="Heading2"/>
+      </w:pPr>
+      <w:r>
+        <w:t>III.1 Programmation de tâches</w:t>
+      </w:r>
+    </w:p>
+    <w:tbl>
+      <w:tblPr>
+        <w:tblStyle w:val="TableGrid"/>
+        <w:tblW w:type="auto" w:w="0"/>
+        <w:tblLook w:firstColumn="1" w:firstRow="1" w:lastColumn="0" w:lastRow="0" w:noHBand="0" w:noVBand="1" w:val="04A0"/>
+      </w:tblPr>
+      <w:tblGrid>
+        <w:gridCol w:w="2880"/>
+        <w:gridCol w:w="2880"/>
+        <w:gridCol w:w="2880"/>
+      </w:tblGrid>
+      <w:tr>
+        <w:tc>
+          <w:tcPr>
+            <w:tcW w:type="dxa" w:w="2880"/>
+          </w:tcPr>
+          <w:p>
+            <w:r>
+              <w:t>Critère</w:t>
+            </w:r>
+          </w:p>
+        </w:tc>
+        <w:tc>
+          <w:tcPr>
+            <w:tcW w:type="dxa" w:w="2880"/>
+          </w:tcPr>
+          <w:p>
+            <w:r>
+              <w:t>Robotique traditionnelle</w:t>
+            </w:r>
+          </w:p>
+        </w:tc>
+        <w:tc>
+          <w:tcPr>
+            <w:tcW w:type="dxa" w:w="2880"/>
+          </w:tcPr>
+          <w:p>
+            <w:r>
+              <w:t>OpenVLA</w:t>
+            </w:r>
+          </w:p>
+        </w:tc>
+      </w:tr>
+      <w:tr>
+        <w:tc>
+          <w:tcPr>
+            <w:tcW w:type="dxa" w:w="2880"/>
+          </w:tcPr>
+          <w:p>
+            <w:r>
+              <w:t>Spécification tâche</w:t>
+            </w:r>
+          </w:p>
+        </w:tc>
+        <w:tc>
+          <w:tcPr>
+            <w:tcW w:type="dxa" w:w="2880"/>
+          </w:tcPr>
+          <w:p>
+            <w:r>
+              <w:t>Programme URScript, waypoints, logique if/while</w:t>
+            </w:r>
+          </w:p>
+        </w:tc>
+        <w:tc>
+          <w:tcPr>
+            <w:tcW w:type="dxa" w:w="2880"/>
+          </w:tcPr>
+          <w:p>
+            <w:r>
+              <w:t>Consigne en langage naturel</w:t>
+            </w:r>
+          </w:p>
+        </w:tc>
+      </w:tr>
+      <w:tr>
+        <w:tc>
+          <w:tcPr>
+            <w:tcW w:type="dxa" w:w="2880"/>
+          </w:tcPr>
+          <w:p>
+            <w:r>
+              <w:t>Généricité</w:t>
+            </w:r>
+          </w:p>
+        </w:tc>
+        <w:tc>
+          <w:tcPr>
+            <w:tcW w:type="dxa" w:w="2880"/>
+          </w:tcPr>
+          <w:p>
+            <w:r>
+              <w:t>Une tâche = un programme dédié</w:t>
+            </w:r>
+          </w:p>
+        </w:tc>
+        <w:tc>
+          <w:tcPr>
+            <w:tcW w:type="dxa" w:w="2880"/>
+          </w:tcPr>
+          <w:p>
+            <w:r>
+              <w:t>Politique generaliste, fine-tuning possible</w:t>
+            </w:r>
+          </w:p>
+        </w:tc>
+      </w:tr>
+      <w:tr>
+        <w:tc>
+          <w:tcPr>
+            <w:tcW w:type="dxa" w:w="2880"/>
+          </w:tcPr>
+          <w:p>
+            <w:r>
+              <w:t>Itération</w:t>
+            </w:r>
+          </w:p>
+        </w:tc>
+        <w:tc>
+          <w:tcPr>
+            <w:tcW w:type="dxa" w:w="2880"/>
+          </w:tcPr>
+          <w:p>
+            <w:r>
+              <w:t>Modifier code et poses manuellement</w:t>
+            </w:r>
+          </w:p>
+        </w:tc>
+        <w:tc>
+          <w:tcPr>
+            <w:tcW w:type="dxa" w:w="2880"/>
+          </w:tcPr>
+          <w:p>
+            <w:r>
+              <w:t>Changer la consigne texte ou fine-tuner</w:t>
+            </w:r>
+          </w:p>
+        </w:tc>
+      </w:tr>
+      <w:tr>
+        <w:tc>
+          <w:tcPr>
+            <w:tcW w:type="dxa" w:w="2880"/>
+          </w:tcPr>
+          <w:p>
+            <w:r>
+              <w:t>Exemple stage</w:t>
+            </w:r>
+          </w:p>
+        </w:tc>
+        <w:tc>
+          <w:tcPr>
+            <w:tcW w:type="dxa" w:w="2880"/>
+          </w:tcPr>
+          <w:p>
+            <w:r>
+              <w:t>trace_A(n) — 5 poses, boucle while</w:t>
+            </w:r>
+          </w:p>
+        </w:tc>
+        <w:tc>
+          <w:tcPr>
+            <w:tcW w:type="dxa" w:w="2880"/>
+          </w:tcPr>
+          <w:p>
+            <w:r>
+              <w:t>predict_action() — instruction « pick up… »</w:t>
+            </w:r>
+          </w:p>
+        </w:tc>
+      </w:tr>
+    </w:tbl>
+    <w:p/>
+    <w:p>
+      <w:pPr>
+        <w:pStyle w:val="Heading2"/>
+      </w:pPr>
+      <w:r>
+        <w:t>III.2 Perception et représentation de la scène</w:t>
+      </w:r>
+    </w:p>
+    <w:p>
+      <w:pPr>
+        <w:pStyle w:val="ListBullet"/>
+      </w:pPr>
+      <w:r>
+        <w:t>Traditionnel : calibration caméra-robot, extraction de primitives (contours, nuage de points PLY), règles ou algorithmes dédiés.</w:t>
+      </w:r>
+    </w:p>
+    <w:p>
+      <w:pPr>
+        <w:pStyle w:val="ListBullet"/>
+      </w:pPr>
+      <w:r>
+        <w:t>OpenVLA : end-to-end à partir d'une image RGB ; le modèle apprend implicitement les corrélations visuo-motrices.</w:t>
+      </w:r>
+    </w:p>
+    <w:p>
+      <w:pPr>
+        <w:pStyle w:val="ListBullet"/>
+      </w:pPr>
+      <w:r>
+        <w:t>Stage : Zivid fournit 2D et 3D ; OpenVLA consomme aujourd'hui le RGB 224×224. Le nuage de points reste un atout pour calibration et validation.</w:t>
+      </w:r>
+    </w:p>
+    <w:p>
+      <w:pPr>
+        <w:pStyle w:val="Heading2"/>
+      </w:pPr>
+      <w:r>
+        <w:t>III.3 Planification, contrôle et intégration</w:t>
+      </w:r>
+    </w:p>
+    <w:p>
+      <w:pPr>
+        <w:pStyle w:val="ListBullet"/>
+      </w:pPr>
+      <w:r>
+        <w:t>Traditionnel : planification explicite (trajectoires movej/movel), contrôle PID ou servos RTDE, séquence déterministe.</w:t>
+      </w:r>
+    </w:p>
+    <w:p>
+      <w:pPr>
+        <w:pStyle w:val="ListBullet"/>
+      </w:pPr>
+      <w:r>
+        <w:t>OpenVLA : planification implicite dans le LLM ; sortie = delta d'action instantané, adapté au contrôle itératif (receding horizon).</w:t>
+      </w:r>
+    </w:p>
+    <w:p>
+      <w:pPr>
+        <w:pStyle w:val="ListBullet"/>
+      </w:pPr>
+      <w:r>
+        <w:t>Avantage traditionnel : prévisibilité, sécurité, traçabilité des mouvements (validé jour 03 — tracé A).</w:t>
+      </w:r>
+    </w:p>
+    <w:p>
+      <w:pPr>
+        <w:pStyle w:val="ListBullet"/>
+      </w:pPr>
+      <w:r>
+        <w:t>Avantage OpenVLA : flexibilité sémantique, generalisation à de nouvelles consignes sans reprogrammation complète.</w:t>
+      </w:r>
+    </w:p>
+    <w:p>
+      <w:pPr>
+        <w:pStyle w:val="Heading2"/>
+      </w:pPr>
+      <w:r>
+        <w:t>III.4 Synthèse pour le démonstrateur CCNB-INNOV</w:t>
+      </w:r>
+    </w:p>
+    <w:p>
+      <w:r>
+        <w:t>Le démonstrateur du stage adopte une approche hybride pragmatique :</w:t>
+      </w:r>
+    </w:p>
+    <w:p>
+      <w:pPr>
+        <w:pStyle w:val="ListBullet"/>
+      </w:pPr>
+      <w:r>
+        <w:t>Robotique classique pour valider l'exécution (URScript, RTDE) et sécuriser les mouvements.</w:t>
+      </w:r>
+    </w:p>
+    <w:p>
+      <w:pPr>
+        <w:pStyle w:val="ListBullet"/>
+      </w:pPr>
+      <w:r>
+        <w:t>OpenVLA pour la couche décisionnelle haute niveau (image + langage → action).</w:t>
+      </w:r>
+    </w:p>
+    <w:p>
+      <w:pPr>
+        <w:pStyle w:val="ListBullet"/>
+      </w:pPr>
+      <w:r>
+        <w:t>Zivid comme capteur riche (2D/3D) alimentant la perception.</w:t>
+      </w:r>
+    </w:p>
+    <w:p>
+      <w:pPr>
+        <w:pStyle w:val="ListBullet"/>
+      </w:pPr>
+      <w:r>
+        <w:t>Environnements Conda Python 3.11 séparés (env_zivid, env_ur, env_integration, env_openvla) puis convergence vers l'intégration.</w:t>
+      </w:r>
+    </w:p>
+    <w:p>
+      <w:r>
+        <w:t>Les parties IV à VII du rapport (démonstrateur expérimental, essais, documentation, présentation) seront complétées au fil des prochaines journées de stage.</w:t>
       </w:r>
     </w:p>
     <w:p/>
+    <w:p>
+      <w:r>
+        <w:t>Programmeur : Fabrice Kouonang | Projet : OpenVLA — Stage CCNB-INNOV | Rapport final — Parties I à III</w:t>
+      </w:r>
+    </w:p>
     <w:sectPr>
       <w:pgSz w:w="12240" w:h="15840"/>
       <w:pgMar w:top="1440" w:right="1800" w:bottom="1440" w:left="1800" w:header="720" w:footer="720" w:gutter="0"/>
@@ -494,10 +1409,6 @@
     <w:name w:val="Normal"/>
     <w:qFormat/>
     <w:rsid w:val="00FC693F"/>
-    <w:rPr>
-      <w:rFonts w:ascii="Calibri" w:hAnsi="Calibri"/>
-      <w:sz w:val="22"/>
-    </w:rPr>
   </w:style>
   <w:style w:type="paragraph" w:styleId="Header">
     <w:name w:val="header"/>

</xml_diff>

<commit_message>
day07: how OpenVLA receives data from UR and Zivid
Add day07 report on model inputs vs RTDE execution, fix INNOV logo on day06,
update stage report II.5 and README.
</commit_message>
<xml_diff>
--- a/OpenVLA_day01_stage_CCNB.docx
+++ b/OpenVLA_day01_stage_CCNB.docx
@@ -807,6 +807,53 @@
       </w:r>
     </w:p>
     <w:p>
+      <w:r>
+        <w:t>Détail complet : OpenVLA_day07_robot_data.docx — scripts demoTest.py, test_zivid_openvla.py.</w:t>
+      </w:r>
+    </w:p>
+    <w:p>
+      <w:pPr>
+        <w:pStyle w:val="ListBullet"/>
+      </w:pPr>
+      <w:r>
+        <w:t>Robot : exécution et pose courante — pas d'inférence directe sur RTDE.</w:t>
+      </w:r>
+    </w:p>
+    <w:p>
+      <w:pPr>
+        <w:pStyle w:val="ListBullet"/>
+      </w:pPr>
+      <w:r>
+        <w:t>Sortie modèle : 7D (dx…rz, gripper), dénormalisation bridge_orig.</w:t>
+      </w:r>
+    </w:p>
+    <w:p>
+      <w:pPr>
+        <w:pStyle w:val="ListBullet"/>
+      </w:pPr>
+      <w:r>
+        <w:t>Entrées modèle : RGB Zivid + texte (AutoProcessor → GPU bfloat16).</w:t>
+      </w:r>
+    </w:p>
+    <w:p>
+      <w:r>
+        <w:t>Le robot intervient après predict_action : RTDE lit getActualTCPPose(), puis le script calcule new_pose = current_pose + action × SCALE et envoie moveL et la commande pince. La boucle visuelle (nouvelle capture à chaque step) constitue le retour capteur principal.</w:t>
+      </w:r>
+    </w:p>
+    <w:p>
+      <w:r>
+        <w:t>Clarification essentielle pour le démonstrateur CCNB-INNOV : OpenVLA reçoit une image RGB 224×224 issue de la Zivid et une consigne en langage naturel (prompt VLA). Il ne reçoit pas l'état articulaire ni la pose TCP du UR en entrée du réseau.</w:t>
+      </w:r>
+    </w:p>
+    <w:p>
+      <w:pPr>
+        <w:pStyle w:val="Heading2"/>
+      </w:pPr>
+      <w:r>
+        <w:t>II.5 Flux de données robot, Zivid et interprétation OpenVLA (jour 07)</w:t>
+      </w:r>
+    </w:p>
+    <w:p>
       <w:pPr>
         <w:pStyle w:val="Heading1"/>
       </w:pPr>
@@ -1120,7 +1167,7 @@
     <w:p/>
     <w:p>
       <w:r>
-        <w:t>Programmeur : Fabrice Kouonang | Projet : OpenVLA — Stage CCNB-INNOV | Rapport final — Parties I à III</w:t>
+        <w:t>Programmeur : Fabrice Kouonang | Projet : OpenVLA — Stage CCNB-INNOV | Rapport final — Parties I à III (II.5 complétée — jour 07, flux données robot)</w:t>
       </w:r>
     </w:p>
     <w:sectPr>

</xml_diff>

<commit_message>
updating header of scripts
</commit_message>
<xml_diff>
--- a/OpenVLA_day01_stage_CCNB.docx
+++ b/OpenVLA_day01_stage_CCNB.docx
@@ -1352,24 +1352,7 @@
         </w:rPr>
       </w:pPr>
       <w:r>
-        <w:rPr>
-          <w:lang w:val="fr-CA"/>
-        </w:rPr>
-        <w:t xml:space="preserve">Figure 1 — Architecture conceptuelle </w:t>
-      </w:r>
-      <w:proofErr w:type="spellStart"/>
-      <w:r>
-        <w:rPr>
-          <w:lang w:val="fr-CA"/>
-        </w:rPr>
-        <w:t>OpenVLA</w:t>
-      </w:r>
-      <w:proofErr w:type="spellEnd"/>
-      <w:r>
-        <w:rPr>
-          <w:lang w:val="fr-CA"/>
-        </w:rPr>
-        <w:t xml:space="preserve"> (boucle VLA, entrées/sorties).</w:t>
+        <w:t>Figure 1 — Architecture conceptuelle OpenVLA (boucle VLA, entrées image + langage, sortie tokens d'action).</w:t>
       </w:r>
     </w:p>
     <w:p>
@@ -1387,8 +1370,6 @@
         <w:rPr>
           <w:lang w:val="fr-CA"/>
         </w:rPr>
-        <w:lastRenderedPageBreak/>
-        <w:t>Le décodeur LLM représente plus de 95 % du poids du m</w:t>
       </w:r>
       <w:r>
         <w:rPr>
@@ -1435,36 +1416,52 @@
         <w:rPr>
           <w:lang w:val="fr-CA"/>
         </w:rPr>
-        <w:t>odèle</w:t>
       </w:r>
       <w:proofErr w:type="spellEnd"/>
       <w:r>
         <w:rPr>
           <w:lang w:val="fr-CA"/>
         </w:rPr>
-        <w:t xml:space="preserve"> (~15 Go en FP16). </w:t>
       </w:r>
       <w:proofErr w:type="gramStart"/>
       <w:r>
         <w:rPr>
           <w:lang w:val="fr-CA"/>
         </w:rPr>
-        <w:t>Une GPU NVIDIA avec VRAM suffisante</w:t>
       </w:r>
       <w:proofErr w:type="gramEnd"/>
       <w:r>
         <w:rPr>
           <w:lang w:val="fr-CA"/>
         </w:rPr>
-        <w:t xml:space="preserve"> est donc indispensable pour l'inférence locale.</w:t>
       </w:r>
     </w:p>
     <w:p>
-      <w:pPr>
-        <w:rPr>
-          <w:lang w:val="fr-CA"/>
-        </w:rPr>
-      </w:pPr>
+      <w:r>
+        <w:t>Le décodeur LLM représente plus de 95 % du poids du modèle (~15 Go en FP16). Une GPU NVIDIA avec VRAM suffisante (≥ 16 Go) est requise pour l'inférence locale du modèle openvla-7b.</w:t>
+      </w:r>
+    </w:p>
+    <w:p>
+      <w:r>
+        <w:t>La figure 1 résume la boucle VLA : vision (image de la scène), langage (consigne utilisateur) et action (tokens convertis en commandes robot). L'architecture interne combine SigLIP/ViT, un projecteur MLP et Llama 2 7B.</w:t>
+      </w:r>
+    </w:p>
+    <w:p>
+      <w:pPr>
+        <w:rPr>
+          <w:lang w:val="fr-CA"/>
+        </w:rPr>
+      </w:pPr>
+    </w:p>
+    <w:p>
+      <w:r>
+        <w:t>Figure 2 — Pipeline final Zivid + YOLO + OpenVLA (capture RGB/profondeur, détection 2D, coordonnées 3D, inférence, exécution UR).</w:t>
+      </w:r>
+    </w:p>
+    <w:p>
+      <w:r>
+        <w:t>Étapes illustrées : (1) capture Zivid RGB + profondeur ; (2) détection 2D YOLOv8n (ex. boule rouge) ; (3) pixel (u,v) du centre de la boîte ; (4) conversion Zivid vers coordonnées 3D (X,Y,Z) en mètres ; (5–6) OpenVLA reçoit l'image 224×224 et une consigne enrichie (label + position 3D) ; (7) le code RTDE exécute l'action prédite. Scripts : scripts/openVLA_ZIVID/test/zivid_yolo_openvla.py, returnAllPositions.py.</w:t>
+      </w:r>
     </w:p>
     <w:p>
       <w:pPr>
@@ -1636,11 +1633,7 @@
         </w:rPr>
       </w:pPr>
       <w:r>
-        <w:rPr>
-          <w:lang w:val="fr-CA"/>
-        </w:rPr>
-        <w:lastRenderedPageBreak/>
-        <w:t>Figure 2 — Répartition des poids par composant (VRAM minimale selon précision).</w:t>
+        <w:t>Figure 3 — Poids des modèles par composant (SigLIP, Prismatic, Llama 2 7B, action head).</w:t>
       </w:r>
     </w:p>
     <w:p>
@@ -1730,10 +1723,7 @@
         </w:rPr>
       </w:pPr>
       <w:r>
-        <w:rPr>
-          <w:lang w:val="fr-CA"/>
-        </w:rPr>
-        <w:t>Figure 3 — Flux de données macro (instruction → capture → encodage → inférence → action → feedback).</w:t>
+        <w:t>Figure 4 — Vue macro du flux de données OpenVLA (instruction, capture, encodage SigLIP, décodeur Llama 2, action head, feedback).</w:t>
       </w:r>
     </w:p>
     <w:p>
@@ -2090,282 +2080,327 @@
     </w:p>
     <w:p>
       <w:pPr>
-        <w:pStyle w:val="Titre2"/>
-        <w:rPr>
-          <w:lang w:val="fr-CA"/>
-        </w:rPr>
-      </w:pPr>
-      <w:r>
-        <w:rPr>
-          <w:lang w:val="fr-CA"/>
-        </w:rPr>
-        <w:t xml:space="preserve">II.2 Inférence : </w:t>
-      </w:r>
-      <w:proofErr w:type="spellStart"/>
-      <w:r>
-        <w:rPr>
-          <w:lang w:val="fr-CA"/>
-        </w:rPr>
-        <w:t>OpenVLA</w:t>
-      </w:r>
-      <w:proofErr w:type="spellEnd"/>
-      <w:r>
-        <w:rPr>
-          <w:lang w:val="fr-CA"/>
-        </w:rPr>
-        <w:t xml:space="preserve"> (</w:t>
-      </w:r>
-      <w:proofErr w:type="spellStart"/>
-      <w:r>
-        <w:rPr>
-          <w:lang w:val="fr-CA"/>
-        </w:rPr>
-        <w:t>transformers</w:t>
-      </w:r>
-      <w:proofErr w:type="spellEnd"/>
-      <w:r>
-        <w:rPr>
-          <w:lang w:val="fr-CA"/>
-        </w:rPr>
-        <w:t>)</w:t>
+        <w:pStyle w:val="Listepuces"/>
+      </w:pPr>
+      <w:r>
+        <w:t>scripts/openVLA_ZIVID/test/test_yolo.py — test isolé YOLO sur image capturée.</w:t>
       </w:r>
     </w:p>
     <w:p>
       <w:pPr>
-        <w:rPr>
-          <w:lang w:val="fr-CA"/>
-        </w:rPr>
-      </w:pPr>
-      <w:r>
-        <w:rPr>
-          <w:lang w:val="fr-CA"/>
-        </w:rPr>
-        <w:t xml:space="preserve">L'inférence utilise </w:t>
-      </w:r>
-      <w:proofErr w:type="spellStart"/>
-      <w:r>
-        <w:rPr>
-          <w:lang w:val="fr-CA"/>
-        </w:rPr>
-        <w:t>Hugging</w:t>
-      </w:r>
-      <w:proofErr w:type="spellEnd"/>
-      <w:r>
-        <w:rPr>
-          <w:lang w:val="fr-CA"/>
-        </w:rPr>
-        <w:t xml:space="preserve"> Face Transformers : </w:t>
-      </w:r>
-      <w:proofErr w:type="spellStart"/>
-      <w:r>
-        <w:rPr>
-          <w:lang w:val="fr-CA"/>
-        </w:rPr>
-        <w:t>AutoProcessor</w:t>
-      </w:r>
-      <w:proofErr w:type="spellEnd"/>
-      <w:r>
-        <w:rPr>
-          <w:lang w:val="fr-CA"/>
-        </w:rPr>
-        <w:t xml:space="preserve"> + AutoModelForVision2Seq. Le modèle est chargé en bfloat16 ou float16 sur cuda:0. La méthode </w:t>
-      </w:r>
-      <w:proofErr w:type="spellStart"/>
-      <w:r>
-        <w:rPr>
-          <w:lang w:val="fr-CA"/>
-        </w:rPr>
-        <w:t>predict_</w:t>
-      </w:r>
-      <w:proofErr w:type="gramStart"/>
-      <w:r>
-        <w:rPr>
-          <w:lang w:val="fr-CA"/>
-        </w:rPr>
-        <w:t>action</w:t>
-      </w:r>
-      <w:proofErr w:type="spellEnd"/>
-      <w:r>
-        <w:rPr>
-          <w:lang w:val="fr-CA"/>
-        </w:rPr>
-        <w:t>(</w:t>
-      </w:r>
-      <w:proofErr w:type="gramEnd"/>
-      <w:r>
-        <w:rPr>
-          <w:lang w:val="fr-CA"/>
-        </w:rPr>
-        <w:t xml:space="preserve">) produit une action normalisée, </w:t>
-      </w:r>
-      <w:proofErr w:type="spellStart"/>
-      <w:r>
-        <w:rPr>
-          <w:lang w:val="fr-CA"/>
-        </w:rPr>
-        <w:t>dé-normalisée</w:t>
-      </w:r>
-      <w:proofErr w:type="spellEnd"/>
-      <w:r>
-        <w:rPr>
-          <w:lang w:val="fr-CA"/>
-        </w:rPr>
-        <w:t xml:space="preserve"> avec la clé </w:t>
-      </w:r>
-      <w:proofErr w:type="spellStart"/>
-      <w:r>
-        <w:rPr>
-          <w:lang w:val="fr-CA"/>
-        </w:rPr>
-        <w:t>unnorm_key</w:t>
-      </w:r>
-      <w:proofErr w:type="spellEnd"/>
-      <w:r>
-        <w:rPr>
-          <w:lang w:val="fr-CA"/>
-        </w:rPr>
-        <w:t>="</w:t>
-      </w:r>
-      <w:proofErr w:type="spellStart"/>
-      <w:r>
-        <w:rPr>
-          <w:lang w:val="fr-CA"/>
-        </w:rPr>
-        <w:t>bridge_orig</w:t>
-      </w:r>
-      <w:proofErr w:type="spellEnd"/>
-      <w:r>
-        <w:rPr>
-          <w:lang w:val="fr-CA"/>
-        </w:rPr>
-        <w:t>".</w:t>
+        <w:pStyle w:val="Listepuces"/>
+      </w:pPr>
+      <w:r>
+        <w:t>scripts/openVLA_ZIVID/test/zivid_yolo_openvla.py — pipeline complet Zivid → YOLO → OpenVLA.</w:t>
       </w:r>
     </w:p>
     <w:p>
       <w:pPr>
         <w:pStyle w:val="Listepuces"/>
       </w:pPr>
-      <w:proofErr w:type="gramStart"/>
-      <w:r>
-        <w:t>Packages :</w:t>
-      </w:r>
-      <w:proofErr w:type="gramEnd"/>
-      <w:r>
-        <w:t xml:space="preserve"> transformers, torch, Pillow, huggingface_hub, </w:t>
-      </w:r>
-      <w:proofErr w:type="gramStart"/>
-      <w:r>
-        <w:t>accelerate</w:t>
-      </w:r>
-      <w:proofErr w:type="gramEnd"/>
-      <w:r>
-        <w:t>.</w:t>
+      <w:r>
+        <w:t>scripts/openVLA_ZIVID/functions/returnAllPositions.py — capture + YOLO + liste 3D.</w:t>
       </w:r>
     </w:p>
     <w:p>
-      <w:pPr>
-        <w:pStyle w:val="Listepuces"/>
-      </w:pPr>
-      <w:r>
-        <w:t>Téléchargement : huggingface-cli download openvla/openvla-7b.</w:t>
+      <w:r>
+        <w:t>Extension du démonstrateur : YOLOv8n (Ultralytics, yolov8n.pt) détecte les objets en 2D sur l'image Zivid. Le centre de chaque boîte englobante (u, v) est projeté dans le nuage de points pour obtenir (X, Y, Z) en mètres. L'objet le plus confiant alimente le prompt OpenVLA (ex. pick up the ball at position X=… Y=… Z=…).</w:t>
       </w:r>
     </w:p>
     <w:p>
       <w:pPr>
-        <w:pStyle w:val="Listepuces"/>
-      </w:pPr>
-      <w:r>
-        <w:t>Test isolé : scripts/integration/test/test_openvla.py.</w:t>
+        <w:pStyle w:val="Titre3"/>
+      </w:pPr>
+      <w:r>
+        <w:t>II.1.1 Détection d'objets YOLOv8 et coordonnées 3D (jour 07)</w:t>
       </w:r>
     </w:p>
     <w:p>
       <w:pPr>
-        <w:pStyle w:val="Listepuces"/>
-      </w:pPr>
-      <w:r>
-        <w:t>Test intégré : scripts/integration/test/test_zivid_openvla.py.</w:t>
+        <w:pStyle w:val="Titre2"/>
+        <w:rPr>
+          <w:lang w:val="fr-CA"/>
+        </w:rPr>
+      </w:pPr>
+      <w:r>
+        <w:rPr>
+          <w:lang w:val="fr-CA"/>
+        </w:rPr>
+        <w:t xml:space="preserve">II.2 Inférence : </w:t>
+      </w:r>
+      <w:proofErr w:type="spellStart"/>
+      <w:r>
+        <w:rPr>
+          <w:lang w:val="fr-CA"/>
+        </w:rPr>
+        <w:t>OpenVLA</w:t>
+      </w:r>
+      <w:proofErr w:type="spellEnd"/>
+      <w:r>
+        <w:rPr>
+          <w:lang w:val="fr-CA"/>
+        </w:rPr>
+        <w:t xml:space="preserve"> (</w:t>
+      </w:r>
+      <w:proofErr w:type="spellStart"/>
+      <w:r>
+        <w:rPr>
+          <w:lang w:val="fr-CA"/>
+        </w:rPr>
+        <w:t>transformers</w:t>
+      </w:r>
+      <w:proofErr w:type="spellEnd"/>
+      <w:r>
+        <w:rPr>
+          <w:lang w:val="fr-CA"/>
+        </w:rPr>
+        <w:t>)</w:t>
       </w:r>
     </w:p>
     <w:p>
       <w:pPr>
-        <w:pStyle w:val="Titre2"/>
-        <w:rPr>
-          <w:lang w:val="fr-CA"/>
-        </w:rPr>
-      </w:pPr>
-      <w:r>
-        <w:rPr>
-          <w:lang w:val="fr-CA"/>
-        </w:rPr>
-        <w:t>II.3 Génération d'actions et format de sortie</w:t>
+        <w:rPr>
+          <w:lang w:val="fr-CA"/>
+        </w:rPr>
+      </w:pPr>
+      <w:r>
+        <w:rPr>
+          <w:lang w:val="fr-CA"/>
+        </w:rPr>
+        <w:t xml:space="preserve">L'inférence utilise </w:t>
+      </w:r>
+      <w:proofErr w:type="spellStart"/>
+      <w:r>
+        <w:rPr>
+          <w:lang w:val="fr-CA"/>
+        </w:rPr>
+        <w:t>Hugging</w:t>
+      </w:r>
+      <w:proofErr w:type="spellEnd"/>
+      <w:r>
+        <w:rPr>
+          <w:lang w:val="fr-CA"/>
+        </w:rPr>
+        <w:t xml:space="preserve"> Face Transformers : </w:t>
+      </w:r>
+      <w:proofErr w:type="spellStart"/>
+      <w:r>
+        <w:rPr>
+          <w:lang w:val="fr-CA"/>
+        </w:rPr>
+        <w:t>AutoProcessor</w:t>
+      </w:r>
+      <w:proofErr w:type="spellEnd"/>
+      <w:r>
+        <w:rPr>
+          <w:lang w:val="fr-CA"/>
+        </w:rPr>
+        <w:t xml:space="preserve"> + AutoModelForVision2Seq. Le modèle est chargé en bfloat16 ou float16 sur cuda:0. La méthode </w:t>
+      </w:r>
+      <w:proofErr w:type="spellStart"/>
+      <w:r>
+        <w:rPr>
+          <w:lang w:val="fr-CA"/>
+        </w:rPr>
+        <w:t>predict_</w:t>
+      </w:r>
+      <w:proofErr w:type="gramStart"/>
+      <w:r>
+        <w:rPr>
+          <w:lang w:val="fr-CA"/>
+        </w:rPr>
+        <w:t>action</w:t>
+      </w:r>
+      <w:proofErr w:type="spellEnd"/>
+      <w:r>
+        <w:rPr>
+          <w:lang w:val="fr-CA"/>
+        </w:rPr>
+        <w:t>(</w:t>
+      </w:r>
+      <w:proofErr w:type="gramEnd"/>
+      <w:r>
+        <w:rPr>
+          <w:lang w:val="fr-CA"/>
+        </w:rPr>
+        <w:t xml:space="preserve">) produit une action normalisée, </w:t>
+      </w:r>
+      <w:proofErr w:type="spellStart"/>
+      <w:r>
+        <w:rPr>
+          <w:lang w:val="fr-CA"/>
+        </w:rPr>
+        <w:t>dé-normalisée</w:t>
+      </w:r>
+      <w:proofErr w:type="spellEnd"/>
+      <w:r>
+        <w:rPr>
+          <w:lang w:val="fr-CA"/>
+        </w:rPr>
+        <w:t xml:space="preserve"> avec la clé </w:t>
+      </w:r>
+      <w:proofErr w:type="spellStart"/>
+      <w:r>
+        <w:rPr>
+          <w:lang w:val="fr-CA"/>
+        </w:rPr>
+        <w:t>unnorm_key</w:t>
+      </w:r>
+      <w:proofErr w:type="spellEnd"/>
+      <w:r>
+        <w:rPr>
+          <w:lang w:val="fr-CA"/>
+        </w:rPr>
+        <w:t>="</w:t>
+      </w:r>
+      <w:proofErr w:type="spellStart"/>
+      <w:r>
+        <w:rPr>
+          <w:lang w:val="fr-CA"/>
+        </w:rPr>
+        <w:t>bridge_orig</w:t>
+      </w:r>
+      <w:proofErr w:type="spellEnd"/>
+      <w:r>
+        <w:rPr>
+          <w:lang w:val="fr-CA"/>
+        </w:rPr>
+        <w:t>".</w:t>
       </w:r>
     </w:p>
     <w:p>
       <w:pPr>
-        <w:rPr>
-          <w:lang w:val="fr-CA"/>
-        </w:rPr>
-      </w:pPr>
-      <w:r>
-        <w:rPr>
-          <w:lang w:val="fr-CA"/>
-        </w:rPr>
-        <w:t xml:space="preserve">Chaque prédiction </w:t>
-      </w:r>
-      <w:proofErr w:type="spellStart"/>
-      <w:r>
-        <w:rPr>
-          <w:lang w:val="fr-CA"/>
-        </w:rPr>
-        <w:t>OpenVLA</w:t>
-      </w:r>
-      <w:proofErr w:type="spellEnd"/>
-      <w:r>
-        <w:rPr>
-          <w:lang w:val="fr-CA"/>
-        </w:rPr>
-        <w:t xml:space="preserve"> retourne 7 valeurs :</w:t>
+        <w:pStyle w:val="Listepuces"/>
+      </w:pPr>
+      <w:proofErr w:type="gramStart"/>
+      <w:r>
+        <w:t>Packages :</w:t>
+      </w:r>
+      <w:proofErr w:type="gramEnd"/>
+      <w:r>
+        <w:t xml:space="preserve"> transformers, torch, Pillow, huggingface_hub, </w:t>
+      </w:r>
+      <w:proofErr w:type="gramStart"/>
+      <w:r>
+        <w:t>accelerate</w:t>
+      </w:r>
+      <w:proofErr w:type="gramEnd"/>
+      <w:r>
+        <w:t>.</w:t>
       </w:r>
     </w:p>
     <w:p>
       <w:pPr>
         <w:pStyle w:val="Listepuces"/>
-        <w:rPr>
-          <w:lang w:val="fr-CA"/>
-        </w:rPr>
-      </w:pPr>
-      <w:proofErr w:type="gramStart"/>
-      <w:r>
-        <w:rPr>
-          <w:lang w:val="fr-CA"/>
-        </w:rPr>
-        <w:t>dx</w:t>
-      </w:r>
-      <w:proofErr w:type="gramEnd"/>
-      <w:r>
-        <w:rPr>
-          <w:lang w:val="fr-CA"/>
-        </w:rPr>
-        <w:t xml:space="preserve">, </w:t>
-      </w:r>
-      <w:proofErr w:type="spellStart"/>
-      <w:r>
-        <w:rPr>
-          <w:lang w:val="fr-CA"/>
-        </w:rPr>
-        <w:t>dy</w:t>
-      </w:r>
-      <w:proofErr w:type="spellEnd"/>
-      <w:r>
-        <w:rPr>
-          <w:lang w:val="fr-CA"/>
-        </w:rPr>
-        <w:t>, dz — déplacement cartésien de l'effecteur.</w:t>
+      </w:pPr>
+      <w:r>
+        <w:t>Téléchargement : huggingface-cli download openvla/openvla-7b.</w:t>
       </w:r>
     </w:p>
     <w:p>
       <w:pPr>
         <w:pStyle w:val="Listepuces"/>
+      </w:pPr>
+      <w:r>
+        <w:t>Test isolé : scripts/integration/test/test_openvla.py.</w:t>
+      </w:r>
+    </w:p>
+    <w:p>
+      <w:pPr>
+        <w:pStyle w:val="Listepuces"/>
+      </w:pPr>
+      <w:r>
+        <w:t>Test intégré : scripts/integration/test/test_zivid_openvla.py.</w:t>
+      </w:r>
+    </w:p>
+    <w:p>
+      <w:pPr>
+        <w:pStyle w:val="Listepuces"/>
+      </w:pPr>
+      <w:r>
+        <w:t>Pipeline YOLO + 3D : scripts/openVLA_ZIVID/test/zivid_yolo_openvla.py.</w:t>
+      </w:r>
+    </w:p>
+    <w:p>
+      <w:pPr>
+        <w:pStyle w:val="Titre2"/>
+        <w:rPr>
+          <w:lang w:val="fr-CA"/>
+        </w:rPr>
+      </w:pPr>
+      <w:r>
+        <w:rPr>
+          <w:lang w:val="fr-CA"/>
+        </w:rPr>
+        <w:t>II.3 Génération d'actions et format de sortie</w:t>
+      </w:r>
+    </w:p>
+    <w:p>
+      <w:pPr>
+        <w:rPr>
+          <w:lang w:val="fr-CA"/>
+        </w:rPr>
+      </w:pPr>
+      <w:r>
+        <w:rPr>
+          <w:lang w:val="fr-CA"/>
+        </w:rPr>
+        <w:t xml:space="preserve">Chaque prédiction </w:t>
+      </w:r>
+      <w:proofErr w:type="spellStart"/>
+      <w:r>
+        <w:rPr>
+          <w:lang w:val="fr-CA"/>
+        </w:rPr>
+        <w:t>OpenVLA</w:t>
+      </w:r>
+      <w:proofErr w:type="spellEnd"/>
+      <w:r>
+        <w:rPr>
+          <w:lang w:val="fr-CA"/>
+        </w:rPr>
+        <w:t xml:space="preserve"> retourne 7 valeurs :</w:t>
+      </w:r>
+    </w:p>
+    <w:p>
+      <w:pPr>
+        <w:pStyle w:val="Listepuces"/>
+        <w:rPr>
+          <w:lang w:val="fr-CA"/>
+        </w:rPr>
+      </w:pPr>
+      <w:proofErr w:type="gramStart"/>
+      <w:r>
+        <w:rPr>
+          <w:lang w:val="fr-CA"/>
+        </w:rPr>
+        <w:t>dx</w:t>
+      </w:r>
+      <w:proofErr w:type="gramEnd"/>
+      <w:r>
+        <w:rPr>
+          <w:lang w:val="fr-CA"/>
+        </w:rPr>
+        <w:t xml:space="preserve">, </w:t>
+      </w:r>
+      <w:proofErr w:type="spellStart"/>
+      <w:r>
+        <w:rPr>
+          <w:lang w:val="fr-CA"/>
+        </w:rPr>
+        <w:t>dy</w:t>
+      </w:r>
+      <w:proofErr w:type="spellEnd"/>
+      <w:r>
+        <w:rPr>
+          <w:lang w:val="fr-CA"/>
+        </w:rPr>
+        <w:t>, dz — déplacement cartésien de l'effecteur.</w:t>
+      </w:r>
+    </w:p>
+    <w:p>
+      <w:pPr>
+        <w:pStyle w:val="Listepuces"/>
         <w:rPr>
           <w:lang w:val="fr-CA"/>
         </w:rPr>
@@ -2730,39 +2765,7 @@
         </w:rPr>
       </w:pPr>
       <w:r>
-        <w:rPr>
-          <w:lang w:val="fr-CA"/>
-        </w:rPr>
-        <w:lastRenderedPageBreak/>
-        <w:t xml:space="preserve">Schéma cible du démonstrateur : </w:t>
-      </w:r>
-      <w:proofErr w:type="spellStart"/>
-      <w:r>
-        <w:rPr>
-          <w:lang w:val="fr-CA"/>
-        </w:rPr>
-        <w:t>Zivid</w:t>
-      </w:r>
-      <w:proofErr w:type="spellEnd"/>
-      <w:r>
-        <w:rPr>
-          <w:lang w:val="fr-CA"/>
-        </w:rPr>
-        <w:t xml:space="preserve"> (capture) → prétraitement image → </w:t>
-      </w:r>
-      <w:proofErr w:type="spellStart"/>
-      <w:r>
-        <w:rPr>
-          <w:lang w:val="fr-CA"/>
-        </w:rPr>
-        <w:t>OpenVLA</w:t>
-      </w:r>
-      <w:proofErr w:type="spellEnd"/>
-      <w:r>
-        <w:rPr>
-          <w:lang w:val="fr-CA"/>
-        </w:rPr>
-        <w:t xml:space="preserve"> (inférence) → conversion action → UR (exécution) → nouvelle capture (boucle fermée).</w:t>
+        <w:t>Schéma cible du démonstrateur : Zivid (capture) → YOLOv8 (détection 2D) → coordonnées 3D → prétraitement image + prompt enrichi → OpenVLA (inférence) → conversion action → UR (exécution RTDE) → nouvelle capture (boucle).</w:t>
       </w:r>
     </w:p>
     <w:p>
@@ -2989,38 +2992,7 @@
         </w:rPr>
       </w:pPr>
       <w:r>
-        <w:rPr>
-          <w:lang w:val="fr-CA"/>
-        </w:rPr>
-        <w:t>Entrées modèle : image RGB 224×224 (</w:t>
-      </w:r>
-      <w:proofErr w:type="spellStart"/>
-      <w:r>
-        <w:rPr>
-          <w:lang w:val="fr-CA"/>
-        </w:rPr>
-        <w:t>Zivid</w:t>
-      </w:r>
-      <w:proofErr w:type="spellEnd"/>
-      <w:r>
-        <w:rPr>
-          <w:lang w:val="fr-CA"/>
-        </w:rPr>
-        <w:t>) + texte (</w:t>
-      </w:r>
-      <w:proofErr w:type="spellStart"/>
-      <w:r>
-        <w:rPr>
-          <w:lang w:val="fr-CA"/>
-        </w:rPr>
-        <w:t>AutoProcessor</w:t>
-      </w:r>
-      <w:proofErr w:type="spellEnd"/>
-      <w:r>
-        <w:rPr>
-          <w:lang w:val="fr-CA"/>
-        </w:rPr>
-        <w:t xml:space="preserve"> → GPU bfloat16).</w:t>
+        <w:t>Entrées modèle : image RGB 224×224 (Zivid) + consigne texte ; variante jour 07 avec label YOLO et position 3D injectés dans le prompt.</w:t>
       </w:r>
     </w:p>
     <w:p>
@@ -3479,38 +3451,7 @@
         </w:rPr>
       </w:pPr>
       <w:r>
-        <w:rPr>
-          <w:lang w:val="fr-CA"/>
-        </w:rPr>
-        <w:t xml:space="preserve">Stage : </w:t>
-      </w:r>
-      <w:proofErr w:type="spellStart"/>
-      <w:r>
-        <w:rPr>
-          <w:lang w:val="fr-CA"/>
-        </w:rPr>
-        <w:t>Zivid</w:t>
-      </w:r>
-      <w:proofErr w:type="spellEnd"/>
-      <w:r>
-        <w:rPr>
-          <w:lang w:val="fr-CA"/>
-        </w:rPr>
-        <w:t xml:space="preserve"> fournit 2D et 3D ; </w:t>
-      </w:r>
-      <w:proofErr w:type="spellStart"/>
-      <w:r>
-        <w:rPr>
-          <w:lang w:val="fr-CA"/>
-        </w:rPr>
-        <w:t>OpenVLA</w:t>
-      </w:r>
-      <w:proofErr w:type="spellEnd"/>
-      <w:r>
-        <w:rPr>
-          <w:lang w:val="fr-CA"/>
-        </w:rPr>
-        <w:t xml:space="preserve"> consomme aujourd'hui le RGB 224×224. Le nuage de points reste un atout pour calibration et validation.</w:t>
+        <w:t>Stage : Zivid fournit 2D et 3D ; OpenVLA consomme le RGB 224×224. YOLOv8n relie la détection 2D au nuage de points pour cibler un objet (Figure 2). Le PLY reste disponible pour calibration et extensions.</w:t>
       </w:r>
     </w:p>
     <w:p>
@@ -3851,52 +3792,7 @@
         </w:rPr>
       </w:pPr>
       <w:r>
-        <w:rPr>
-          <w:lang w:val="fr-CA"/>
-        </w:rPr>
-        <w:t xml:space="preserve">Programmeur : Fabrice Kouonang | Projet : </w:t>
-      </w:r>
-      <w:proofErr w:type="spellStart"/>
-      <w:r>
-        <w:rPr>
-          <w:lang w:val="fr-CA"/>
-        </w:rPr>
-        <w:t>OpenVLA</w:t>
-      </w:r>
-      <w:proofErr w:type="spellEnd"/>
-      <w:r>
-        <w:rPr>
-          <w:lang w:val="fr-CA"/>
-        </w:rPr>
-        <w:t xml:space="preserve"> — Stage CCNB-INNOV | Rapport final — Parties I à III (II.5 </w:t>
-      </w:r>
-      <w:proofErr w:type="gramStart"/>
-      <w:r>
-        <w:rPr>
-          <w:lang w:val="fr-CA"/>
-        </w:rPr>
-        <w:t>jour</w:t>
-      </w:r>
-      <w:proofErr w:type="gramEnd"/>
-      <w:r>
-        <w:rPr>
-          <w:lang w:val="fr-CA"/>
-        </w:rPr>
-        <w:t xml:space="preserve"> 07 : flux données robot / </w:t>
-      </w:r>
-      <w:proofErr w:type="spellStart"/>
-      <w:r>
-        <w:rPr>
-          <w:lang w:val="fr-CA"/>
-        </w:rPr>
-        <w:t>OpenVLA</w:t>
-      </w:r>
-      <w:proofErr w:type="spellEnd"/>
-      <w:r>
-        <w:rPr>
-          <w:lang w:val="fr-CA"/>
-        </w:rPr>
-        <w:t>)</w:t>
+        <w:t>Programmeur : Fabrice Kouonang | Projet : OpenVLA — Stage CCNB-INNOV | Rapport final — Parties I à III (II.5 + pipeline YOLO, jour 07)</w:t>
       </w:r>
     </w:p>
     <w:sectPr>

</xml_diff>

<commit_message>
Rapport : comparaison OpenVLA vs robotique classique (captures, partie III).
OpenVLA aide le robot à mieux comprendre la scène, choisir l'action et adapter le mouvement ; synthèse Zivid vs VLA dans les rapports jour 01, 02 et 07.
</commit_message>
<xml_diff>
--- a/OpenVLA_day01_stage_CCNB.docx
+++ b/OpenVLA_day01_stage_CCNB.docx
@@ -3181,6 +3181,70 @@
         <w:t>tâches</w:t>
       </w:r>
       <w:proofErr w:type="spellEnd"/>
+    </w:p>
+    <w:p>
+      <w:pPr/>
+      <w:r>
+        <w:t>OpenVLA peut aider le robot à : mieux comprendre la scène ; mieux choisir l'action ; mieux adapter le mouvement.</w:t>
+      </w:r>
+    </w:p>
+    <w:p>
+      <w:pPr>
+        <w:pStyle w:val="Titre3"/>
+      </w:pPr>
+      <w:r>
+        <w:t>III.1 — Robotique classique seule</w:t>
+      </w:r>
+    </w:p>
+    <w:p>
+      <w:pPr/>
+      <w:r>
+        <w:t>En robotique classique seule, le robot peut aller précisément au XYZ. Mais il ne comprend pas forcément quoi prendre, dans quel ordre, ni comment s'adapter au contexte.</w:t>
+      </w:r>
+    </w:p>
+    <w:p>
+      <w:pPr>
+        <w:pStyle w:val="Titre3"/>
+      </w:pPr>
+      <w:r>
+        <w:t>III.1 — Ce qu'OpenVLA ajoute</w:t>
+      </w:r>
+    </w:p>
+    <w:p>
+      <w:pPr>
+        <w:pStyle w:val="Listepuces"/>
+      </w:pPr>
+      <w:r>
+        <w:t>Compréhension du langage (consignes en langage naturel).</w:t>
+      </w:r>
+    </w:p>
+    <w:p>
+      <w:pPr>
+        <w:pStyle w:val="Listepuces"/>
+      </w:pPr>
+      <w:r>
+        <w:t>Stratégie et planification implicite dans le modèle VLA.</w:t>
+      </w:r>
+    </w:p>
+    <w:p>
+      <w:pPr>
+        <w:pStyle w:val="Listepuces"/>
+      </w:pPr>
+      <w:r>
+        <w:t>Adaptation et comportement contextuel.</w:t>
+      </w:r>
+    </w:p>
+    <w:p>
+      <w:pPr/>
+      <w:r>
+        <w:t>Exemples de consignes que le classique peine à interpréter seul : « la tasse est derrière un obstacle » ; « ouvrir le tiroir avant ».</w:t>
+      </w:r>
+    </w:p>
+    <w:p>
+      <w:pPr/>
+      <w:r>
+        <w:t>Le démonstrateur du stage reste hybride : RTDE/URScript pour l'exécution prévisible, OpenVLA pour la décision image + langage → action.</w:t>
+      </w:r>
     </w:p>
     <w:tbl>
       <w:tblPr>
@@ -3407,6 +3471,18 @@
       </w:r>
     </w:p>
     <w:p>
+      <w:pPr/>
+      <w:r>
+        <w:t>Robot classique — il sait où est la cible (ex. où est la balle), mais il peut heurter l'obstacle, ne pas comprendre la scène dans son ensemble, ou échouer si la trajectoire change.</w:t>
+      </w:r>
+    </w:p>
+    <w:p>
+      <w:pPr/>
+      <w:r>
+        <w:t>OpenVLA peut comprendre une consigne du type « il y a un obstacle » et orienter la décision : contourner, déplacer un objet, changer l'approche, réessayer autrement.</w:t>
+      </w:r>
+    </w:p>
+    <w:p>
       <w:pPr>
         <w:pStyle w:val="Listepuces"/>
         <w:rPr>
@@ -3484,8 +3560,38 @@
       </w:r>
     </w:p>
     <w:p>
+      <w:pPr/>
+      <w:r>
+        <w:t>OpenVLA aide surtout à :</w:t>
+      </w:r>
+    </w:p>
+    <w:p>
       <w:pPr>
         <w:pStyle w:val="Listepuces"/>
+      </w:pPr>
+      <w:r>
+        <w:t>Raisonner et planifier à partir de la scène et du langage.</w:t>
+      </w:r>
+    </w:p>
+    <w:p>
+      <w:pPr>
+        <w:pStyle w:val="Listepuces"/>
+      </w:pPr>
+      <w:r>
+        <w:t>Adapter le mouvement et corriger en boucle fermée.</w:t>
+      </w:r>
+    </w:p>
+    <w:p>
+      <w:pPr>
+        <w:pStyle w:val="Listepuces"/>
+      </w:pPr>
+      <w:r>
+        <w:t>Gérer des scènes complexes et comprendre le langage humain.</w:t>
+      </w:r>
+    </w:p>
+    <w:p>
+      <w:pPr>
+        <w:pStyle w:val="Listepuces"/>
         <w:rPr>
           <w:lang w:val="fr-CA"/>
         </w:rPr>
@@ -3632,6 +3738,12 @@
       </w:r>
     </w:p>
     <w:p>
+      <w:pPr/>
+      <w:r>
+        <w:t>Tandis que Zivid + nuage de points fournissent la géométrie précise (RGB, profondeur, XYZ en mètres), OpenVLA apporte la couche sémantique et décisionnelle au-dessus de cette perception.</w:t>
+      </w:r>
+    </w:p>
+    <w:p>
       <w:pPr>
         <w:rPr>
           <w:lang w:val="fr-CA"/>
@@ -3805,7 +3917,7 @@
         </w:rPr>
       </w:pPr>
       <w:r>
-        <w:t>Programmeur : Fabrice Kouonang | Projet : OpenVLA — Stage CCNB-INNOV | Rapport final — I à III (jour 07 : YOLO + Grounding DINO)</w:t>
+        <w:t>Programmeur : Fabrice Kouonang | Projet : OpenVLA — Stage CCNB-INNOV | Rapport final — I à III (comparaison OpenVLA / robotique classique)</w:t>
       </w:r>
     </w:p>
     <w:sectPr>

</xml_diff>

<commit_message>
Jour 08 : boucle continue perception → action → réinférence.
Ajout du rapport `OpenVLA_day08_boucle_continue.docx`, mise à jour du rapport final (II.5) et du README. Précise aussi l'option d'injecter les XYZ issus de Grounding DINO dans l'instruction OpenVLA pour gagner en efficacité.
</commit_message>
<xml_diff>
--- a/OpenVLA_day01_stage_CCNB.docx
+++ b/OpenVLA_day01_stage_CCNB.docx
@@ -2074,6 +2074,72 @@
       </w:r>
     </w:p>
     <w:p>
+      <w:pPr/>
+      <w:r>
+        <w:t>YOLO : rapide, classes COCO, XYZ dans le prompt. Grounding DINO : consigne naturelle, flexibilité sémantique, XYZ optionnels (label seul ou label + XYZ). Détail : OpenVLA_day07_robot_data.docx.</w:t>
+      </w:r>
+    </w:p>
+    <w:p>
+      <w:pPr>
+        <w:pStyle w:val="Titre3"/>
+      </w:pPr>
+      <w:r>
+        <w:t>II.1.3 Comparaison YOLO vs Grounding DINO</w:t>
+      </w:r>
+    </w:p>
+    <w:p>
+      <w:pPr>
+        <w:pStyle w:val="Listepuces"/>
+      </w:pPr>
+      <w:r>
+        <w:t>scripts/openVLA_ZIVID/test/test_zivid_groundingDino.py — pipeline Grounding DINO.</w:t>
+      </w:r>
+    </w:p>
+    <w:p>
+      <w:pPr/>
+      <w:r>
+        <w:t>Grounding DINO (grounding-dino-base) accepte une requête texte libre (ex. « cell phone. ») et retourne des boîtes sans vocabulaire fixe. Même projection 3D que YOLO. Différence clé : le prompt OpenVLA ne contient que pick up the {label}. Option (jour 08) : injecter aussi les XYZ issus de la projection 3D (Grounding DINO + Zivid) pour guider l'action, comme dans la variante YOLO.</w:t>
+      </w:r>
+    </w:p>
+    <w:p>
+      <w:pPr>
+        <w:pStyle w:val="Titre3"/>
+      </w:pPr>
+      <w:r>
+        <w:t>II.1.2 Grounding DINO — détection open-vocabulary (jour 07)</w:t>
+      </w:r>
+    </w:p>
+    <w:p>
+      <w:pPr>
+        <w:pStyle w:val="Listepuces"/>
+      </w:pPr>
+      <w:r>
+        <w:t>scripts/openVLA_ZIVID/functions/returnAllPositions.py — capture + YOLO + liste 3D.</w:t>
+      </w:r>
+    </w:p>
+    <w:p>
+      <w:pPr>
+        <w:pStyle w:val="Listepuces"/>
+      </w:pPr>
+      <w:r>
+        <w:t>scripts/openVLA_ZIVID/test/zivid_yolo_openvla.py — pipeline YOLO complet.</w:t>
+      </w:r>
+    </w:p>
+    <w:p>
+      <w:pPr/>
+      <w:r>
+        <w:t>YOLOv8n détecte des objets COCO en 2D ; le centre (u,v) est projeté dans le nuage Zivid pour obtenir (X,Y,Z). Le prompt OpenVLA inclut le label et la position : pick up the {label} at position X=… Y=… Z=…</w:t>
+      </w:r>
+    </w:p>
+    <w:p>
+      <w:pPr>
+        <w:pStyle w:val="Titre3"/>
+      </w:pPr>
+      <w:r>
+        <w:t>II.1.1 Détection YOLOv8 et coordonnées 3D (jour 07)</w:t>
+      </w:r>
+    </w:p>
+    <w:p>
       <w:r>
         <w:t>YOLO : rapide, classes COCO, XYZ dans le prompt. Grounding DINO : consigne naturelle, flexibilité sémantique, XYZ hors prompt OpenVLA. Détail : OpenVLA_day07_robot_data.docx.</w:t>
       </w:r>
@@ -2087,53 +2153,13 @@
       </w:r>
     </w:p>
     <w:p>
-      <w:pPr>
-        <w:pStyle w:val="Listepuces"/>
-      </w:pPr>
-      <w:r>
-        <w:t>scripts/openVLA_ZIVID/test/test_zivid_groundingDino.py — pipeline Grounding DINO.</w:t>
-      </w:r>
-    </w:p>
-    <w:p>
       <w:r>
         <w:t>Grounding DINO (grounding-dino-base) accepte une requête texte libre (ex. « cell phone. »). Même projection 3D. Le prompt OpenVLA ne contient que pick up the {label} — les XYZ restent pour le contrôleur robot.</w:t>
       </w:r>
     </w:p>
     <w:p>
-      <w:pPr>
-        <w:pStyle w:val="Titre3"/>
-      </w:pPr>
-      <w:r>
-        <w:t>II.1.2 Grounding DINO — détection open-vocabulary (jour 07)</w:t>
-      </w:r>
-    </w:p>
-    <w:p>
-      <w:pPr>
-        <w:pStyle w:val="Listepuces"/>
-      </w:pPr>
-      <w:r>
-        <w:t>scripts/openVLA_ZIVID/functions/returnAllPositions.py — capture + YOLO + liste 3D.</w:t>
-      </w:r>
-    </w:p>
-    <w:p>
-      <w:pPr>
-        <w:pStyle w:val="Listepuces"/>
-      </w:pPr>
-      <w:r>
-        <w:t>scripts/openVLA_ZIVID/test/zivid_yolo_openvla.py — pipeline YOLO complet.</w:t>
-      </w:r>
-    </w:p>
-    <w:p>
       <w:r>
         <w:t>YOLOv8n détecte des objets COCO en 2D ; le centre (u,v) est projeté dans le nuage Zivid pour obtenir (X,Y,Z). Le prompt OpenVLA inclut le label et la position : pick up the {label} at position X=… Y=… Z=…</w:t>
-      </w:r>
-    </w:p>
-    <w:p>
-      <w:pPr>
-        <w:pStyle w:val="Titre3"/>
-      </w:pPr>
-      <w:r>
-        <w:t>II.1.1 Détection YOLOv8 et coordonnées 3D (jour 07)</w:t>
       </w:r>
     </w:p>
     <w:p>
@@ -3005,7 +3031,35 @@
         </w:rPr>
       </w:pPr>
       <w:r>
-        <w:t>Entrées modèle : image RGB 224×224 (Zivid) + consigne texte ; jour 07 — variante YOLO (label + XYZ dans le prompt) ou Grounding DINO (label seul, XYZ pour le robot).</w:t>
+        <w:t>Entrées modèle : image RGB 224×224 (Zivid) + consigne texte ; jour 07 — variante YOLO (label + XYZ dans le prompt) ; Grounding DINO (label seul ou label + XYZ projetés).</w:t>
+      </w:r>
+    </w:p>
+    <w:p>
+      <w:pPr>
+        <w:pStyle w:val="Titre3"/>
+      </w:pPr>
+      <w:r>
+        <w:t>Jour 08 — boucle continue perception → action → réinférence</w:t>
+      </w:r>
+    </w:p>
+    <w:p>
+      <w:pPr/>
+      <w:r>
+        <w:t>Jour 08 : test d'une boucle continue perception → action → réinférence pour rendre le comportement plus adaptatif (correction itérative à chaque nouvelle observation).</w:t>
+      </w:r>
+    </w:p>
+    <w:p>
+      <w:pPr/>
+      <w:r>
+        <w:t>Option d'efficacité : injecter dans l'instruction OpenVLA les coordonnées (X,Y,Z) projetées issues de Grounding DINO + nuage Zivid (en plus du label), comme la variante YOLO.</w:t>
+      </w:r>
+    </w:p>
+    <w:p>
+      <w:pPr>
+        <w:pStyle w:val="Listepuces"/>
+      </w:pPr>
+      <w:r>
+        <w:t>Scripts : demo_adaptatif_openvla.py, demo_adaptatif_openvla_print_value.py.</w:t>
       </w:r>
     </w:p>
     <w:p>
@@ -3917,7 +3971,7 @@
         </w:rPr>
       </w:pPr>
       <w:r>
-        <w:t>Programmeur : Fabrice Kouonang | Projet : OpenVLA — Stage CCNB-INNOV | Rapport final — I à III (comparaison OpenVLA / robotique classique)</w:t>
+        <w:t>Programmeur : Fabrice Kouonang | Projet : OpenVLA — Stage CCNB-INNOV | Rapport final — I à III (jour 07 : YOLO + Grounding DINO)</w:t>
       </w:r>
     </w:p>
     <w:sectPr>

</xml_diff>

<commit_message>
Day09: ajout rapport résultats boucle continue, tests et interprétation; mise à jour rapport final
</commit_message>
<xml_diff>
--- a/OpenVLA_day01_stage_CCNB.docx
+++ b/OpenVLA_day01_stage_CCNB.docx
@@ -1352,29 +1352,59 @@
         </w:rPr>
       </w:pPr>
       <w:r>
-        <w:t>Figure 1 — Architecture conceptuelle OpenVLA (boucle VLA, entrées image + langage, sortie tokens d'action).</w:t>
+        <w:rPr>
+          <w:lang w:val="fr-CA"/>
+        </w:rPr>
+        <w:t xml:space="preserve">Figure 1 — Architecture conceptuelle </w:t>
+      </w:r>
+      <w:proofErr w:type="spellStart"/>
+      <w:r>
+        <w:rPr>
+          <w:lang w:val="fr-CA"/>
+        </w:rPr>
+        <w:t>OpenVLA</w:t>
+      </w:r>
+      <w:proofErr w:type="spellEnd"/>
+      <w:r>
+        <w:rPr>
+          <w:lang w:val="fr-CA"/>
+        </w:rPr>
+        <w:t xml:space="preserve"> (boucle VLA, entrées image + langage, sortie </w:t>
+      </w:r>
+      <w:proofErr w:type="spellStart"/>
+      <w:r>
+        <w:rPr>
+          <w:lang w:val="fr-CA"/>
+        </w:rPr>
+        <w:t>tokens</w:t>
+      </w:r>
+      <w:proofErr w:type="spellEnd"/>
+      <w:r>
+        <w:rPr>
+          <w:lang w:val="fr-CA"/>
+        </w:rPr>
+        <w:t xml:space="preserve"> d'action).</w:t>
       </w:r>
     </w:p>
     <w:p>
       <w:pPr>
         <w:jc w:val="center"/>
-      </w:pPr>
-    </w:p>
-    <w:p>
-      <w:pPr>
-        <w:rPr>
-          <w:lang w:val="fr-CA"/>
-        </w:rPr>
-      </w:pPr>
-      <w:r>
-        <w:rPr>
-          <w:lang w:val="fr-CA"/>
-        </w:rPr>
-      </w:r>
+        <w:rPr>
+          <w:lang w:val="fr-CA"/>
+        </w:rPr>
+      </w:pPr>
+    </w:p>
+    <w:p>
+      <w:pPr>
+        <w:rPr>
+          <w:lang w:val="fr-CA"/>
+        </w:rPr>
+      </w:pPr>
       <w:r>
         <w:rPr>
           <w:noProof/>
         </w:rPr>
+        <w:lastRenderedPageBreak/>
         <w:drawing>
           <wp:inline distT="0" distB="0" distL="0" distR="0" wp14:anchorId="6671C942" wp14:editId="3642E522">
             <wp:extent cx="5303520" cy="2895183"/>
@@ -1411,51 +1441,155 @@
           </wp:inline>
         </w:drawing>
       </w:r>
+    </w:p>
+    <w:p>
+      <w:pPr>
+        <w:rPr>
+          <w:lang w:val="fr-CA"/>
+        </w:rPr>
+      </w:pPr>
+      <w:r>
+        <w:rPr>
+          <w:lang w:val="fr-CA"/>
+        </w:rPr>
+        <w:t xml:space="preserve">Le décodeur LLM représente plus de 95 % du poids du modèle (~15 Go en FP16). </w:t>
+      </w:r>
+      <w:proofErr w:type="gramStart"/>
+      <w:r>
+        <w:rPr>
+          <w:lang w:val="fr-CA"/>
+        </w:rPr>
+        <w:t>Une GPU NVIDIA avec VRAM suffisante</w:t>
+      </w:r>
+      <w:proofErr w:type="gramEnd"/>
+      <w:r>
+        <w:rPr>
+          <w:lang w:val="fr-CA"/>
+        </w:rPr>
+        <w:t xml:space="preserve"> (≥ 16 Go) est requise pour l'inférence locale du modèle openvla-7b.</w:t>
+      </w:r>
+    </w:p>
+    <w:p>
+      <w:pPr>
+        <w:rPr>
+          <w:lang w:val="fr-CA"/>
+        </w:rPr>
+      </w:pPr>
+      <w:r>
+        <w:rPr>
+          <w:lang w:val="fr-CA"/>
+        </w:rPr>
+        <w:t>La figure 1 résume la boucle VLA : vision (image de la scène), langage (consigne utilisateur) et action (</w:t>
+      </w:r>
       <w:proofErr w:type="spellStart"/>
       <w:r>
         <w:rPr>
           <w:lang w:val="fr-CA"/>
         </w:rPr>
+        <w:t>tokens</w:t>
       </w:r>
       <w:proofErr w:type="spellEnd"/>
       <w:r>
         <w:rPr>
           <w:lang w:val="fr-CA"/>
         </w:rPr>
-      </w:r>
-      <w:proofErr w:type="gramStart"/>
-      <w:r>
-        <w:rPr>
-          <w:lang w:val="fr-CA"/>
-        </w:rPr>
-      </w:r>
-      <w:proofErr w:type="gramEnd"/>
-      <w:r>
-        <w:rPr>
-          <w:lang w:val="fr-CA"/>
-        </w:rPr>
-      </w:r>
-    </w:p>
-    <w:p>
-      <w:r>
-        <w:t>Le décodeur LLM représente plus de 95 % du poids du modèle (~15 Go en FP16). Une GPU NVIDIA avec VRAM suffisante (≥ 16 Go) est requise pour l'inférence locale du modèle openvla-7b.</w:t>
-      </w:r>
-    </w:p>
-    <w:p>
-      <w:r>
-        <w:t>La figure 1 résume la boucle VLA : vision (image de la scène), langage (consigne utilisateur) et action (tokens convertis en commandes robot). L'architecture interne combine SigLIP/ViT, un projecteur MLP et Llama 2 7B.</w:t>
-      </w:r>
-    </w:p>
-    <w:p>
-      <w:pPr>
-        <w:rPr>
-          <w:lang w:val="fr-CA"/>
-        </w:rPr>
-      </w:pPr>
-    </w:p>
-    <w:p>
-      <w:r>
-        <w:t>Figure 2 — Système robotique et de vision Zivid : pipeline Zivid + YOLO + OpenVLA (capture RGB/profondeur, détection 2D, coordonnées 3D, inférence, exécution UR).</w:t>
+        <w:t xml:space="preserve"> convertis en commandes robot). L'architecture interne combine </w:t>
+      </w:r>
+      <w:proofErr w:type="spellStart"/>
+      <w:r>
+        <w:rPr>
+          <w:lang w:val="fr-CA"/>
+        </w:rPr>
+        <w:t>SigLIP</w:t>
+      </w:r>
+      <w:proofErr w:type="spellEnd"/>
+      <w:r>
+        <w:rPr>
+          <w:lang w:val="fr-CA"/>
+        </w:rPr>
+        <w:t>/</w:t>
+      </w:r>
+      <w:proofErr w:type="spellStart"/>
+      <w:r>
+        <w:rPr>
+          <w:lang w:val="fr-CA"/>
+        </w:rPr>
+        <w:t>ViT</w:t>
+      </w:r>
+      <w:proofErr w:type="spellEnd"/>
+      <w:r>
+        <w:rPr>
+          <w:lang w:val="fr-CA"/>
+        </w:rPr>
+        <w:t>, un projecteur MLP et Llama 2 7B.</w:t>
+      </w:r>
+    </w:p>
+    <w:p>
+      <w:pPr>
+        <w:rPr>
+          <w:lang w:val="fr-CA"/>
+        </w:rPr>
+      </w:pPr>
+    </w:p>
+    <w:p>
+      <w:pPr>
+        <w:rPr>
+          <w:lang w:val="fr-CA"/>
+        </w:rPr>
+      </w:pPr>
+      <w:r>
+        <w:rPr>
+          <w:lang w:val="fr-CA"/>
+        </w:rPr>
+        <w:t xml:space="preserve">Figure 2 — Système robotique et de vision </w:t>
+      </w:r>
+      <w:proofErr w:type="spellStart"/>
+      <w:r>
+        <w:rPr>
+          <w:lang w:val="fr-CA"/>
+        </w:rPr>
+        <w:t>Zivid</w:t>
+      </w:r>
+      <w:proofErr w:type="spellEnd"/>
+      <w:r>
+        <w:rPr>
+          <w:lang w:val="fr-CA"/>
+        </w:rPr>
+        <w:t xml:space="preserve"> : pipeline </w:t>
+      </w:r>
+      <w:proofErr w:type="spellStart"/>
+      <w:r>
+        <w:rPr>
+          <w:lang w:val="fr-CA"/>
+        </w:rPr>
+        <w:t>Zivid</w:t>
+      </w:r>
+      <w:proofErr w:type="spellEnd"/>
+      <w:r>
+        <w:rPr>
+          <w:lang w:val="fr-CA"/>
+        </w:rPr>
+        <w:t xml:space="preserve"> + YOLO + </w:t>
+      </w:r>
+      <w:proofErr w:type="spellStart"/>
+      <w:r>
+        <w:rPr>
+          <w:lang w:val="fr-CA"/>
+        </w:rPr>
+        <w:t>OpenVLA</w:t>
+      </w:r>
+      <w:proofErr w:type="spellEnd"/>
+      <w:r>
+        <w:rPr>
+          <w:lang w:val="fr-CA"/>
+        </w:rPr>
+        <w:t xml:space="preserve"> (capture RGB/profondeur, détection 2D, coordonnées 3D, inférence, exécution UR).</w:t>
+      </w:r>
+      <w:r>
+        <w:rPr>
+          <w:lang w:val="fr-CA"/>
+        </w:rPr>
+        <w:t xml:space="preserve"> </w:t>
       </w:r>
     </w:p>
     <w:p>
@@ -1470,16 +1604,16 @@
           <w:lang w:val="fr-CA"/>
         </w:rPr>
         <w:drawing>
-          <wp:anchor distT="0" distB="0" distL="114300" distR="114300" simplePos="0" relativeHeight="251662336" behindDoc="1" locked="0" layoutInCell="1" allowOverlap="1" wp14:anchorId="50305725" wp14:editId="122D8DEE">
+          <wp:anchor distT="0" distB="0" distL="114300" distR="114300" simplePos="0" relativeHeight="251662336" behindDoc="1" locked="0" layoutInCell="1" allowOverlap="1" wp14:anchorId="50305725" wp14:editId="441A91A0">
             <wp:simplePos x="0" y="0"/>
             <wp:positionH relativeFrom="column">
-              <wp:posOffset>-883180</wp:posOffset>
+              <wp:posOffset>-494665</wp:posOffset>
             </wp:positionH>
             <wp:positionV relativeFrom="paragraph">
-              <wp:posOffset>267003</wp:posOffset>
+              <wp:posOffset>40640</wp:posOffset>
             </wp:positionV>
-            <wp:extent cx="6926541" cy="3800901"/>
-            <wp:effectExtent l="0" t="0" r="8255" b="9525"/>
+            <wp:extent cx="6362700" cy="3491496"/>
+            <wp:effectExtent l="0" t="0" r="0" b="0"/>
             <wp:wrapNone/>
             <wp:docPr id="91185165" name="Image 2"/>
             <wp:cNvGraphicFramePr>
@@ -1510,7 +1644,7 @@
                   <pic:spPr bwMode="auto">
                     <a:xfrm>
                       <a:off x="0" y="0"/>
-                      <a:ext cx="6926541" cy="3800901"/>
+                      <a:ext cx="6362700" cy="3491496"/>
                     </a:xfrm>
                     <a:prstGeom prst="rect">
                       <a:avLst/>
@@ -1628,7 +1762,52 @@
         </w:rPr>
       </w:pPr>
       <w:r>
-        <w:t>Figure 3 — Poids des modèles par composant (SigLIP, Prismatic, Llama 2 7B, action head).</w:t>
+        <w:rPr>
+          <w:lang w:val="fr-CA"/>
+        </w:rPr>
+        <w:t>Figure 3 — Poids des modèles par composant (</w:t>
+      </w:r>
+      <w:proofErr w:type="spellStart"/>
+      <w:r>
+        <w:rPr>
+          <w:lang w:val="fr-CA"/>
+        </w:rPr>
+        <w:t>SigLIP</w:t>
+      </w:r>
+      <w:proofErr w:type="spellEnd"/>
+      <w:r>
+        <w:rPr>
+          <w:lang w:val="fr-CA"/>
+        </w:rPr>
+        <w:t xml:space="preserve">, </w:t>
+      </w:r>
+      <w:proofErr w:type="spellStart"/>
+      <w:r>
+        <w:rPr>
+          <w:lang w:val="fr-CA"/>
+        </w:rPr>
+        <w:t>Prismatic</w:t>
+      </w:r>
+      <w:proofErr w:type="spellEnd"/>
+      <w:r>
+        <w:rPr>
+          <w:lang w:val="fr-CA"/>
+        </w:rPr>
+        <w:t xml:space="preserve">, Llama 2 7B, action </w:t>
+      </w:r>
+      <w:proofErr w:type="spellStart"/>
+      <w:r>
+        <w:rPr>
+          <w:lang w:val="fr-CA"/>
+        </w:rPr>
+        <w:t>head</w:t>
+      </w:r>
+      <w:proofErr w:type="spellEnd"/>
+      <w:r>
+        <w:rPr>
+          <w:lang w:val="fr-CA"/>
+        </w:rPr>
+        <w:t>).</w:t>
       </w:r>
     </w:p>
     <w:p>
@@ -1718,7 +1897,52 @@
         </w:rPr>
       </w:pPr>
       <w:r>
-        <w:t>Figure 4 — Vue macro du flux de données OpenVLA (instruction, capture, encodage SigLIP, décodeur Llama 2, action head, feedback).</w:t>
+        <w:rPr>
+          <w:lang w:val="fr-CA"/>
+        </w:rPr>
+        <w:t xml:space="preserve">Figure 4 — Vue macro du flux de données </w:t>
+      </w:r>
+      <w:proofErr w:type="spellStart"/>
+      <w:r>
+        <w:rPr>
+          <w:lang w:val="fr-CA"/>
+        </w:rPr>
+        <w:t>OpenVLA</w:t>
+      </w:r>
+      <w:proofErr w:type="spellEnd"/>
+      <w:r>
+        <w:rPr>
+          <w:lang w:val="fr-CA"/>
+        </w:rPr>
+        <w:t xml:space="preserve"> (instruction, capture, encodage </w:t>
+      </w:r>
+      <w:proofErr w:type="spellStart"/>
+      <w:r>
+        <w:rPr>
+          <w:lang w:val="fr-CA"/>
+        </w:rPr>
+        <w:t>SigLIP</w:t>
+      </w:r>
+      <w:proofErr w:type="spellEnd"/>
+      <w:r>
+        <w:rPr>
+          <w:lang w:val="fr-CA"/>
+        </w:rPr>
+        <w:t xml:space="preserve">, décodeur Llama 2, action </w:t>
+      </w:r>
+      <w:proofErr w:type="spellStart"/>
+      <w:r>
+        <w:rPr>
+          <w:lang w:val="fr-CA"/>
+        </w:rPr>
+        <w:t>head</w:t>
+      </w:r>
+      <w:proofErr w:type="spellEnd"/>
+      <w:r>
+        <w:rPr>
+          <w:lang w:val="fr-CA"/>
+        </w:rPr>
+        <w:t>, feedback).</w:t>
       </w:r>
     </w:p>
     <w:p>
@@ -2074,9 +2298,33 @@
       </w:r>
     </w:p>
     <w:p>
-      <w:pPr/>
-      <w:r>
-        <w:t>YOLO : rapide, classes COCO, XYZ dans le prompt. Grounding DINO : consigne naturelle, flexibilité sémantique, XYZ optionnels (label seul ou label + XYZ). Détail : OpenVLA_day07_robot_data.docx.</w:t>
+      <w:r>
+        <w:rPr>
+          <w:lang w:val="fr-CA"/>
+        </w:rPr>
+        <w:t xml:space="preserve">YOLO : rapide, classes COCO, XYZ dans le prompt. </w:t>
+      </w:r>
+      <w:proofErr w:type="spellStart"/>
+      <w:r>
+        <w:rPr>
+          <w:lang w:val="fr-CA"/>
+        </w:rPr>
+        <w:t>Grounding</w:t>
+      </w:r>
+      <w:proofErr w:type="spellEnd"/>
+      <w:r>
+        <w:rPr>
+          <w:lang w:val="fr-CA"/>
+        </w:rPr>
+        <w:t xml:space="preserve"> DINO : consigne naturelle, flexibilité sémantique, XYZ optionnels (label seul ou label + XYZ). </w:t>
+      </w:r>
+      <w:proofErr w:type="spellStart"/>
+      <w:r>
+        <w:t>Détail</w:t>
+      </w:r>
+      <w:proofErr w:type="spellEnd"/>
+      <w:r>
+        <w:t xml:space="preserve"> : OpenVLA_day07_robot_data.docx.</w:t>
       </w:r>
     </w:p>
     <w:p>
@@ -2096,9 +2344,122 @@
       </w:r>
     </w:p>
     <w:p>
-      <w:pPr/>
-      <w:r>
-        <w:t>Grounding DINO (grounding-dino-base) accepte une requête texte libre (ex. « cell phone. ») et retourne des boîtes sans vocabulaire fixe. Même projection 3D que YOLO. Différence clé : le prompt OpenVLA ne contient que pick up the {label}. Option (jour 08) : injecter aussi les XYZ issus de la projection 3D (Grounding DINO + Zivid) pour guider l'action, comme dans la variante YOLO.</w:t>
+      <w:pPr>
+        <w:rPr>
+          <w:lang w:val="fr-CA"/>
+        </w:rPr>
+      </w:pPr>
+      <w:proofErr w:type="spellStart"/>
+      <w:r>
+        <w:rPr>
+          <w:lang w:val="fr-CA"/>
+        </w:rPr>
+        <w:t>Grounding</w:t>
+      </w:r>
+      <w:proofErr w:type="spellEnd"/>
+      <w:r>
+        <w:rPr>
+          <w:lang w:val="fr-CA"/>
+        </w:rPr>
+        <w:t xml:space="preserve"> DINO (</w:t>
+      </w:r>
+      <w:proofErr w:type="spellStart"/>
+      <w:r>
+        <w:rPr>
+          <w:lang w:val="fr-CA"/>
+        </w:rPr>
+        <w:t>grounding</w:t>
+      </w:r>
+      <w:proofErr w:type="spellEnd"/>
+      <w:r>
+        <w:rPr>
+          <w:lang w:val="fr-CA"/>
+        </w:rPr>
+        <w:t>-</w:t>
+      </w:r>
+      <w:proofErr w:type="spellStart"/>
+      <w:r>
+        <w:rPr>
+          <w:lang w:val="fr-CA"/>
+        </w:rPr>
+        <w:t>dino</w:t>
+      </w:r>
+      <w:proofErr w:type="spellEnd"/>
+      <w:r>
+        <w:rPr>
+          <w:lang w:val="fr-CA"/>
+        </w:rPr>
+        <w:t xml:space="preserve">-base) accepte une requête texte libre (ex. « </w:t>
+      </w:r>
+      <w:proofErr w:type="spellStart"/>
+      <w:r>
+        <w:rPr>
+          <w:lang w:val="fr-CA"/>
+        </w:rPr>
+        <w:t>cell</w:t>
+      </w:r>
+      <w:proofErr w:type="spellEnd"/>
+      <w:r>
+        <w:rPr>
+          <w:lang w:val="fr-CA"/>
+        </w:rPr>
+        <w:t xml:space="preserve"> phone. ») et retourne des boîtes sans vocabulaire fixe. Même projection 3D que YOLO. Différence clé : le prompt </w:t>
+      </w:r>
+      <w:proofErr w:type="spellStart"/>
+      <w:r>
+        <w:rPr>
+          <w:lang w:val="fr-CA"/>
+        </w:rPr>
+        <w:t>OpenVLA</w:t>
+      </w:r>
+      <w:proofErr w:type="spellEnd"/>
+      <w:r>
+        <w:rPr>
+          <w:lang w:val="fr-CA"/>
+        </w:rPr>
+        <w:t xml:space="preserve"> ne contient que </w:t>
+      </w:r>
+      <w:proofErr w:type="spellStart"/>
+      <w:r>
+        <w:rPr>
+          <w:lang w:val="fr-CA"/>
+        </w:rPr>
+        <w:t>pick</w:t>
+      </w:r>
+      <w:proofErr w:type="spellEnd"/>
+      <w:r>
+        <w:rPr>
+          <w:lang w:val="fr-CA"/>
+        </w:rPr>
+        <w:t xml:space="preserve"> up the {label}. Option (jour 08) : injecter aussi les XYZ issus de la projection 3D (</w:t>
+      </w:r>
+      <w:proofErr w:type="spellStart"/>
+      <w:r>
+        <w:rPr>
+          <w:lang w:val="fr-CA"/>
+        </w:rPr>
+        <w:t>Grounding</w:t>
+      </w:r>
+      <w:proofErr w:type="spellEnd"/>
+      <w:r>
+        <w:rPr>
+          <w:lang w:val="fr-CA"/>
+        </w:rPr>
+        <w:t xml:space="preserve"> DINO + </w:t>
+      </w:r>
+      <w:proofErr w:type="spellStart"/>
+      <w:r>
+        <w:rPr>
+          <w:lang w:val="fr-CA"/>
+        </w:rPr>
+        <w:t>Zivid</w:t>
+      </w:r>
+      <w:proofErr w:type="spellEnd"/>
+      <w:r>
+        <w:rPr>
+          <w:lang w:val="fr-CA"/>
+        </w:rPr>
+        <w:t>) pour guider l'action, comme dans la variante YOLO.</w:t>
       </w:r>
     </w:p>
     <w:p>
@@ -2126,331 +2487,24 @@
       </w:r>
     </w:p>
     <w:p>
-      <w:pPr/>
-      <w:r>
-        <w:t>YOLOv8n détecte des objets COCO en 2D ; le centre (u,v) est projeté dans le nuage Zivid pour obtenir (X,Y,Z). Le prompt OpenVLA inclut le label et la position : pick up the {label} at position X=… Y=… Z=…</w:t>
-      </w:r>
-    </w:p>
-    <w:p>
-      <w:pPr>
-        <w:pStyle w:val="Titre3"/>
-      </w:pPr>
-      <w:r>
-        <w:t>II.1.1 Détection YOLOv8 et coordonnées 3D (jour 07)</w:t>
-      </w:r>
-    </w:p>
-    <w:p>
-      <w:r>
-        <w:t>YOLO : rapide, classes COCO, XYZ dans le prompt. Grounding DINO : consigne naturelle, flexibilité sémantique, XYZ hors prompt OpenVLA. Détail : OpenVLA_day07_robot_data.docx.</w:t>
-      </w:r>
-    </w:p>
-    <w:p>
-      <w:pPr>
-        <w:pStyle w:val="Titre3"/>
-      </w:pPr>
-      <w:r>
-        <w:t>II.1.3 Comparaison YOLO vs Grounding DINO</w:t>
-      </w:r>
-    </w:p>
-    <w:p>
-      <w:r>
-        <w:t>Grounding DINO (grounding-dino-base) accepte une requête texte libre (ex. « cell phone. »). Même projection 3D. Le prompt OpenVLA ne contient que pick up the {label} — les XYZ restent pour le contrôleur robot.</w:t>
-      </w:r>
-    </w:p>
-    <w:p>
-      <w:r>
-        <w:t>YOLOv8n détecte des objets COCO en 2D ; le centre (u,v) est projeté dans le nuage Zivid pour obtenir (X,Y,Z). Le prompt OpenVLA inclut le label et la position : pick up the {label} at position X=… Y=… Z=…</w:t>
-      </w:r>
-    </w:p>
-    <w:p>
-      <w:pPr>
-        <w:pStyle w:val="Titre2"/>
-        <w:rPr>
-          <w:lang w:val="fr-CA"/>
-        </w:rPr>
-      </w:pPr>
-      <w:r>
-        <w:rPr>
-          <w:lang w:val="fr-CA"/>
-        </w:rPr>
-        <w:t xml:space="preserve">II.2 Inférence : </w:t>
-      </w:r>
-      <w:proofErr w:type="spellStart"/>
-      <w:r>
-        <w:rPr>
-          <w:lang w:val="fr-CA"/>
-        </w:rPr>
-        <w:t>OpenVLA</w:t>
-      </w:r>
-      <w:proofErr w:type="spellEnd"/>
-      <w:r>
-        <w:rPr>
-          <w:lang w:val="fr-CA"/>
-        </w:rPr>
-        <w:t xml:space="preserve"> (</w:t>
-      </w:r>
-      <w:proofErr w:type="spellStart"/>
-      <w:r>
-        <w:rPr>
-          <w:lang w:val="fr-CA"/>
-        </w:rPr>
-        <w:t>transformers</w:t>
-      </w:r>
-      <w:proofErr w:type="spellEnd"/>
-      <w:r>
-        <w:rPr>
-          <w:lang w:val="fr-CA"/>
-        </w:rPr>
-        <w:t>)</w:t>
-      </w:r>
-    </w:p>
-    <w:p>
-      <w:pPr>
-        <w:rPr>
-          <w:lang w:val="fr-CA"/>
-        </w:rPr>
-      </w:pPr>
-      <w:r>
-        <w:rPr>
-          <w:lang w:val="fr-CA"/>
-        </w:rPr>
-        <w:t xml:space="preserve">L'inférence utilise </w:t>
-      </w:r>
-      <w:proofErr w:type="spellStart"/>
-      <w:r>
-        <w:rPr>
-          <w:lang w:val="fr-CA"/>
-        </w:rPr>
-        <w:t>Hugging</w:t>
-      </w:r>
-      <w:proofErr w:type="spellEnd"/>
-      <w:r>
-        <w:rPr>
-          <w:lang w:val="fr-CA"/>
-        </w:rPr>
-        <w:t xml:space="preserve"> Face Transformers : </w:t>
-      </w:r>
-      <w:proofErr w:type="spellStart"/>
-      <w:r>
-        <w:rPr>
-          <w:lang w:val="fr-CA"/>
-        </w:rPr>
-        <w:t>AutoProcessor</w:t>
-      </w:r>
-      <w:proofErr w:type="spellEnd"/>
-      <w:r>
-        <w:rPr>
-          <w:lang w:val="fr-CA"/>
-        </w:rPr>
-        <w:t xml:space="preserve"> + AutoModelForVision2Seq. Le modèle est chargé en bfloat16 ou float16 sur cuda:0. La méthode </w:t>
-      </w:r>
-      <w:proofErr w:type="spellStart"/>
-      <w:r>
-        <w:rPr>
-          <w:lang w:val="fr-CA"/>
-        </w:rPr>
-        <w:t>predict_</w:t>
-      </w:r>
-      <w:proofErr w:type="gramStart"/>
-      <w:r>
-        <w:rPr>
-          <w:lang w:val="fr-CA"/>
-        </w:rPr>
-        <w:t>action</w:t>
-      </w:r>
-      <w:proofErr w:type="spellEnd"/>
-      <w:r>
-        <w:rPr>
-          <w:lang w:val="fr-CA"/>
-        </w:rPr>
-        <w:t>(</w:t>
-      </w:r>
-      <w:proofErr w:type="gramEnd"/>
-      <w:r>
-        <w:rPr>
-          <w:lang w:val="fr-CA"/>
-        </w:rPr>
-        <w:t xml:space="preserve">) produit une action normalisée, </w:t>
-      </w:r>
-      <w:proofErr w:type="spellStart"/>
-      <w:r>
-        <w:rPr>
-          <w:lang w:val="fr-CA"/>
-        </w:rPr>
-        <w:t>dé-normalisée</w:t>
-      </w:r>
-      <w:proofErr w:type="spellEnd"/>
-      <w:r>
-        <w:rPr>
-          <w:lang w:val="fr-CA"/>
-        </w:rPr>
-        <w:t xml:space="preserve"> avec la clé </w:t>
-      </w:r>
-      <w:proofErr w:type="spellStart"/>
-      <w:r>
-        <w:rPr>
-          <w:lang w:val="fr-CA"/>
-        </w:rPr>
-        <w:t>unnorm_key</w:t>
-      </w:r>
-      <w:proofErr w:type="spellEnd"/>
-      <w:r>
-        <w:rPr>
-          <w:lang w:val="fr-CA"/>
-        </w:rPr>
-        <w:t>="</w:t>
-      </w:r>
-      <w:proofErr w:type="spellStart"/>
-      <w:r>
-        <w:rPr>
-          <w:lang w:val="fr-CA"/>
-        </w:rPr>
-        <w:t>bridge_orig</w:t>
-      </w:r>
-      <w:proofErr w:type="spellEnd"/>
-      <w:r>
-        <w:rPr>
-          <w:lang w:val="fr-CA"/>
-        </w:rPr>
-        <w:t>".</w:t>
-      </w:r>
-    </w:p>
-    <w:p>
-      <w:pPr>
-        <w:pStyle w:val="Listepuces"/>
-      </w:pPr>
-      <w:proofErr w:type="gramStart"/>
-      <w:r>
-        <w:t>Packages :</w:t>
-      </w:r>
-      <w:proofErr w:type="gramEnd"/>
-      <w:r>
-        <w:t xml:space="preserve"> transformers, torch, Pillow, huggingface_hub, </w:t>
-      </w:r>
-      <w:proofErr w:type="gramStart"/>
-      <w:r>
-        <w:t>accelerate</w:t>
-      </w:r>
-      <w:proofErr w:type="gramEnd"/>
-      <w:r>
-        <w:t>.</w:t>
-      </w:r>
-    </w:p>
-    <w:p>
-      <w:pPr>
-        <w:pStyle w:val="Listepuces"/>
-      </w:pPr>
-      <w:r>
-        <w:t>Téléchargement : huggingface-cli download openvla/openvla-7b.</w:t>
-      </w:r>
-    </w:p>
-    <w:p>
-      <w:pPr>
-        <w:pStyle w:val="Listepuces"/>
-      </w:pPr>
-      <w:r>
-        <w:t>Test isolé : scripts/integration/test/test_openvla.py.</w:t>
-      </w:r>
-    </w:p>
-    <w:p>
-      <w:pPr>
-        <w:pStyle w:val="Listepuces"/>
-      </w:pPr>
-      <w:r>
-        <w:t>Test intégré : scripts/integration/test/test_zivid_openvla.py.</w:t>
-      </w:r>
-    </w:p>
-    <w:p>
-      <w:pPr>
-        <w:pStyle w:val="Titre2"/>
-        <w:rPr>
-          <w:lang w:val="fr-CA"/>
-        </w:rPr>
-      </w:pPr>
-      <w:r>
-        <w:rPr>
-          <w:lang w:val="fr-CA"/>
-        </w:rPr>
-        <w:t>II.3 Génération d'actions et format de sortie</w:t>
-      </w:r>
-    </w:p>
-    <w:p>
-      <w:pPr>
-        <w:rPr>
-          <w:lang w:val="fr-CA"/>
-        </w:rPr>
-      </w:pPr>
-      <w:r>
-        <w:rPr>
-          <w:lang w:val="fr-CA"/>
-        </w:rPr>
-        <w:t xml:space="preserve">Chaque prédiction </w:t>
-      </w:r>
-      <w:proofErr w:type="spellStart"/>
-      <w:r>
-        <w:rPr>
-          <w:lang w:val="fr-CA"/>
-        </w:rPr>
-        <w:t>OpenVLA</w:t>
-      </w:r>
-      <w:proofErr w:type="spellEnd"/>
-      <w:r>
-        <w:rPr>
-          <w:lang w:val="fr-CA"/>
-        </w:rPr>
-        <w:t xml:space="preserve"> retourne 7 valeurs :</w:t>
-      </w:r>
-    </w:p>
-    <w:p>
-      <w:pPr>
-        <w:pStyle w:val="Listepuces"/>
-        <w:rPr>
-          <w:lang w:val="fr-CA"/>
-        </w:rPr>
-      </w:pPr>
-      <w:proofErr w:type="gramStart"/>
-      <w:r>
-        <w:rPr>
-          <w:lang w:val="fr-CA"/>
-        </w:rPr>
-        <w:t>dx</w:t>
-      </w:r>
-      <w:proofErr w:type="gramEnd"/>
-      <w:r>
-        <w:rPr>
-          <w:lang w:val="fr-CA"/>
-        </w:rPr>
-        <w:t xml:space="preserve">, </w:t>
-      </w:r>
-      <w:proofErr w:type="spellStart"/>
-      <w:r>
-        <w:rPr>
-          <w:lang w:val="fr-CA"/>
-        </w:rPr>
-        <w:t>dy</w:t>
-      </w:r>
-      <w:proofErr w:type="spellEnd"/>
-      <w:r>
-        <w:rPr>
-          <w:lang w:val="fr-CA"/>
-        </w:rPr>
-        <w:t>, dz — déplacement cartésien de l'effecteur.</w:t>
-      </w:r>
-    </w:p>
-    <w:p>
-      <w:pPr>
-        <w:pStyle w:val="Listepuces"/>
-        <w:rPr>
-          <w:lang w:val="fr-CA"/>
-        </w:rPr>
-      </w:pPr>
+      <w:pPr>
+        <w:rPr>
+          <w:lang w:val="fr-CA"/>
+        </w:rPr>
+      </w:pPr>
+      <w:r>
+        <w:rPr>
+          <w:lang w:val="fr-CA"/>
+        </w:rPr>
+        <w:t>YOLOv8n détecte des objets COCO en 2D ; le centre (</w:t>
+      </w:r>
       <w:proofErr w:type="spellStart"/>
       <w:proofErr w:type="gramStart"/>
       <w:r>
         <w:rPr>
           <w:lang w:val="fr-CA"/>
         </w:rPr>
-        <w:t>rx</w:t>
+        <w:t>u,v</w:t>
       </w:r>
       <w:proofErr w:type="spellEnd"/>
       <w:proofErr w:type="gramEnd"/>
@@ -2458,353 +2512,502 @@
         <w:rPr>
           <w:lang w:val="fr-CA"/>
         </w:rPr>
-        <w:t xml:space="preserve">, </w:t>
+        <w:t xml:space="preserve">) est projeté dans le nuage </w:t>
       </w:r>
       <w:proofErr w:type="spellStart"/>
       <w:r>
         <w:rPr>
           <w:lang w:val="fr-CA"/>
         </w:rPr>
-        <w:t>ry</w:t>
+        <w:t>Zivid</w:t>
       </w:r>
       <w:proofErr w:type="spellEnd"/>
       <w:r>
         <w:rPr>
           <w:lang w:val="fr-CA"/>
         </w:rPr>
-        <w:t xml:space="preserve">, </w:t>
+        <w:t xml:space="preserve"> pour obtenir (</w:t>
+      </w:r>
+      <w:proofErr w:type="gramStart"/>
+      <w:r>
+        <w:rPr>
+          <w:lang w:val="fr-CA"/>
+        </w:rPr>
+        <w:t>X,Y</w:t>
+      </w:r>
+      <w:proofErr w:type="gramEnd"/>
+      <w:r>
+        <w:rPr>
+          <w:lang w:val="fr-CA"/>
+        </w:rPr>
+        <w:t xml:space="preserve">,Z). Le prompt </w:t>
       </w:r>
       <w:proofErr w:type="spellStart"/>
       <w:r>
         <w:rPr>
           <w:lang w:val="fr-CA"/>
         </w:rPr>
-        <w:t>rz</w:t>
+        <w:t>OpenVLA</w:t>
       </w:r>
       <w:proofErr w:type="spellEnd"/>
       <w:r>
         <w:rPr>
           <w:lang w:val="fr-CA"/>
         </w:rPr>
-        <w:t xml:space="preserve"> — variation d'orientation.</w:t>
-      </w:r>
-    </w:p>
-    <w:p>
-      <w:pPr>
-        <w:pStyle w:val="Listepuces"/>
-        <w:rPr>
-          <w:lang w:val="fr-CA"/>
-        </w:rPr>
-      </w:pPr>
-      <w:proofErr w:type="gramStart"/>
-      <w:r>
-        <w:rPr>
-          <w:lang w:val="fr-CA"/>
-        </w:rPr>
-        <w:t>gripper</w:t>
-      </w:r>
-      <w:proofErr w:type="gramEnd"/>
-      <w:r>
-        <w:rPr>
-          <w:lang w:val="fr-CA"/>
-        </w:rPr>
-        <w:t xml:space="preserve"> — état de la pince (&lt; 0,5 : fermer ; ≥ 0,5 : ouvrir).</w:t>
-      </w:r>
-    </w:p>
-    <w:p>
-      <w:pPr>
-        <w:rPr>
-          <w:lang w:val="fr-CA"/>
-        </w:rPr>
-      </w:pPr>
+        <w:t xml:space="preserve"> inclut le label et la position : </w:t>
+      </w:r>
       <w:proofErr w:type="spellStart"/>
       <w:r>
-        <w:t>Consignes</w:t>
+        <w:rPr>
+          <w:lang w:val="fr-CA"/>
+        </w:rPr>
+        <w:t>pick</w:t>
       </w:r>
       <w:proofErr w:type="spellEnd"/>
       <w:r>
-        <w:t xml:space="preserve"> </w:t>
+        <w:rPr>
+          <w:lang w:val="fr-CA"/>
+        </w:rPr>
+        <w:t xml:space="preserve"> up the {label} at position X=… Y=… Z=…</w:t>
+      </w:r>
+    </w:p>
+    <w:p>
+      <w:pPr>
+        <w:pStyle w:val="Titre3"/>
+        <w:rPr>
+          <w:lang w:val="fr-CA"/>
+        </w:rPr>
+      </w:pPr>
+      <w:r>
+        <w:rPr>
+          <w:lang w:val="fr-CA"/>
+        </w:rPr>
+        <w:t>II.1.1 Détection YOLOv8 et coordonnées 3D (jour 07)</w:t>
+      </w:r>
+    </w:p>
+    <w:p>
+      <w:r>
+        <w:rPr>
+          <w:lang w:val="fr-CA"/>
+        </w:rPr>
+        <w:t xml:space="preserve">YOLO : rapide, classes COCO, XYZ dans le prompt. </w:t>
       </w:r>
       <w:proofErr w:type="spellStart"/>
       <w:r>
-        <w:t>testées</w:t>
+        <w:rPr>
+          <w:lang w:val="fr-CA"/>
+        </w:rPr>
+        <w:t>Grounding</w:t>
       </w:r>
       <w:proofErr w:type="spellEnd"/>
       <w:r>
-        <w:t xml:space="preserve"> au </w:t>
-      </w:r>
-      <w:proofErr w:type="gramStart"/>
-      <w:r>
-        <w:t>stage :</w:t>
-      </w:r>
-      <w:proofErr w:type="gramEnd"/>
-      <w:r>
-        <w:t xml:space="preserve"> « pick up the object on the </w:t>
-      </w:r>
-      <w:proofErr w:type="gramStart"/>
-      <w:r>
-        <w:t>table », «</w:t>
-      </w:r>
-      <w:proofErr w:type="gramEnd"/>
-      <w:r>
-        <w:t xml:space="preserve"> grab the red </w:t>
-      </w:r>
-      <w:proofErr w:type="gramStart"/>
-      <w:r>
-        <w:t>object », «</w:t>
-      </w:r>
-      <w:proofErr w:type="gramEnd"/>
-      <w:r>
-        <w:t xml:space="preserve"> push the object to the </w:t>
-      </w:r>
-      <w:proofErr w:type="gramStart"/>
-      <w:r>
-        <w:t>left », «</w:t>
-      </w:r>
-      <w:proofErr w:type="gramEnd"/>
-      <w:r>
-        <w:t xml:space="preserve"> place the object in the </w:t>
-      </w:r>
-      <w:proofErr w:type="gramStart"/>
-      <w:r>
-        <w:t>bin ».</w:t>
-      </w:r>
-      <w:proofErr w:type="gramEnd"/>
-      <w:r>
-        <w:t xml:space="preserve"> </w:t>
-      </w:r>
-      <w:r>
-        <w:rPr>
-          <w:lang w:val="fr-CA"/>
-        </w:rPr>
-        <w:t xml:space="preserve">L'action est un delta local : elle doit être convertie en commandes UR (RTDE ou </w:t>
+        <w:rPr>
+          <w:lang w:val="fr-CA"/>
+        </w:rPr>
+        <w:t xml:space="preserve"> DINO : consigne naturelle, flexibilité sémantique, XYZ hors prompt </w:t>
       </w:r>
       <w:proofErr w:type="spellStart"/>
       <w:r>
         <w:rPr>
           <w:lang w:val="fr-CA"/>
         </w:rPr>
-        <w:t>URScript</w:t>
+        <w:t>OpenVLA</w:t>
       </w:r>
       <w:proofErr w:type="spellEnd"/>
       <w:r>
         <w:rPr>
           <w:lang w:val="fr-CA"/>
         </w:rPr>
-        <w:t>) dans le script d'intégration final (zivid_ur_robot_integration.py).</w:t>
-      </w:r>
-    </w:p>
-    <w:p>
-      <w:pPr>
-        <w:pStyle w:val="Titre2"/>
-        <w:rPr>
-          <w:lang w:val="fr-CA"/>
-        </w:rPr>
-      </w:pPr>
-      <w:r>
-        <w:rPr>
-          <w:lang w:val="fr-CA"/>
-        </w:rPr>
-        <w:t>II.4 Exécution robotique : UR (</w:t>
+        <w:t xml:space="preserve">. </w:t>
       </w:r>
       <w:proofErr w:type="spellStart"/>
       <w:r>
-        <w:rPr>
-          <w:lang w:val="fr-CA"/>
-        </w:rPr>
-        <w:t>URScript</w:t>
+        <w:t>Détail</w:t>
       </w:r>
       <w:proofErr w:type="spellEnd"/>
       <w:r>
-        <w:rPr>
-          <w:lang w:val="fr-CA"/>
-        </w:rPr>
-        <w:t xml:space="preserve"> / </w:t>
-      </w:r>
+        <w:t xml:space="preserve"> : OpenVLA_day07_robot_data.docx.</w:t>
+      </w:r>
+    </w:p>
+    <w:p>
+      <w:pPr>
+        <w:pStyle w:val="Titre3"/>
+      </w:pPr>
+      <w:r>
+        <w:t>II.1.3 Comparaison YOLO vs Grounding DINO</w:t>
+      </w:r>
+    </w:p>
+    <w:p>
+      <w:pPr>
+        <w:rPr>
+          <w:lang w:val="fr-CA"/>
+        </w:rPr>
+      </w:pPr>
       <w:proofErr w:type="spellStart"/>
       <w:r>
         <w:rPr>
           <w:lang w:val="fr-CA"/>
         </w:rPr>
-        <w:t>ur-rtde</w:t>
+        <w:t>Grounding</w:t>
       </w:r>
       <w:proofErr w:type="spellEnd"/>
       <w:r>
         <w:rPr>
           <w:lang w:val="fr-CA"/>
         </w:rPr>
-        <w:t>)</w:t>
-      </w:r>
-    </w:p>
-    <w:p>
-      <w:r>
-        <w:rPr>
-          <w:lang w:val="fr-CA"/>
-        </w:rPr>
-        <w:t xml:space="preserve">L'exécution repose sur un robot collaboratif Universal Robots. </w:t>
-      </w:r>
-      <w:r>
-        <w:t>Deux modes coexistent :</w:t>
-      </w:r>
-    </w:p>
-    <w:p>
-      <w:pPr>
-        <w:pStyle w:val="Listepuces"/>
-        <w:rPr>
-          <w:lang w:val="fr-CA"/>
-        </w:rPr>
-      </w:pPr>
+        <w:t xml:space="preserve"> DINO (</w:t>
+      </w:r>
       <w:proofErr w:type="spellStart"/>
       <w:r>
         <w:rPr>
           <w:lang w:val="fr-CA"/>
         </w:rPr>
-        <w:t>URScript</w:t>
+        <w:t>grounding</w:t>
       </w:r>
       <w:proofErr w:type="spellEnd"/>
       <w:r>
         <w:rPr>
           <w:lang w:val="fr-CA"/>
         </w:rPr>
-        <w:t xml:space="preserve"> </w:t>
-      </w:r>
-      <w:proofErr w:type="gramStart"/>
-      <w:r>
-        <w:rPr>
-          <w:lang w:val="fr-CA"/>
-        </w:rPr>
-        <w:t>(.script</w:t>
-      </w:r>
-      <w:proofErr w:type="gramEnd"/>
-      <w:r>
-        <w:rPr>
-          <w:lang w:val="fr-CA"/>
-        </w:rPr>
-        <w:t xml:space="preserve">) sur </w:t>
+        <w:t>-</w:t>
       </w:r>
       <w:proofErr w:type="spellStart"/>
       <w:r>
         <w:rPr>
           <w:lang w:val="fr-CA"/>
         </w:rPr>
-        <w:t>PolyScope</w:t>
+        <w:t>dino</w:t>
       </w:r>
       <w:proofErr w:type="spellEnd"/>
       <w:r>
         <w:rPr>
           <w:lang w:val="fr-CA"/>
         </w:rPr>
-        <w:t xml:space="preserve"> : mouvements explicites </w:t>
+        <w:t xml:space="preserve">-base) accepte une requête texte libre (ex. « </w:t>
       </w:r>
       <w:proofErr w:type="spellStart"/>
       <w:r>
         <w:rPr>
           <w:lang w:val="fr-CA"/>
         </w:rPr>
-        <w:t>movej</w:t>
+        <w:t>cell</w:t>
       </w:r>
       <w:proofErr w:type="spellEnd"/>
       <w:r>
         <w:rPr>
           <w:lang w:val="fr-CA"/>
         </w:rPr>
-        <w:t xml:space="preserve"> (approche/retrait) et </w:t>
+        <w:t xml:space="preserve"> phone. »). Même projection 3D. Le prompt </w:t>
       </w:r>
       <w:proofErr w:type="spellStart"/>
       <w:r>
         <w:rPr>
           <w:lang w:val="fr-CA"/>
         </w:rPr>
-        <w:t>movel</w:t>
+        <w:t>OpenVLA</w:t>
       </w:r>
       <w:proofErr w:type="spellEnd"/>
       <w:r>
         <w:rPr>
           <w:lang w:val="fr-CA"/>
         </w:rPr>
-        <w:t xml:space="preserve"> (traits linéaires). Exemple : tracé de la lettre A (</w:t>
+        <w:t xml:space="preserve"> ne contient que </w:t>
       </w:r>
       <w:proofErr w:type="spellStart"/>
       <w:r>
         <w:rPr>
           <w:lang w:val="fr-CA"/>
         </w:rPr>
-        <w:t>URscriptLetterA.script</w:t>
+        <w:t>pick</w:t>
       </w:r>
       <w:proofErr w:type="spellEnd"/>
       <w:r>
         <w:rPr>
           <w:lang w:val="fr-CA"/>
         </w:rPr>
-        <w:t xml:space="preserve">, </w:t>
-      </w:r>
-      <w:proofErr w:type="spellStart"/>
-      <w:r>
-        <w:rPr>
-          <w:lang w:val="fr-CA"/>
-        </w:rPr>
-        <w:t>traceAOnce.script</w:t>
-      </w:r>
-      <w:proofErr w:type="spellEnd"/>
-      <w:r>
-        <w:rPr>
-          <w:lang w:val="fr-CA"/>
-        </w:rPr>
-        <w:t>).</w:t>
-      </w:r>
-    </w:p>
-    <w:p>
-      <w:pPr>
-        <w:pStyle w:val="Listepuces"/>
-        <w:rPr>
-          <w:lang w:val="fr-CA"/>
-        </w:rPr>
-      </w:pPr>
+        <w:t xml:space="preserve"> up the {label} — les XYZ restent pour le contrôleur robot.</w:t>
+      </w:r>
+    </w:p>
+    <w:p>
+      <w:r>
+        <w:rPr>
+          <w:lang w:val="fr-CA"/>
+        </w:rPr>
+        <w:lastRenderedPageBreak/>
+        <w:t>YOLOv8n détecte des objets COCO en 2D ; le centre (</w:t>
+      </w:r>
       <w:proofErr w:type="spellStart"/>
       <w:proofErr w:type="gramStart"/>
       <w:r>
         <w:rPr>
           <w:lang w:val="fr-CA"/>
         </w:rPr>
-        <w:t>ur</w:t>
-      </w:r>
+        <w:t>u,v</w:t>
+      </w:r>
+      <w:proofErr w:type="spellEnd"/>
       <w:proofErr w:type="gramEnd"/>
       <w:r>
         <w:rPr>
           <w:lang w:val="fr-CA"/>
         </w:rPr>
-        <w:t>-rtde</w:t>
+        <w:t xml:space="preserve">) est projeté dans le nuage </w:t>
+      </w:r>
+      <w:proofErr w:type="spellStart"/>
+      <w:r>
+        <w:rPr>
+          <w:lang w:val="fr-CA"/>
+        </w:rPr>
+        <w:t>Zivid</w:t>
       </w:r>
       <w:proofErr w:type="spellEnd"/>
       <w:r>
         <w:rPr>
           <w:lang w:val="fr-CA"/>
         </w:rPr>
-        <w:t xml:space="preserve"> (Python) : connexion RTDE pour lire l'état du robot et envoyer des commandes depuis l'environnement </w:t>
+        <w:t xml:space="preserve"> pour obtenir (</w:t>
+      </w:r>
+      <w:proofErr w:type="gramStart"/>
+      <w:r>
+        <w:rPr>
+          <w:lang w:val="fr-CA"/>
+        </w:rPr>
+        <w:t>X,Y</w:t>
+      </w:r>
+      <w:proofErr w:type="gramEnd"/>
+      <w:r>
+        <w:rPr>
+          <w:lang w:val="fr-CA"/>
+        </w:rPr>
+        <w:t xml:space="preserve">,Z). Le prompt </w:t>
       </w:r>
       <w:proofErr w:type="spellStart"/>
       <w:r>
         <w:rPr>
           <w:lang w:val="fr-CA"/>
         </w:rPr>
-        <w:t>env_integration</w:t>
+        <w:t>OpenVLA</w:t>
       </w:r>
       <w:proofErr w:type="spellEnd"/>
       <w:r>
         <w:rPr>
           <w:lang w:val="fr-CA"/>
         </w:rPr>
+        <w:t xml:space="preserve"> inclut le label et la position : </w:t>
+      </w:r>
+      <w:proofErr w:type="spellStart"/>
+      <w:r>
+        <w:rPr>
+          <w:lang w:val="fr-CA"/>
+        </w:rPr>
+        <w:t>pick</w:t>
+      </w:r>
+      <w:proofErr w:type="spellEnd"/>
+      <w:r>
+        <w:rPr>
+          <w:lang w:val="fr-CA"/>
+        </w:rPr>
+        <w:t xml:space="preserve"> up the {label} at position X=… Y=… </w:t>
+      </w:r>
+      <w:r>
+        <w:t>Z=…</w:t>
+      </w:r>
+    </w:p>
+    <w:p>
+      <w:pPr>
+        <w:pStyle w:val="Titre2"/>
+        <w:rPr>
+          <w:lang w:val="fr-CA"/>
+        </w:rPr>
+      </w:pPr>
+      <w:r>
+        <w:rPr>
+          <w:lang w:val="fr-CA"/>
+        </w:rPr>
+        <w:t xml:space="preserve">II.2 Inférence : </w:t>
+      </w:r>
+      <w:proofErr w:type="spellStart"/>
+      <w:r>
+        <w:rPr>
+          <w:lang w:val="fr-CA"/>
+        </w:rPr>
+        <w:t>OpenVLA</w:t>
+      </w:r>
+      <w:proofErr w:type="spellEnd"/>
+      <w:r>
+        <w:rPr>
+          <w:lang w:val="fr-CA"/>
+        </w:rPr>
+        <w:t xml:space="preserve"> (</w:t>
+      </w:r>
+      <w:proofErr w:type="spellStart"/>
+      <w:r>
+        <w:rPr>
+          <w:lang w:val="fr-CA"/>
+        </w:rPr>
+        <w:t>transformers</w:t>
+      </w:r>
+      <w:proofErr w:type="spellEnd"/>
+      <w:r>
+        <w:rPr>
+          <w:lang w:val="fr-CA"/>
+        </w:rPr>
+        <w:t>)</w:t>
+      </w:r>
+    </w:p>
+    <w:p>
+      <w:pPr>
+        <w:rPr>
+          <w:lang w:val="fr-CA"/>
+        </w:rPr>
+      </w:pPr>
+      <w:r>
+        <w:rPr>
+          <w:lang w:val="fr-CA"/>
+        </w:rPr>
+        <w:t xml:space="preserve">L'inférence utilise </w:t>
+      </w:r>
+      <w:proofErr w:type="spellStart"/>
+      <w:r>
+        <w:rPr>
+          <w:lang w:val="fr-CA"/>
+        </w:rPr>
+        <w:t>Hugging</w:t>
+      </w:r>
+      <w:proofErr w:type="spellEnd"/>
+      <w:r>
+        <w:rPr>
+          <w:lang w:val="fr-CA"/>
+        </w:rPr>
+        <w:t xml:space="preserve"> Face Transformers : </w:t>
+      </w:r>
+      <w:proofErr w:type="spellStart"/>
+      <w:r>
+        <w:rPr>
+          <w:lang w:val="fr-CA"/>
+        </w:rPr>
+        <w:t>AutoProcessor</w:t>
+      </w:r>
+      <w:proofErr w:type="spellEnd"/>
+      <w:r>
+        <w:rPr>
+          <w:lang w:val="fr-CA"/>
+        </w:rPr>
+        <w:t xml:space="preserve"> + AutoModelForVision2Seq. Le modèle est chargé en bfloat16 ou float16 sur cuda:0. La méthode </w:t>
+      </w:r>
+      <w:proofErr w:type="spellStart"/>
+      <w:r>
+        <w:rPr>
+          <w:lang w:val="fr-CA"/>
+        </w:rPr>
+        <w:t>predict_</w:t>
+      </w:r>
+      <w:proofErr w:type="gramStart"/>
+      <w:r>
+        <w:rPr>
+          <w:lang w:val="fr-CA"/>
+        </w:rPr>
+        <w:t>action</w:t>
+      </w:r>
+      <w:proofErr w:type="spellEnd"/>
+      <w:r>
+        <w:rPr>
+          <w:lang w:val="fr-CA"/>
+        </w:rPr>
+        <w:t>(</w:t>
+      </w:r>
+      <w:proofErr w:type="gramEnd"/>
+      <w:r>
+        <w:rPr>
+          <w:lang w:val="fr-CA"/>
+        </w:rPr>
+        <w:t xml:space="preserve">) produit une action normalisée, </w:t>
+      </w:r>
+      <w:proofErr w:type="spellStart"/>
+      <w:r>
+        <w:rPr>
+          <w:lang w:val="fr-CA"/>
+        </w:rPr>
+        <w:t>dé-normalisée</w:t>
+      </w:r>
+      <w:proofErr w:type="spellEnd"/>
+      <w:r>
+        <w:rPr>
+          <w:lang w:val="fr-CA"/>
+        </w:rPr>
+        <w:t xml:space="preserve"> avec la clé </w:t>
+      </w:r>
+      <w:proofErr w:type="spellStart"/>
+      <w:r>
+        <w:rPr>
+          <w:lang w:val="fr-CA"/>
+        </w:rPr>
+        <w:t>unnorm_key</w:t>
+      </w:r>
+      <w:proofErr w:type="spellEnd"/>
+      <w:r>
+        <w:rPr>
+          <w:lang w:val="fr-CA"/>
+        </w:rPr>
+        <w:t>="</w:t>
+      </w:r>
+      <w:proofErr w:type="spellStart"/>
+      <w:r>
+        <w:rPr>
+          <w:lang w:val="fr-CA"/>
+        </w:rPr>
+        <w:t>bridge_orig</w:t>
+      </w:r>
+      <w:proofErr w:type="spellEnd"/>
+      <w:r>
+        <w:rPr>
+          <w:lang w:val="fr-CA"/>
+        </w:rPr>
+        <w:t>".</w:t>
+      </w:r>
+    </w:p>
+    <w:p>
+      <w:pPr>
+        <w:pStyle w:val="Listepuces"/>
+      </w:pPr>
+      <w:proofErr w:type="gramStart"/>
+      <w:r>
+        <w:t>Packages :</w:t>
+      </w:r>
+      <w:proofErr w:type="gramEnd"/>
+      <w:r>
+        <w:t xml:space="preserve"> transformers, torch, Pillow, huggingface_hub, </w:t>
+      </w:r>
+      <w:proofErr w:type="gramStart"/>
+      <w:r>
+        <w:t>accelerate</w:t>
+      </w:r>
+      <w:proofErr w:type="gramEnd"/>
+      <w:r>
         <w:t>.</w:t>
       </w:r>
     </w:p>
     <w:p>
       <w:pPr>
-        <w:rPr>
-          <w:lang w:val="fr-CA"/>
-        </w:rPr>
-      </w:pPr>
-      <w:r>
-        <w:t>Schéma cible : Zivid → détection 2D (YOLO ou Grounding DINO) → coords 3D → prétraitement image + prompt → OpenVLA → action → UR (RTDE) → nouvelle capture.</w:t>
+        <w:pStyle w:val="Listepuces"/>
+      </w:pPr>
+      <w:r>
+        <w:t>Téléchargement : huggingface-cli download openvla/openvla-7b.</w:t>
+      </w:r>
+    </w:p>
+    <w:p>
+      <w:pPr>
+        <w:pStyle w:val="Listepuces"/>
+      </w:pPr>
+      <w:r>
+        <w:t>Test isolé : scripts/integration/test/test_openvla.py.</w:t>
+      </w:r>
+    </w:p>
+    <w:p>
+      <w:pPr>
+        <w:pStyle w:val="Listepuces"/>
+      </w:pPr>
+      <w:r>
+        <w:t>Test intégré : scripts/integration/test/test_zivid_openvla.py.</w:t>
       </w:r>
     </w:p>
     <w:p>
@@ -2818,124 +3021,644 @@
         <w:rPr>
           <w:lang w:val="fr-CA"/>
         </w:rPr>
-        <w:t xml:space="preserve">II.5 Flux de données robot, </w:t>
+        <w:t>II.3 Génération d'actions et format de sortie</w:t>
+      </w:r>
+    </w:p>
+    <w:p>
+      <w:pPr>
+        <w:rPr>
+          <w:lang w:val="fr-CA"/>
+        </w:rPr>
+      </w:pPr>
+      <w:r>
+        <w:rPr>
+          <w:lang w:val="fr-CA"/>
+        </w:rPr>
+        <w:t xml:space="preserve">Chaque prédiction </w:t>
       </w:r>
       <w:proofErr w:type="spellStart"/>
       <w:r>
         <w:rPr>
           <w:lang w:val="fr-CA"/>
         </w:rPr>
-        <w:t>Zivid</w:t>
+        <w:t>OpenVLA</w:t>
       </w:r>
       <w:proofErr w:type="spellEnd"/>
       <w:r>
         <w:rPr>
           <w:lang w:val="fr-CA"/>
         </w:rPr>
-        <w:t xml:space="preserve"> et interprétation </w:t>
+        <w:t xml:space="preserve"> retourne 7 valeurs :</w:t>
+      </w:r>
+    </w:p>
+    <w:p>
+      <w:pPr>
+        <w:pStyle w:val="Listepuces"/>
+        <w:rPr>
+          <w:lang w:val="fr-CA"/>
+        </w:rPr>
+      </w:pPr>
+      <w:proofErr w:type="gramStart"/>
+      <w:r>
+        <w:rPr>
+          <w:lang w:val="fr-CA"/>
+        </w:rPr>
+        <w:t>dx</w:t>
+      </w:r>
+      <w:proofErr w:type="gramEnd"/>
+      <w:r>
+        <w:rPr>
+          <w:lang w:val="fr-CA"/>
+        </w:rPr>
+        <w:t xml:space="preserve">, </w:t>
       </w:r>
       <w:proofErr w:type="spellStart"/>
       <w:r>
         <w:rPr>
           <w:lang w:val="fr-CA"/>
         </w:rPr>
-        <w:t>OpenVLA</w:t>
+        <w:t>dy</w:t>
       </w:r>
       <w:proofErr w:type="spellEnd"/>
       <w:r>
         <w:rPr>
           <w:lang w:val="fr-CA"/>
         </w:rPr>
-        <w:t xml:space="preserve"> (jour 07)</w:t>
-      </w:r>
-    </w:p>
-    <w:p>
-      <w:pPr>
-        <w:rPr>
-          <w:lang w:val="fr-CA"/>
-        </w:rPr>
-      </w:pPr>
-      <w:r>
-        <w:rPr>
-          <w:lang w:val="fr-CA"/>
-        </w:rPr>
-        <w:t xml:space="preserve">Clarification essentielle pour le démonstrateur CCNB-INNOV : </w:t>
-      </w:r>
-      <w:proofErr w:type="spellStart"/>
-      <w:r>
-        <w:rPr>
-          <w:lang w:val="fr-CA"/>
-        </w:rPr>
-        <w:t>OpenVLA</w:t>
-      </w:r>
-      <w:proofErr w:type="spellEnd"/>
-      <w:r>
-        <w:rPr>
-          <w:lang w:val="fr-CA"/>
-        </w:rPr>
-        <w:t xml:space="preserve"> reçoit une image RGB 224×224 </w:t>
-      </w:r>
-      <w:proofErr w:type="gramStart"/>
-      <w:r>
-        <w:rPr>
-          <w:lang w:val="fr-CA"/>
-        </w:rPr>
-        <w:t>issue</w:t>
-      </w:r>
-      <w:proofErr w:type="gramEnd"/>
-      <w:r>
-        <w:rPr>
-          <w:lang w:val="fr-CA"/>
-        </w:rPr>
-        <w:t xml:space="preserve"> de la </w:t>
-      </w:r>
-      <w:proofErr w:type="spellStart"/>
-      <w:r>
-        <w:rPr>
-          <w:lang w:val="fr-CA"/>
-        </w:rPr>
-        <w:t>Zivid</w:t>
-      </w:r>
-      <w:proofErr w:type="spellEnd"/>
-      <w:r>
-        <w:rPr>
-          <w:lang w:val="fr-CA"/>
-        </w:rPr>
-        <w:t xml:space="preserve"> et une consigne en langage naturel (prompt VLA). Il ne reçoit pas l'état articulaire ni la pose TCP du UR en entrée du réseau.</w:t>
-      </w:r>
-    </w:p>
-    <w:p>
-      <w:pPr>
-        <w:rPr>
-          <w:lang w:val="fr-CA"/>
-        </w:rPr>
-      </w:pPr>
-      <w:r>
-        <w:rPr>
-          <w:lang w:val="fr-CA"/>
-        </w:rPr>
-        <w:t xml:space="preserve">Le robot intervient après </w:t>
-      </w:r>
-      <w:proofErr w:type="spellStart"/>
-      <w:r>
-        <w:rPr>
-          <w:lang w:val="fr-CA"/>
-        </w:rPr>
-        <w:t>predict_action</w:t>
-      </w:r>
-      <w:proofErr w:type="spellEnd"/>
-      <w:r>
-        <w:rPr>
-          <w:lang w:val="fr-CA"/>
-        </w:rPr>
-        <w:t xml:space="preserve"> : RTDE lit </w:t>
-      </w:r>
+        <w:t>, dz — déplacement cartésien de l'effecteur.</w:t>
+      </w:r>
+    </w:p>
+    <w:p>
+      <w:pPr>
+        <w:pStyle w:val="Listepuces"/>
+        <w:rPr>
+          <w:lang w:val="fr-CA"/>
+        </w:rPr>
+      </w:pPr>
       <w:proofErr w:type="spellStart"/>
       <w:proofErr w:type="gramStart"/>
       <w:r>
         <w:rPr>
           <w:lang w:val="fr-CA"/>
         </w:rPr>
+        <w:t>rx</w:t>
+      </w:r>
+      <w:proofErr w:type="spellEnd"/>
+      <w:proofErr w:type="gramEnd"/>
+      <w:r>
+        <w:rPr>
+          <w:lang w:val="fr-CA"/>
+        </w:rPr>
+        <w:t xml:space="preserve">, </w:t>
+      </w:r>
+      <w:proofErr w:type="spellStart"/>
+      <w:r>
+        <w:rPr>
+          <w:lang w:val="fr-CA"/>
+        </w:rPr>
+        <w:t>ry</w:t>
+      </w:r>
+      <w:proofErr w:type="spellEnd"/>
+      <w:r>
+        <w:rPr>
+          <w:lang w:val="fr-CA"/>
+        </w:rPr>
+        <w:t xml:space="preserve">, </w:t>
+      </w:r>
+      <w:proofErr w:type="spellStart"/>
+      <w:r>
+        <w:rPr>
+          <w:lang w:val="fr-CA"/>
+        </w:rPr>
+        <w:t>rz</w:t>
+      </w:r>
+      <w:proofErr w:type="spellEnd"/>
+      <w:r>
+        <w:rPr>
+          <w:lang w:val="fr-CA"/>
+        </w:rPr>
+        <w:t xml:space="preserve"> — variation d'orientation.</w:t>
+      </w:r>
+    </w:p>
+    <w:p>
+      <w:pPr>
+        <w:pStyle w:val="Listepuces"/>
+        <w:rPr>
+          <w:lang w:val="fr-CA"/>
+        </w:rPr>
+      </w:pPr>
+      <w:proofErr w:type="gramStart"/>
+      <w:r>
+        <w:rPr>
+          <w:lang w:val="fr-CA"/>
+        </w:rPr>
+        <w:t>gripper</w:t>
+      </w:r>
+      <w:proofErr w:type="gramEnd"/>
+      <w:r>
+        <w:rPr>
+          <w:lang w:val="fr-CA"/>
+        </w:rPr>
+        <w:t xml:space="preserve"> — état de la pince (&lt; 0,5 : fermer ; ≥ 0,5 : ouvrir).</w:t>
+      </w:r>
+    </w:p>
+    <w:p>
+      <w:pPr>
+        <w:rPr>
+          <w:lang w:val="fr-CA"/>
+        </w:rPr>
+      </w:pPr>
+      <w:proofErr w:type="spellStart"/>
+      <w:r>
+        <w:t>Consignes</w:t>
+      </w:r>
+      <w:proofErr w:type="spellEnd"/>
+      <w:r>
+        <w:t xml:space="preserve"> </w:t>
+      </w:r>
+      <w:proofErr w:type="spellStart"/>
+      <w:r>
+        <w:t>testées</w:t>
+      </w:r>
+      <w:proofErr w:type="spellEnd"/>
+      <w:r>
+        <w:t xml:space="preserve"> au </w:t>
+      </w:r>
+      <w:proofErr w:type="gramStart"/>
+      <w:r>
+        <w:t>stage :</w:t>
+      </w:r>
+      <w:proofErr w:type="gramEnd"/>
+      <w:r>
+        <w:t xml:space="preserve"> « pick up the object on the </w:t>
+      </w:r>
+      <w:proofErr w:type="gramStart"/>
+      <w:r>
+        <w:t>table », «</w:t>
+      </w:r>
+      <w:proofErr w:type="gramEnd"/>
+      <w:r>
+        <w:t xml:space="preserve"> grab the red </w:t>
+      </w:r>
+      <w:proofErr w:type="gramStart"/>
+      <w:r>
+        <w:t>object », «</w:t>
+      </w:r>
+      <w:proofErr w:type="gramEnd"/>
+      <w:r>
+        <w:t xml:space="preserve"> push the object to the </w:t>
+      </w:r>
+      <w:proofErr w:type="gramStart"/>
+      <w:r>
+        <w:t>left », «</w:t>
+      </w:r>
+      <w:proofErr w:type="gramEnd"/>
+      <w:r>
+        <w:t xml:space="preserve"> place the object in the </w:t>
+      </w:r>
+      <w:proofErr w:type="gramStart"/>
+      <w:r>
+        <w:t>bin ».</w:t>
+      </w:r>
+      <w:proofErr w:type="gramEnd"/>
+      <w:r>
+        <w:t xml:space="preserve"> </w:t>
+      </w:r>
+      <w:r>
+        <w:rPr>
+          <w:lang w:val="fr-CA"/>
+        </w:rPr>
+        <w:t xml:space="preserve">L'action est un delta local : elle doit être convertie en commandes UR (RTDE ou </w:t>
+      </w:r>
+      <w:proofErr w:type="spellStart"/>
+      <w:r>
+        <w:rPr>
+          <w:lang w:val="fr-CA"/>
+        </w:rPr>
+        <w:t>URScript</w:t>
+      </w:r>
+      <w:proofErr w:type="spellEnd"/>
+      <w:r>
+        <w:rPr>
+          <w:lang w:val="fr-CA"/>
+        </w:rPr>
+        <w:t>) dans le script d'intégration final (zivid_ur_robot_integration.py).</w:t>
+      </w:r>
+    </w:p>
+    <w:p>
+      <w:pPr>
+        <w:pStyle w:val="Titre2"/>
+        <w:rPr>
+          <w:lang w:val="fr-CA"/>
+        </w:rPr>
+      </w:pPr>
+      <w:r>
+        <w:rPr>
+          <w:lang w:val="fr-CA"/>
+        </w:rPr>
+        <w:t>II.4 Exécution robotique : UR (</w:t>
+      </w:r>
+      <w:proofErr w:type="spellStart"/>
+      <w:r>
+        <w:rPr>
+          <w:lang w:val="fr-CA"/>
+        </w:rPr>
+        <w:t>URScript</w:t>
+      </w:r>
+      <w:proofErr w:type="spellEnd"/>
+      <w:r>
+        <w:rPr>
+          <w:lang w:val="fr-CA"/>
+        </w:rPr>
+        <w:t xml:space="preserve"> / </w:t>
+      </w:r>
+      <w:proofErr w:type="spellStart"/>
+      <w:r>
+        <w:rPr>
+          <w:lang w:val="fr-CA"/>
+        </w:rPr>
+        <w:t>ur-rtde</w:t>
+      </w:r>
+      <w:proofErr w:type="spellEnd"/>
+      <w:r>
+        <w:rPr>
+          <w:lang w:val="fr-CA"/>
+        </w:rPr>
+        <w:t>)</w:t>
+      </w:r>
+    </w:p>
+    <w:p>
+      <w:r>
+        <w:rPr>
+          <w:lang w:val="fr-CA"/>
+        </w:rPr>
+        <w:t xml:space="preserve">L'exécution repose sur un robot collaboratif Universal Robots. </w:t>
+      </w:r>
+      <w:r>
+        <w:t>Deux modes coexistent :</w:t>
+      </w:r>
+    </w:p>
+    <w:p>
+      <w:pPr>
+        <w:pStyle w:val="Listepuces"/>
+        <w:rPr>
+          <w:lang w:val="fr-CA"/>
+        </w:rPr>
+      </w:pPr>
+      <w:proofErr w:type="spellStart"/>
+      <w:r>
+        <w:rPr>
+          <w:lang w:val="fr-CA"/>
+        </w:rPr>
+        <w:t>URScript</w:t>
+      </w:r>
+      <w:proofErr w:type="spellEnd"/>
+      <w:r>
+        <w:rPr>
+          <w:lang w:val="fr-CA"/>
+        </w:rPr>
+        <w:t xml:space="preserve"> </w:t>
+      </w:r>
+      <w:proofErr w:type="gramStart"/>
+      <w:r>
+        <w:rPr>
+          <w:lang w:val="fr-CA"/>
+        </w:rPr>
+        <w:t>(.script</w:t>
+      </w:r>
+      <w:proofErr w:type="gramEnd"/>
+      <w:r>
+        <w:rPr>
+          <w:lang w:val="fr-CA"/>
+        </w:rPr>
+        <w:t xml:space="preserve">) sur </w:t>
+      </w:r>
+      <w:proofErr w:type="spellStart"/>
+      <w:r>
+        <w:rPr>
+          <w:lang w:val="fr-CA"/>
+        </w:rPr>
+        <w:t>PolyScope</w:t>
+      </w:r>
+      <w:proofErr w:type="spellEnd"/>
+      <w:r>
+        <w:rPr>
+          <w:lang w:val="fr-CA"/>
+        </w:rPr>
+        <w:t xml:space="preserve"> : mouvements explicites </w:t>
+      </w:r>
+      <w:proofErr w:type="spellStart"/>
+      <w:r>
+        <w:rPr>
+          <w:lang w:val="fr-CA"/>
+        </w:rPr>
+        <w:t>movej</w:t>
+      </w:r>
+      <w:proofErr w:type="spellEnd"/>
+      <w:r>
+        <w:rPr>
+          <w:lang w:val="fr-CA"/>
+        </w:rPr>
+        <w:t xml:space="preserve"> (approche/retrait) et </w:t>
+      </w:r>
+      <w:proofErr w:type="spellStart"/>
+      <w:r>
+        <w:rPr>
+          <w:lang w:val="fr-CA"/>
+        </w:rPr>
+        <w:t>movel</w:t>
+      </w:r>
+      <w:proofErr w:type="spellEnd"/>
+      <w:r>
+        <w:rPr>
+          <w:lang w:val="fr-CA"/>
+        </w:rPr>
+        <w:t xml:space="preserve"> (traits linéaires). Exemple : tracé de la lettre A (</w:t>
+      </w:r>
+      <w:proofErr w:type="spellStart"/>
+      <w:r>
+        <w:rPr>
+          <w:lang w:val="fr-CA"/>
+        </w:rPr>
+        <w:t>URscriptLetterA.script</w:t>
+      </w:r>
+      <w:proofErr w:type="spellEnd"/>
+      <w:r>
+        <w:rPr>
+          <w:lang w:val="fr-CA"/>
+        </w:rPr>
+        <w:t xml:space="preserve">, </w:t>
+      </w:r>
+      <w:proofErr w:type="spellStart"/>
+      <w:r>
+        <w:rPr>
+          <w:lang w:val="fr-CA"/>
+        </w:rPr>
+        <w:t>traceAOnce.script</w:t>
+      </w:r>
+      <w:proofErr w:type="spellEnd"/>
+      <w:r>
+        <w:rPr>
+          <w:lang w:val="fr-CA"/>
+        </w:rPr>
+        <w:t>).</w:t>
+      </w:r>
+    </w:p>
+    <w:p>
+      <w:pPr>
+        <w:pStyle w:val="Listepuces"/>
+        <w:rPr>
+          <w:lang w:val="fr-CA"/>
+        </w:rPr>
+      </w:pPr>
+      <w:proofErr w:type="spellStart"/>
+      <w:proofErr w:type="gramStart"/>
+      <w:r>
+        <w:rPr>
+          <w:lang w:val="fr-CA"/>
+        </w:rPr>
+        <w:t>ur</w:t>
+      </w:r>
+      <w:proofErr w:type="gramEnd"/>
+      <w:r>
+        <w:rPr>
+          <w:lang w:val="fr-CA"/>
+        </w:rPr>
+        <w:t>-rtde</w:t>
+      </w:r>
+      <w:proofErr w:type="spellEnd"/>
+      <w:r>
+        <w:rPr>
+          <w:lang w:val="fr-CA"/>
+        </w:rPr>
+        <w:t xml:space="preserve"> (Python) : connexion RTDE pour lire l'état du robot et envoyer des commandes depuis l'environnement </w:t>
+      </w:r>
+      <w:proofErr w:type="spellStart"/>
+      <w:r>
+        <w:rPr>
+          <w:lang w:val="fr-CA"/>
+        </w:rPr>
+        <w:t>env_integration</w:t>
+      </w:r>
+      <w:proofErr w:type="spellEnd"/>
+      <w:r>
+        <w:rPr>
+          <w:lang w:val="fr-CA"/>
+        </w:rPr>
+        <w:t>.</w:t>
+      </w:r>
+    </w:p>
+    <w:p>
+      <w:pPr>
+        <w:rPr>
+          <w:lang w:val="fr-CA"/>
+        </w:rPr>
+      </w:pPr>
+      <w:r>
+        <w:rPr>
+          <w:lang w:val="fr-CA"/>
+        </w:rPr>
+        <w:t xml:space="preserve">Schéma cible : </w:t>
+      </w:r>
+      <w:proofErr w:type="spellStart"/>
+      <w:r>
+        <w:rPr>
+          <w:lang w:val="fr-CA"/>
+        </w:rPr>
+        <w:t>Zivid</w:t>
+      </w:r>
+      <w:proofErr w:type="spellEnd"/>
+      <w:r>
+        <w:rPr>
+          <w:lang w:val="fr-CA"/>
+        </w:rPr>
+        <w:t xml:space="preserve"> → détection 2D (YOLO ou </w:t>
+      </w:r>
+      <w:proofErr w:type="spellStart"/>
+      <w:r>
+        <w:rPr>
+          <w:lang w:val="fr-CA"/>
+        </w:rPr>
+        <w:t>Grounding</w:t>
+      </w:r>
+      <w:proofErr w:type="spellEnd"/>
+      <w:r>
+        <w:rPr>
+          <w:lang w:val="fr-CA"/>
+        </w:rPr>
+        <w:t xml:space="preserve"> DINO) → </w:t>
+      </w:r>
+      <w:proofErr w:type="spellStart"/>
+      <w:r>
+        <w:rPr>
+          <w:lang w:val="fr-CA"/>
+        </w:rPr>
+        <w:t>coords</w:t>
+      </w:r>
+      <w:proofErr w:type="spellEnd"/>
+      <w:r>
+        <w:rPr>
+          <w:lang w:val="fr-CA"/>
+        </w:rPr>
+        <w:t xml:space="preserve"> 3D → prétraitement image + prompt → </w:t>
+      </w:r>
+      <w:proofErr w:type="spellStart"/>
+      <w:r>
+        <w:rPr>
+          <w:lang w:val="fr-CA"/>
+        </w:rPr>
+        <w:t>OpenVLA</w:t>
+      </w:r>
+      <w:proofErr w:type="spellEnd"/>
+      <w:r>
+        <w:rPr>
+          <w:lang w:val="fr-CA"/>
+        </w:rPr>
+        <w:t xml:space="preserve"> → action → UR (RTDE) → nouvelle capture.</w:t>
+      </w:r>
+    </w:p>
+    <w:p>
+      <w:pPr>
+        <w:pStyle w:val="Titre2"/>
+        <w:rPr>
+          <w:lang w:val="fr-CA"/>
+        </w:rPr>
+      </w:pPr>
+      <w:r>
+        <w:rPr>
+          <w:lang w:val="fr-CA"/>
+        </w:rPr>
+        <w:t xml:space="preserve">II.5 Flux de données robot, </w:t>
+      </w:r>
+      <w:proofErr w:type="spellStart"/>
+      <w:r>
+        <w:rPr>
+          <w:lang w:val="fr-CA"/>
+        </w:rPr>
+        <w:t>Zivid</w:t>
+      </w:r>
+      <w:proofErr w:type="spellEnd"/>
+      <w:r>
+        <w:rPr>
+          <w:lang w:val="fr-CA"/>
+        </w:rPr>
+        <w:t xml:space="preserve"> et interprétation </w:t>
+      </w:r>
+      <w:proofErr w:type="spellStart"/>
+      <w:r>
+        <w:rPr>
+          <w:lang w:val="fr-CA"/>
+        </w:rPr>
+        <w:t>OpenVLA</w:t>
+      </w:r>
+      <w:proofErr w:type="spellEnd"/>
+      <w:r>
+        <w:rPr>
+          <w:lang w:val="fr-CA"/>
+        </w:rPr>
+        <w:t xml:space="preserve"> (jour 07)</w:t>
+      </w:r>
+    </w:p>
+    <w:p>
+      <w:pPr>
+        <w:pStyle w:val="Titre3"/>
+      </w:pPr>
+      <w:r>
+        <w:t>Jour 09 : rapport d'expérimentation et interprétation des résultats de la boucle continue.</w:t>
+      </w:r>
+    </w:p>
+    <w:p>
+      <w:pPr/>
+      <w:r>
+        <w:t>Scripts : demo_adaptatif_openvla_print_value.py, demo_adaptatif_openvla.py. Metrics recommandées : distance euclidienne, itérations jusqu'à convergence, évolution Z.</w:t>
+      </w:r>
+    </w:p>
+    <w:p>
+      <w:pPr>
+        <w:rPr>
+          <w:lang w:val="fr-CA"/>
+        </w:rPr>
+      </w:pPr>
+      <w:r>
+        <w:rPr>
+          <w:lang w:val="fr-CA"/>
+        </w:rPr>
+        <w:t xml:space="preserve">Clarification essentielle pour le démonstrateur CCNB-INNOV : </w:t>
+      </w:r>
+      <w:proofErr w:type="spellStart"/>
+      <w:r>
+        <w:rPr>
+          <w:lang w:val="fr-CA"/>
+        </w:rPr>
+        <w:t>OpenVLA</w:t>
+      </w:r>
+      <w:proofErr w:type="spellEnd"/>
+      <w:r>
+        <w:rPr>
+          <w:lang w:val="fr-CA"/>
+        </w:rPr>
+        <w:t xml:space="preserve"> reçoit une image RGB 224×224 </w:t>
+      </w:r>
+      <w:proofErr w:type="gramStart"/>
+      <w:r>
+        <w:rPr>
+          <w:lang w:val="fr-CA"/>
+        </w:rPr>
+        <w:t>issue</w:t>
+      </w:r>
+      <w:proofErr w:type="gramEnd"/>
+      <w:r>
+        <w:rPr>
+          <w:lang w:val="fr-CA"/>
+        </w:rPr>
+        <w:t xml:space="preserve"> de la </w:t>
+      </w:r>
+      <w:proofErr w:type="spellStart"/>
+      <w:r>
+        <w:rPr>
+          <w:lang w:val="fr-CA"/>
+        </w:rPr>
+        <w:t>Zivid</w:t>
+      </w:r>
+      <w:proofErr w:type="spellEnd"/>
+      <w:r>
+        <w:rPr>
+          <w:lang w:val="fr-CA"/>
+        </w:rPr>
+        <w:t xml:space="preserve"> et une consigne en langage naturel (prompt VLA). Il ne reçoit pas l'état articulaire ni la pose TCP du UR en entrée du réseau.</w:t>
+      </w:r>
+    </w:p>
+    <w:p>
+      <w:pPr>
+        <w:rPr>
+          <w:lang w:val="fr-CA"/>
+        </w:rPr>
+      </w:pPr>
+      <w:r>
+        <w:rPr>
+          <w:lang w:val="fr-CA"/>
+        </w:rPr>
+        <w:t xml:space="preserve">Le robot intervient après </w:t>
+      </w:r>
+      <w:proofErr w:type="spellStart"/>
+      <w:r>
+        <w:rPr>
+          <w:lang w:val="fr-CA"/>
+        </w:rPr>
+        <w:t>predict_action</w:t>
+      </w:r>
+      <w:proofErr w:type="spellEnd"/>
+      <w:r>
+        <w:rPr>
+          <w:lang w:val="fr-CA"/>
+        </w:rPr>
+        <w:t xml:space="preserve"> : RTDE lit </w:t>
+      </w:r>
+      <w:proofErr w:type="spellStart"/>
+      <w:proofErr w:type="gramStart"/>
+      <w:r>
+        <w:rPr>
+          <w:lang w:val="fr-CA"/>
+        </w:rPr>
         <w:t>getActualTCPPose</w:t>
       </w:r>
       <w:proofErr w:type="spellEnd"/>
@@ -2992,7 +3715,14 @@
         <w:rPr>
           <w:lang w:val="fr-CA"/>
         </w:rPr>
-        <w:t xml:space="preserve"> ainsi que la commande pince (</w:t>
+        <w:t xml:space="preserve"> ainsi que la </w:t>
+      </w:r>
+      <w:r>
+        <w:rPr>
+          <w:lang w:val="fr-CA"/>
+        </w:rPr>
+        <w:lastRenderedPageBreak/>
+        <w:t>commande pince (</w:t>
       </w:r>
       <w:proofErr w:type="spellStart"/>
       <w:r>
@@ -3031,35 +3761,169 @@
         </w:rPr>
       </w:pPr>
       <w:r>
-        <w:t>Entrées modèle : image RGB 224×224 (Zivid) + consigne texte ; jour 07 — variante YOLO (label + XYZ dans le prompt) ; Grounding DINO (label seul ou label + XYZ projetés).</w:t>
+        <w:rPr>
+          <w:lang w:val="fr-CA"/>
+        </w:rPr>
+        <w:t>Entrées modèle : image RGB 224×224 (</w:t>
+      </w:r>
+      <w:proofErr w:type="spellStart"/>
+      <w:r>
+        <w:rPr>
+          <w:lang w:val="fr-CA"/>
+        </w:rPr>
+        <w:t>Zivid</w:t>
+      </w:r>
+      <w:proofErr w:type="spellEnd"/>
+      <w:r>
+        <w:rPr>
+          <w:lang w:val="fr-CA"/>
+        </w:rPr>
+        <w:t xml:space="preserve">) + consigne texte ; jour 07 — variante YOLO (label + XYZ dans le prompt) ; </w:t>
+      </w:r>
+      <w:proofErr w:type="spellStart"/>
+      <w:r>
+        <w:rPr>
+          <w:lang w:val="fr-CA"/>
+        </w:rPr>
+        <w:t>Grounding</w:t>
+      </w:r>
+      <w:proofErr w:type="spellEnd"/>
+      <w:r>
+        <w:rPr>
+          <w:lang w:val="fr-CA"/>
+        </w:rPr>
+        <w:t xml:space="preserve"> DINO (label seul ou label + XYZ projetés).</w:t>
       </w:r>
     </w:p>
     <w:p>
       <w:pPr>
         <w:pStyle w:val="Titre3"/>
-      </w:pPr>
-      <w:r>
-        <w:t>Jour 08 — boucle continue perception → action → réinférence</w:t>
-      </w:r>
-    </w:p>
-    <w:p>
-      <w:pPr/>
-      <w:r>
-        <w:t>Jour 08 : test d'une boucle continue perception → action → réinférence pour rendre le comportement plus adaptatif (correction itérative à chaque nouvelle observation).</w:t>
-      </w:r>
-    </w:p>
-    <w:p>
-      <w:pPr/>
-      <w:r>
-        <w:t>Option d'efficacité : injecter dans l'instruction OpenVLA les coordonnées (X,Y,Z) projetées issues de Grounding DINO + nuage Zivid (en plus du label), comme la variante YOLO.</w:t>
+        <w:rPr>
+          <w:lang w:val="fr-CA"/>
+        </w:rPr>
+      </w:pPr>
+      <w:r>
+        <w:rPr>
+          <w:lang w:val="fr-CA"/>
+        </w:rPr>
+        <w:t xml:space="preserve">Jour 08 — boucle continue perception → action → </w:t>
+      </w:r>
+      <w:proofErr w:type="spellStart"/>
+      <w:r>
+        <w:rPr>
+          <w:lang w:val="fr-CA"/>
+        </w:rPr>
+        <w:t>réinférence</w:t>
+      </w:r>
+      <w:proofErr w:type="spellEnd"/>
+    </w:p>
+    <w:p>
+      <w:pPr>
+        <w:rPr>
+          <w:lang w:val="fr-CA"/>
+        </w:rPr>
+      </w:pPr>
+      <w:r>
+        <w:rPr>
+          <w:lang w:val="fr-CA"/>
+        </w:rPr>
+        <w:t xml:space="preserve">Jour 08 : test d'une boucle continue perception → action → </w:t>
+      </w:r>
+      <w:proofErr w:type="spellStart"/>
+      <w:r>
+        <w:rPr>
+          <w:lang w:val="fr-CA"/>
+        </w:rPr>
+        <w:t>réinférence</w:t>
+      </w:r>
+      <w:proofErr w:type="spellEnd"/>
+      <w:r>
+        <w:rPr>
+          <w:lang w:val="fr-CA"/>
+        </w:rPr>
+        <w:t xml:space="preserve"> pour rendre le comportement plus adaptatif (correction itérative à chaque nouvelle observation).</w:t>
+      </w:r>
+    </w:p>
+    <w:p>
+      <w:pPr>
+        <w:rPr>
+          <w:lang w:val="fr-CA"/>
+        </w:rPr>
+      </w:pPr>
+      <w:r>
+        <w:rPr>
+          <w:lang w:val="fr-CA"/>
+        </w:rPr>
+        <w:t xml:space="preserve">Option d'efficacité : injecter dans l'instruction </w:t>
+      </w:r>
+      <w:proofErr w:type="spellStart"/>
+      <w:r>
+        <w:rPr>
+          <w:lang w:val="fr-CA"/>
+        </w:rPr>
+        <w:t>OpenVLA</w:t>
+      </w:r>
+      <w:proofErr w:type="spellEnd"/>
+      <w:r>
+        <w:rPr>
+          <w:lang w:val="fr-CA"/>
+        </w:rPr>
+        <w:t xml:space="preserve"> les coordonnées (</w:t>
+      </w:r>
+      <w:proofErr w:type="gramStart"/>
+      <w:r>
+        <w:rPr>
+          <w:lang w:val="fr-CA"/>
+        </w:rPr>
+        <w:t>X,Y</w:t>
+      </w:r>
+      <w:proofErr w:type="gramEnd"/>
+      <w:r>
+        <w:rPr>
+          <w:lang w:val="fr-CA"/>
+        </w:rPr>
+        <w:t xml:space="preserve">,Z) projetées issues de </w:t>
+      </w:r>
+      <w:proofErr w:type="spellStart"/>
+      <w:r>
+        <w:rPr>
+          <w:lang w:val="fr-CA"/>
+        </w:rPr>
+        <w:t>Grounding</w:t>
+      </w:r>
+      <w:proofErr w:type="spellEnd"/>
+      <w:r>
+        <w:rPr>
+          <w:lang w:val="fr-CA"/>
+        </w:rPr>
+        <w:t xml:space="preserve"> DINO + nuage </w:t>
+      </w:r>
+      <w:proofErr w:type="spellStart"/>
+      <w:r>
+        <w:rPr>
+          <w:lang w:val="fr-CA"/>
+        </w:rPr>
+        <w:t>Zivid</w:t>
+      </w:r>
+      <w:proofErr w:type="spellEnd"/>
+      <w:r>
+        <w:rPr>
+          <w:lang w:val="fr-CA"/>
+        </w:rPr>
+        <w:t xml:space="preserve"> (en plus du label), comme la variante YOLO.</w:t>
       </w:r>
     </w:p>
     <w:p>
       <w:pPr>
         <w:pStyle w:val="Listepuces"/>
       </w:pPr>
-      <w:r>
-        <w:t>Scripts : demo_adaptatif_openvla.py, demo_adaptatif_openvla_print_value.py.</w:t>
+      <w:proofErr w:type="gramStart"/>
+      <w:r>
+        <w:t>Scripts :</w:t>
+      </w:r>
+      <w:proofErr w:type="gramEnd"/>
+      <w:r>
+        <w:t xml:space="preserve"> demo_adaptatif_openvla.py, demo_adaptatif_openvla_print_value.py.</w:t>
       </w:r>
     </w:p>
     <w:p>
@@ -3218,65 +4082,106 @@
     <w:p>
       <w:pPr>
         <w:pStyle w:val="Titre2"/>
-      </w:pPr>
-      <w:r>
-        <w:t xml:space="preserve">III.1 </w:t>
-      </w:r>
+        <w:rPr>
+          <w:lang w:val="fr-CA"/>
+        </w:rPr>
+      </w:pPr>
+      <w:r>
+        <w:rPr>
+          <w:lang w:val="fr-CA"/>
+        </w:rPr>
+        <w:t>III.1 Programmation de tâches</w:t>
+      </w:r>
+    </w:p>
+    <w:p>
+      <w:pPr>
+        <w:rPr>
+          <w:lang w:val="fr-CA"/>
+        </w:rPr>
+      </w:pPr>
       <w:proofErr w:type="spellStart"/>
       <w:r>
-        <w:t>Programmation</w:t>
+        <w:rPr>
+          <w:lang w:val="fr-CA"/>
+        </w:rPr>
+        <w:t>OpenVLA</w:t>
       </w:r>
       <w:proofErr w:type="spellEnd"/>
       <w:r>
-        <w:t xml:space="preserve"> de </w:t>
+        <w:rPr>
+          <w:lang w:val="fr-CA"/>
+        </w:rPr>
+        <w:t xml:space="preserve"> peut aider le robot à : mieux comprendre la scène ; mieux choisir l'action ; mieux adapter le mouvement.</w:t>
+      </w:r>
+    </w:p>
+    <w:p>
+      <w:pPr>
+        <w:pStyle w:val="Titre3"/>
+        <w:rPr>
+          <w:lang w:val="fr-CA"/>
+        </w:rPr>
+      </w:pPr>
+      <w:r>
+        <w:rPr>
+          <w:lang w:val="fr-CA"/>
+        </w:rPr>
+        <w:t>III.1 — Robotique classique seule</w:t>
+      </w:r>
+    </w:p>
+    <w:p>
+      <w:pPr>
+        <w:rPr>
+          <w:lang w:val="fr-CA"/>
+        </w:rPr>
+      </w:pPr>
+      <w:r>
+        <w:rPr>
+          <w:lang w:val="fr-CA"/>
+        </w:rPr>
+        <w:t>En robotique classique seule, le robot peut aller précisément au XYZ. Mais il ne comprend pas forcément quoi prendre, dans quel ordre, ni comment s'adapter au contexte.</w:t>
+      </w:r>
+    </w:p>
+    <w:p>
+      <w:pPr>
+        <w:pStyle w:val="Titre3"/>
+      </w:pPr>
+      <w:r>
+        <w:t xml:space="preserve">III.1 — Ce </w:t>
       </w:r>
       <w:proofErr w:type="spellStart"/>
       <w:r>
-        <w:t>tâches</w:t>
+        <w:t>qu'OpenVLA</w:t>
       </w:r>
       <w:proofErr w:type="spellEnd"/>
-    </w:p>
-    <w:p>
-      <w:pPr/>
-      <w:r>
-        <w:t>OpenVLA peut aider le robot à : mieux comprendre la scène ; mieux choisir l'action ; mieux adapter le mouvement.</w:t>
-      </w:r>
-    </w:p>
-    <w:p>
-      <w:pPr>
-        <w:pStyle w:val="Titre3"/>
-      </w:pPr>
-      <w:r>
-        <w:t>III.1 — Robotique classique seule</w:t>
-      </w:r>
-    </w:p>
-    <w:p>
-      <w:pPr/>
-      <w:r>
-        <w:t>En robotique classique seule, le robot peut aller précisément au XYZ. Mais il ne comprend pas forcément quoi prendre, dans quel ordre, ni comment s'adapter au contexte.</w:t>
-      </w:r>
-    </w:p>
-    <w:p>
-      <w:pPr>
-        <w:pStyle w:val="Titre3"/>
-      </w:pPr>
-      <w:r>
-        <w:t>III.1 — Ce qu'OpenVLA ajoute</w:t>
+      <w:r>
+        <w:t xml:space="preserve"> ajoute</w:t>
       </w:r>
     </w:p>
     <w:p>
       <w:pPr>
         <w:pStyle w:val="Listepuces"/>
-      </w:pPr>
-      <w:r>
+        <w:rPr>
+          <w:lang w:val="fr-CA"/>
+        </w:rPr>
+      </w:pPr>
+      <w:r>
+        <w:rPr>
+          <w:lang w:val="fr-CA"/>
+        </w:rPr>
         <w:t>Compréhension du langage (consignes en langage naturel).</w:t>
       </w:r>
     </w:p>
     <w:p>
       <w:pPr>
         <w:pStyle w:val="Listepuces"/>
-      </w:pPr>
-      <w:r>
+        <w:rPr>
+          <w:lang w:val="fr-CA"/>
+        </w:rPr>
+      </w:pPr>
+      <w:r>
+        <w:rPr>
+          <w:lang w:val="fr-CA"/>
+        </w:rPr>
         <w:t>Stratégie et planification implicite dans le modèle VLA.</w:t>
       </w:r>
     </w:p>
@@ -3285,19 +4190,77 @@
         <w:pStyle w:val="Listepuces"/>
       </w:pPr>
       <w:r>
-        <w:t>Adaptation et comportement contextuel.</w:t>
-      </w:r>
-    </w:p>
-    <w:p>
-      <w:pPr/>
-      <w:r>
+        <w:t xml:space="preserve">Adaptation et </w:t>
+      </w:r>
+      <w:proofErr w:type="spellStart"/>
+      <w:r>
+        <w:t>comportement</w:t>
+      </w:r>
+      <w:proofErr w:type="spellEnd"/>
+      <w:r>
+        <w:t xml:space="preserve"> </w:t>
+      </w:r>
+      <w:proofErr w:type="spellStart"/>
+      <w:r>
+        <w:t>contextuel</w:t>
+      </w:r>
+      <w:proofErr w:type="spellEnd"/>
+      <w:r>
+        <w:t>.</w:t>
+      </w:r>
+    </w:p>
+    <w:p>
+      <w:pPr>
+        <w:rPr>
+          <w:lang w:val="fr-CA"/>
+        </w:rPr>
+      </w:pPr>
+      <w:r>
+        <w:rPr>
+          <w:lang w:val="fr-CA"/>
+        </w:rPr>
         <w:t>Exemples de consignes que le classique peine à interpréter seul : « la tasse est derrière un obstacle » ; « ouvrir le tiroir avant ».</w:t>
       </w:r>
     </w:p>
     <w:p>
-      <w:pPr/>
-      <w:r>
-        <w:t>Le démonstrateur du stage reste hybride : RTDE/URScript pour l'exécution prévisible, OpenVLA pour la décision image + langage → action.</w:t>
+      <w:pPr>
+        <w:rPr>
+          <w:lang w:val="fr-CA"/>
+        </w:rPr>
+      </w:pPr>
+      <w:r>
+        <w:rPr>
+          <w:lang w:val="fr-CA"/>
+        </w:rPr>
+        <w:t>Le démonstrateur du stage reste hybride : RTDE/</w:t>
+      </w:r>
+      <w:proofErr w:type="spellStart"/>
+      <w:r>
+        <w:rPr>
+          <w:lang w:val="fr-CA"/>
+        </w:rPr>
+        <w:t>URScript</w:t>
+      </w:r>
+      <w:proofErr w:type="spellEnd"/>
+      <w:r>
+        <w:rPr>
+          <w:lang w:val="fr-CA"/>
+        </w:rPr>
+        <w:t xml:space="preserve"> pour l'exécution prévisible, </w:t>
+      </w:r>
+      <w:proofErr w:type="spellStart"/>
+      <w:r>
+        <w:rPr>
+          <w:lang w:val="fr-CA"/>
+        </w:rPr>
+        <w:t>OpenVLA</w:t>
+      </w:r>
+      <w:proofErr w:type="spellEnd"/>
+      <w:r>
+        <w:rPr>
+          <w:lang w:val="fr-CA"/>
+        </w:rPr>
+        <w:t xml:space="preserve"> pour la décision image + langage → action.</w:t>
       </w:r>
     </w:p>
     <w:tbl>
@@ -3317,9 +4280,11 @@
             <w:tcW w:w="2880" w:type="dxa"/>
           </w:tcPr>
           <w:p>
+            <w:proofErr w:type="spellStart"/>
             <w:r>
               <w:t>Critère</w:t>
             </w:r>
+            <w:proofErr w:type="spellEnd"/>
           </w:p>
         </w:tc>
         <w:tc>
@@ -3525,15 +4490,37 @@
       </w:r>
     </w:p>
     <w:p>
-      <w:pPr/>
-      <w:r>
+      <w:pPr>
+        <w:rPr>
+          <w:lang w:val="fr-CA"/>
+        </w:rPr>
+      </w:pPr>
+      <w:r>
+        <w:rPr>
+          <w:lang w:val="fr-CA"/>
+        </w:rPr>
         <w:t>Robot classique — il sait où est la cible (ex. où est la balle), mais il peut heurter l'obstacle, ne pas comprendre la scène dans son ensemble, ou échouer si la trajectoire change.</w:t>
       </w:r>
     </w:p>
     <w:p>
-      <w:pPr/>
-      <w:r>
-        <w:t>OpenVLA peut comprendre une consigne du type « il y a un obstacle » et orienter la décision : contourner, déplacer un objet, changer l'approche, réessayer autrement.</w:t>
+      <w:pPr>
+        <w:rPr>
+          <w:lang w:val="fr-CA"/>
+        </w:rPr>
+      </w:pPr>
+      <w:proofErr w:type="spellStart"/>
+      <w:r>
+        <w:rPr>
+          <w:lang w:val="fr-CA"/>
+        </w:rPr>
+        <w:t>OpenVLA</w:t>
+      </w:r>
+      <w:proofErr w:type="spellEnd"/>
+      <w:r>
+        <w:rPr>
+          <w:lang w:val="fr-CA"/>
+        </w:rPr>
+        <w:t xml:space="preserve"> peut comprendre une consigne du type « il y a un obstacle » et orienter la décision : contourner, déplacer un objet, changer l'approche, réessayer autrement.</w:t>
       </w:r>
     </w:p>
     <w:p>
@@ -3594,7 +4581,63 @@
         </w:rPr>
       </w:pPr>
       <w:r>
-        <w:t>Stage : Zivid fournit 2D et 3D ; OpenVLA consomme le RGB 224×224. YOLOv8n (classes COCO) ou Grounding DINO (texte libre) relient détection 2D au nuage de points (Figure 2). Voir comparaison jour 07.</w:t>
+        <w:rPr>
+          <w:lang w:val="fr-CA"/>
+        </w:rPr>
+        <w:t xml:space="preserve">Stage : </w:t>
+      </w:r>
+      <w:proofErr w:type="spellStart"/>
+      <w:r>
+        <w:rPr>
+          <w:lang w:val="fr-CA"/>
+        </w:rPr>
+        <w:t>Zivid</w:t>
+      </w:r>
+      <w:proofErr w:type="spellEnd"/>
+      <w:r>
+        <w:rPr>
+          <w:lang w:val="fr-CA"/>
+        </w:rPr>
+        <w:t xml:space="preserve"> fournit 2D et 3D ; </w:t>
+      </w:r>
+      <w:proofErr w:type="spellStart"/>
+      <w:r>
+        <w:rPr>
+          <w:lang w:val="fr-CA"/>
+        </w:rPr>
+        <w:t>OpenVLA</w:t>
+      </w:r>
+      <w:proofErr w:type="spellEnd"/>
+      <w:r>
+        <w:rPr>
+          <w:lang w:val="fr-CA"/>
+        </w:rPr>
+        <w:t xml:space="preserve"> consomme le RGB 224×224. YOLOv8n (classes COCO) ou </w:t>
+      </w:r>
+      <w:proofErr w:type="spellStart"/>
+      <w:r>
+        <w:rPr>
+          <w:lang w:val="fr-CA"/>
+        </w:rPr>
+        <w:t>Grounding</w:t>
+      </w:r>
+      <w:proofErr w:type="spellEnd"/>
+      <w:r>
+        <w:rPr>
+          <w:lang w:val="fr-CA"/>
+        </w:rPr>
+        <w:t xml:space="preserve"> DINO (texte libre) relient détection 2D au nuage de points (Figure 2). </w:t>
+      </w:r>
+      <w:r>
+        <w:t xml:space="preserve">Voir </w:t>
+      </w:r>
+      <w:proofErr w:type="spellStart"/>
+      <w:r>
+        <w:t>comparaison</w:t>
+      </w:r>
+      <w:proofErr w:type="spellEnd"/>
+      <w:r>
+        <w:t xml:space="preserve"> jour 07.</w:t>
       </w:r>
     </w:p>
     <w:p>
@@ -3602,6 +4645,7 @@
         <w:pStyle w:val="Titre2"/>
       </w:pPr>
       <w:r>
+        <w:lastRenderedPageBreak/>
         <w:t xml:space="preserve">III.3 Planification, </w:t>
       </w:r>
       <w:proofErr w:type="spellStart"/>
@@ -3610,11 +4654,15 @@
       </w:r>
       <w:proofErr w:type="spellEnd"/>
       <w:r>
-        <w:t xml:space="preserve"> et intégration</w:t>
-      </w:r>
-    </w:p>
-    <w:p>
-      <w:pPr/>
+        <w:t xml:space="preserve"> et </w:t>
+      </w:r>
+      <w:proofErr w:type="spellStart"/>
+      <w:r>
+        <w:t>intégration</w:t>
+      </w:r>
+      <w:proofErr w:type="spellEnd"/>
+    </w:p>
+    <w:p>
       <w:r>
         <w:t>OpenVLA aide surtout à :</w:t>
       </w:r>
@@ -3622,24 +4670,42 @@
     <w:p>
       <w:pPr>
         <w:pStyle w:val="Listepuces"/>
-      </w:pPr>
-      <w:r>
+        <w:rPr>
+          <w:lang w:val="fr-CA"/>
+        </w:rPr>
+      </w:pPr>
+      <w:r>
+        <w:rPr>
+          <w:lang w:val="fr-CA"/>
+        </w:rPr>
         <w:t>Raisonner et planifier à partir de la scène et du langage.</w:t>
       </w:r>
     </w:p>
     <w:p>
       <w:pPr>
         <w:pStyle w:val="Listepuces"/>
-      </w:pPr>
-      <w:r>
+        <w:rPr>
+          <w:lang w:val="fr-CA"/>
+        </w:rPr>
+      </w:pPr>
+      <w:r>
+        <w:rPr>
+          <w:lang w:val="fr-CA"/>
+        </w:rPr>
         <w:t>Adapter le mouvement et corriger en boucle fermée.</w:t>
       </w:r>
     </w:p>
     <w:p>
       <w:pPr>
         <w:pStyle w:val="Listepuces"/>
-      </w:pPr>
-      <w:r>
+        <w:rPr>
+          <w:lang w:val="fr-CA"/>
+        </w:rPr>
+      </w:pPr>
+      <w:r>
+        <w:rPr>
+          <w:lang w:val="fr-CA"/>
+        </w:rPr>
         <w:t>Gérer des scènes complexes et comprendre le langage humain.</w:t>
       </w:r>
     </w:p>
@@ -3792,9 +4858,30 @@
       </w:r>
     </w:p>
     <w:p>
-      <w:pPr/>
-      <w:r>
-        <w:t>Tandis que Zivid + nuage de points fournissent la géométrie précise (RGB, profondeur, XYZ en mètres), OpenVLA apporte la couche sémantique et décisionnelle au-dessus de cette perception.</w:t>
+      <w:pPr>
+        <w:rPr>
+          <w:lang w:val="fr-CA"/>
+        </w:rPr>
+      </w:pPr>
+      <w:r>
+        <w:rPr>
+          <w:lang w:val="fr-CA"/>
+        </w:rPr>
+        <w:t xml:space="preserve">Tandis que Zivid + nuage de points fournissent la géométrie précise (RGB, profondeur, XYZ en mètres), </w:t>
+      </w:r>
+      <w:proofErr w:type="spellStart"/>
+      <w:r>
+        <w:rPr>
+          <w:lang w:val="fr-CA"/>
+        </w:rPr>
+        <w:t>OpenVLA</w:t>
+      </w:r>
+      <w:proofErr w:type="spellEnd"/>
+      <w:r>
+        <w:rPr>
+          <w:lang w:val="fr-CA"/>
+        </w:rPr>
+        <w:t xml:space="preserve"> apporte la couche sémantique et décisionnelle au-dessus de cette perception.</w:t>
       </w:r>
     </w:p>
     <w:p>

</xml_diff>

<commit_message>
refactoring code by classes into pipeline
Découpage modulaire Zivid → DINO → OpenVLA → UR16e : config, calibration, capture,
détection, contrôle robot/pince, VLA ; main_real.py et main_sim.py. README jour 10
et mise à jour rapport final.
</commit_message>
<xml_diff>
--- a/OpenVLA_day01_stage_CCNB.docx
+++ b/OpenVLA_day01_stage_CCNB.docx
@@ -3556,6 +3556,26 @@
           <w:lang w:val="fr-CA"/>
         </w:rPr>
         <w:t xml:space="preserve"> (jour 07)</w:t>
+      </w:r>
+    </w:p>
+    <w:p>
+      <w:pPr>
+        <w:pStyle w:val="Titre3"/>
+      </w:pPr>
+      <w:r>
+        <w:t>Jour 10 — refactoring pipeline (UR16e, Zivid, DINO, OpenVLA)</w:t>
+      </w:r>
+    </w:p>
+    <w:p>
+      <w:pPr/>
+      <w:r>
+        <w:t>Objectif : découper le démonstrateur en modules indépendants (config, capture Zivid avec distance max, détection Grounding DINO avec sauvegarde (u,v), calibration caméra→robot obligatoire, contrôleur UR16e avec limites workspace, pince Robotiq, contrôleur OpenVLA avec prompt dynamique basé sur la distance TCP→objet).</w:t>
+      </w:r>
+    </w:p>
+    <w:p>
+      <w:pPr/>
+      <w:r>
+        <w:t>Points critiques : (1) calibration main-œil absente = bug majeur ; (2) ajouter une limite de workspace côté UR ; (3) réintégrer DINO périodiquement dans la boucle pour corriger la dérive ; (4) préférer un prompt relatif (distance restante) aux coordonnées absolues.</w:t>
       </w:r>
     </w:p>
     <w:p>

</xml_diff>

<commit_message>
Reformate le rapport final : page titre, TOC, parties IV/V
Page 1 centrée, table des matières cliquable (champ Word), objectifs
après la TOC, sections IV (tests) et V (pipeline jours 10–11) en fin.
</commit_message>
<xml_diff>
--- a/OpenVLA_day01_stage_CCNB.docx
+++ b/OpenVLA_day01_stage_CCNB.docx
@@ -50,47 +50,23 @@
     <w:p>
       <w:pPr>
         <w:jc w:val="center"/>
-        <w:rPr>
-          <w:lang w:val="fr-CA"/>
-        </w:rPr>
       </w:pPr>
       <w:r>
         <w:rPr>
           <w:b/>
           <w:sz w:val="28"/>
-          <w:lang w:val="fr-CA"/>
-        </w:rPr>
-        <w:t xml:space="preserve">Projet </w:t>
-      </w:r>
-      <w:proofErr w:type="spellStart"/>
-      <w:r>
-        <w:rPr>
-          <w:b/>
-          <w:sz w:val="28"/>
-          <w:lang w:val="fr-CA"/>
-        </w:rPr>
-        <w:t>OpenVLA</w:t>
-      </w:r>
-      <w:proofErr w:type="spellEnd"/>
-      <w:r>
-        <w:rPr>
-          <w:b/>
-          <w:sz w:val="28"/>
-          <w:lang w:val="fr-CA"/>
-        </w:rPr>
-        <w:t xml:space="preserve"> — Jour 01 — Début de stage CCNB-INNOV</w:t>
+        </w:rPr>
+        <w:t>Projet OpenVLA — Rapport final de stage — CCNB-INNOV</w:t>
       </w:r>
     </w:p>
     <w:p>
       <w:pPr>
         <w:jc w:val="center"/>
-        <w:rPr>
-          <w:lang w:val="fr-CA"/>
-        </w:rPr>
-      </w:pPr>
-      <w:r>
-        <w:rPr>
-          <w:lang w:val="fr-CA"/>
+      </w:pPr>
+      <w:r>
+        <w:rPr>
+          <w:b w:val="0"/>
+          <w:sz w:val="22"/>
         </w:rPr>
         <w:t>Par : Fabrice Kouonang</w:t>
       </w:r>
@@ -98,14 +74,11 @@
     <w:p>
       <w:pPr>
         <w:jc w:val="center"/>
-        <w:rPr>
-          <w:lang w:val="fr-CA"/>
-        </w:rPr>
-      </w:pPr>
-      <w:r>
-        <w:rPr>
+      </w:pPr>
+      <w:r>
+        <w:rPr>
+          <w:b w:val="0"/>
           <w:sz w:val="20"/>
-          <w:lang w:val="fr-CA"/>
         </w:rPr>
         <w:t>————————————————————————————</w:t>
       </w:r>
@@ -113,13 +86,11 @@
     <w:p>
       <w:pPr>
         <w:jc w:val="center"/>
-        <w:rPr>
-          <w:lang w:val="fr-CA"/>
-        </w:rPr>
-      </w:pPr>
-      <w:r>
-        <w:rPr>
-          <w:lang w:val="fr-CA"/>
+      </w:pPr>
+      <w:r>
+        <w:rPr>
+          <w:b w:val="0"/>
+          <w:sz w:val="22"/>
         </w:rPr>
         <w:t>Superviseur direct : Guillaume Batungwanayo</w:t>
       </w:r>
@@ -127,1096 +98,141 @@
     <w:p>
       <w:pPr>
         <w:jc w:val="center"/>
-        <w:rPr>
-          <w:lang w:val="fr-CA"/>
-        </w:rPr>
-      </w:pPr>
-      <w:r>
-        <w:rPr>
+      </w:pPr>
+      <w:r>
+        <w:rPr>
+          <w:b w:val="0"/>
           <w:sz w:val="20"/>
-          <w:lang w:val="fr-CA"/>
-        </w:rPr>
-        <w:t>Date : 14 mai 2026 | Jour : 01</w:t>
-      </w:r>
-    </w:p>
-    <w:p>
-      <w:pPr>
-        <w:jc w:val="center"/>
-        <w:rPr>
-          <w:lang w:val="fr-CA"/>
-        </w:rPr>
-      </w:pPr>
+        </w:rPr>
+        <w:t>Date : 14 mai 2026 | Rapport final</w:t>
+      </w:r>
+    </w:p>
+    <w:p>
+      <w:r>
+        <w:br w:type="page"/>
+      </w:r>
     </w:p>
     <w:p>
       <w:pPr>
         <w:pStyle w:val="Titre1"/>
-        <w:rPr>
-          <w:lang w:val="fr-CA"/>
-        </w:rPr>
-      </w:pPr>
-      <w:r>
-        <w:rPr>
-          <w:lang w:val="fr-CA"/>
-        </w:rPr>
-        <w:t xml:space="preserve">Rapport final de stage — Synthèse </w:t>
-      </w:r>
-      <w:proofErr w:type="spellStart"/>
-      <w:r>
-        <w:rPr>
-          <w:lang w:val="fr-CA"/>
-        </w:rPr>
-        <w:t>OpenVLA</w:t>
-      </w:r>
-      <w:proofErr w:type="spellEnd"/>
-    </w:p>
-    <w:p>
-      <w:pPr>
-        <w:rPr>
-          <w:lang w:val="fr-CA"/>
-        </w:rPr>
-      </w:pPr>
-      <w:r>
-        <w:rPr>
-          <w:lang w:val="fr-CA"/>
-        </w:rPr>
-        <w:t xml:space="preserve">Ce document constitue le rapport final du stage réalisé au CCNB-INNOV. Il présente la veille technologique, l'expérimentation pratique et l'intégration d'un démonstrateur </w:t>
-      </w:r>
-      <w:proofErr w:type="spellStart"/>
-      <w:r>
-        <w:rPr>
-          <w:lang w:val="fr-CA"/>
-        </w:rPr>
-        <w:t>OpenVLA</w:t>
-      </w:r>
-      <w:proofErr w:type="spellEnd"/>
-      <w:r>
-        <w:rPr>
-          <w:lang w:val="fr-CA"/>
-        </w:rPr>
-        <w:t xml:space="preserve"> couplant un robot collaboratif UR et une caméra </w:t>
-      </w:r>
-      <w:proofErr w:type="spellStart"/>
-      <w:r>
-        <w:rPr>
-          <w:lang w:val="fr-CA"/>
-        </w:rPr>
-        <w:t>Zivid</w:t>
-      </w:r>
-      <w:proofErr w:type="spellEnd"/>
-      <w:r>
-        <w:rPr>
-          <w:lang w:val="fr-CA"/>
-        </w:rPr>
-        <w:t xml:space="preserve"> 2+ MR130. Les trois premières parties répondent aux objectifs initiaux du stage : architecture </w:t>
-      </w:r>
-      <w:proofErr w:type="spellStart"/>
-      <w:r>
-        <w:rPr>
-          <w:lang w:val="fr-CA"/>
-        </w:rPr>
-        <w:t>OpenVLA</w:t>
-      </w:r>
-      <w:proofErr w:type="spellEnd"/>
-      <w:r>
-        <w:rPr>
-          <w:lang w:val="fr-CA"/>
-        </w:rPr>
-        <w:t>, composantes de la pipeline et comparaison aux approches robotiques traditionnelles.</w:t>
+      </w:pPr>
+      <w:r>
+        <w:t>Table des matières</w:t>
+      </w:r>
+    </w:p>
+    <w:p>
+      <w:r>
+        <w:fldChar w:fldCharType="begin"/>
+        <w:instrText xml:space="preserve">TOC \o "1-3" \h \z \u</w:instrText>
+        <w:fldChar w:fldCharType="separate"/>
+        <w:fldChar w:fldCharType="end"/>
+      </w:r>
+    </w:p>
+    <w:p>
+      <w:r>
+        <w:br w:type="page"/>
+      </w:r>
+    </w:p>
+    <w:p>
+      <w:pPr>
+        <w:pStyle w:val="Titre1"/>
+      </w:pPr>
+      <w:r>
+        <w:t>Rapport final de stage — Synthèse OpenVLA</w:t>
+      </w:r>
+    </w:p>
+    <w:p>
+      <w:r>
+        <w:t>Ce document constitue le rapport final du stage réalisé au CCNB-INNOV. Il présente la veille technologique, l'expérimentation pratique et l'intégration d'un démonstrateur OpenVLA couplant un robot collaboratif UR et une caméra Zivid 2+ MR130. Les trois premières parties répondent aux objectifs initiaux du stage : architecture OpenVLA, composantes de la pipeline et comparaison aux approches robotiques traditionnelles.</w:t>
       </w:r>
     </w:p>
     <w:p>
       <w:pPr>
         <w:pStyle w:val="Titre2"/>
-        <w:rPr>
-          <w:lang w:val="fr-CA"/>
-        </w:rPr>
-      </w:pPr>
-      <w:r>
-        <w:rPr>
-          <w:lang w:val="fr-CA"/>
-        </w:rPr>
+      </w:pPr>
+      <w:r>
         <w:t>Contexte et question directrice</w:t>
       </w:r>
     </w:p>
     <w:p>
-      <w:pPr>
-        <w:rPr>
-          <w:lang w:val="fr-CA"/>
-        </w:rPr>
-      </w:pPr>
-      <w:r>
-        <w:rPr>
-          <w:lang w:val="fr-CA"/>
-        </w:rPr>
-        <w:t xml:space="preserve">Quels sont les ingrédients de la « sauce </w:t>
-      </w:r>
-      <w:proofErr w:type="spellStart"/>
-      <w:r>
-        <w:rPr>
-          <w:lang w:val="fr-CA"/>
-        </w:rPr>
-        <w:t>OpenVLA</w:t>
-      </w:r>
-      <w:proofErr w:type="spellEnd"/>
-      <w:r>
-        <w:rPr>
-          <w:lang w:val="fr-CA"/>
-        </w:rPr>
-        <w:t xml:space="preserve"> » et en quoi cette approche diffère-t-elle des méthodes robotiques plus traditionnelles ? Le stage combine veille technologique, expérimentation sur banc réel (Windows 11 Pro, GPU NVIDIA, Python 3.11) et documentation technique.</w:t>
+      <w:r>
+        <w:t>Quels sont les ingrédients de la « sauce OpenVLA » et en quoi cette approche diffère-t-elle des méthodes robotiques plus traditionnelles ? Le stage combine veille technologique, expérimentation sur banc réel (Windows 11 Pro, GPU NVIDIA, Python 3.11) et documentation technique.</w:t>
       </w:r>
     </w:p>
     <w:p>
       <w:pPr>
         <w:pStyle w:val="Titre2"/>
       </w:pPr>
-      <w:proofErr w:type="spellStart"/>
-      <w:r>
-        <w:t>Objectifs</w:t>
-      </w:r>
-      <w:proofErr w:type="spellEnd"/>
-      <w:r>
-        <w:t xml:space="preserve"> du stage</w:t>
+      <w:r>
+        <w:t>Objectifs du stage</w:t>
       </w:r>
     </w:p>
     <w:p>
       <w:pPr>
         <w:pStyle w:val="Listepuces"/>
-        <w:rPr>
-          <w:lang w:val="fr-CA"/>
-        </w:rPr>
-      </w:pPr>
-      <w:r>
-        <w:rPr>
-          <w:lang w:val="fr-CA"/>
-        </w:rPr>
-        <w:t>Étudier l'architecture générale d'</w:t>
-      </w:r>
-      <w:proofErr w:type="spellStart"/>
-      <w:r>
-        <w:rPr>
-          <w:lang w:val="fr-CA"/>
-        </w:rPr>
-        <w:t>OpenVLA</w:t>
-      </w:r>
-      <w:proofErr w:type="spellEnd"/>
-      <w:r>
-        <w:rPr>
-          <w:lang w:val="fr-CA"/>
-        </w:rPr>
-        <w:t xml:space="preserve"> et en produire une description technique claire et structurée.</w:t>
+      </w:pPr>
+      <w:r>
+        <w:t>Étudier l'architecture générale d'OpenVLA et en produire une description technique claire et structurée.</w:t>
       </w:r>
     </w:p>
     <w:p>
       <w:pPr>
         <w:pStyle w:val="Listepuces"/>
-        <w:rPr>
-          <w:lang w:val="fr-CA"/>
-        </w:rPr>
-      </w:pPr>
-      <w:r>
-        <w:rPr>
-          <w:lang w:val="fr-CA"/>
-        </w:rPr>
-        <w:t xml:space="preserve">Identifier les différentes composantes </w:t>
-      </w:r>
-      <w:proofErr w:type="gramStart"/>
-      <w:r>
-        <w:rPr>
-          <w:lang w:val="fr-CA"/>
-        </w:rPr>
-        <w:t>de la pipeline</w:t>
-      </w:r>
-      <w:proofErr w:type="gramEnd"/>
-      <w:r>
-        <w:rPr>
-          <w:lang w:val="fr-CA"/>
-        </w:rPr>
-        <w:t xml:space="preserve"> : perception, inférence, génération d'actions et exécution robotique.</w:t>
+      </w:pPr>
+      <w:r>
+        <w:t>Identifier les différentes composantes de la pipeline : perception, inférence, génération d'actions et exécution robotique.</w:t>
       </w:r>
     </w:p>
     <w:p>
       <w:pPr>
         <w:pStyle w:val="Listepuces"/>
-        <w:rPr>
-          <w:lang w:val="fr-CA"/>
-        </w:rPr>
-      </w:pPr>
-      <w:r>
-        <w:rPr>
-          <w:lang w:val="fr-CA"/>
-        </w:rPr>
-        <w:t xml:space="preserve">Comparer l'approche </w:t>
-      </w:r>
-      <w:proofErr w:type="spellStart"/>
-      <w:r>
-        <w:rPr>
-          <w:lang w:val="fr-CA"/>
-        </w:rPr>
-        <w:t>OpenVLA</w:t>
-      </w:r>
-      <w:proofErr w:type="spellEnd"/>
-      <w:r>
-        <w:rPr>
-          <w:lang w:val="fr-CA"/>
-        </w:rPr>
-        <w:t xml:space="preserve"> aux approches robotiques traditionnelles (programmation, perception, planification, contrôle).</w:t>
+      </w:pPr>
+      <w:r>
+        <w:t>Comparer l'approche OpenVLA aux approches robotiques traditionnelles (programmation, perception, planification, contrôle).</w:t>
       </w:r>
     </w:p>
     <w:p>
       <w:pPr>
         <w:pStyle w:val="Listepuces"/>
-        <w:rPr>
-          <w:lang w:val="fr-CA"/>
-        </w:rPr>
-      </w:pPr>
-      <w:r>
-        <w:rPr>
-          <w:lang w:val="fr-CA"/>
-        </w:rPr>
-        <w:t xml:space="preserve">Mettre en place un démonstrateur expérimental UR + </w:t>
-      </w:r>
-      <w:proofErr w:type="spellStart"/>
-      <w:r>
-        <w:rPr>
-          <w:lang w:val="fr-CA"/>
-        </w:rPr>
-        <w:t>Zivid</w:t>
-      </w:r>
-      <w:proofErr w:type="spellEnd"/>
-      <w:r>
-        <w:rPr>
-          <w:lang w:val="fr-CA"/>
-        </w:rPr>
-        <w:t>.</w:t>
+      </w:pPr>
+      <w:r>
+        <w:t>Mettre en place un démonstrateur expérimental UR + Zivid.</w:t>
       </w:r>
     </w:p>
     <w:p>
       <w:pPr>
         <w:pStyle w:val="Listepuces"/>
-        <w:rPr>
-          <w:lang w:val="fr-CA"/>
-        </w:rPr>
-      </w:pPr>
-      <w:r>
-        <w:rPr>
-          <w:lang w:val="fr-CA"/>
-        </w:rPr>
+      </w:pPr>
+      <w:r>
         <w:t>Réaliser l'intégration logicielle et matérielle du démonstrateur.</w:t>
       </w:r>
     </w:p>
     <w:p>
       <w:pPr>
         <w:pStyle w:val="Listepuces"/>
-        <w:rPr>
-          <w:lang w:val="fr-CA"/>
-        </w:rPr>
-      </w:pPr>
-      <w:r>
-        <w:rPr>
-          <w:lang w:val="fr-CA"/>
-        </w:rPr>
+      </w:pPr>
+      <w:r>
         <w:t>Effectuer des essais, analyser les résultats et documenter limites et opportunités.</w:t>
       </w:r>
     </w:p>
     <w:p>
       <w:pPr>
         <w:pStyle w:val="Listepuces"/>
-        <w:rPr>
-          <w:lang w:val="fr-CA"/>
-        </w:rPr>
-      </w:pPr>
-      <w:r>
-        <w:rPr>
-          <w:lang w:val="fr-CA"/>
-        </w:rPr>
+      </w:pPr>
+      <w:r>
         <w:t>Produire une documentation technique et une synthèse pour l'équipe CCNB-INNOV.</w:t>
       </w:r>
     </w:p>
     <w:p>
       <w:pPr>
         <w:pStyle w:val="Listepuces"/>
-        <w:rPr>
-          <w:lang w:val="fr-CA"/>
-        </w:rPr>
-      </w:pPr>
-      <w:r>
-        <w:rPr>
-          <w:lang w:val="fr-CA"/>
-        </w:rPr>
+      </w:pPr>
+      <w:r>
         <w:t>Présenter les résultats sous forme de démonstration et présentation technique.</w:t>
       </w:r>
     </w:p>
     <w:p>
-      <w:pPr>
-        <w:pStyle w:val="Titre1"/>
-        <w:rPr>
-          <w:lang w:val="fr-CA"/>
-        </w:rPr>
-      </w:pPr>
-      <w:r>
-        <w:rPr>
-          <w:lang w:val="fr-CA"/>
-        </w:rPr>
-        <w:lastRenderedPageBreak/>
-        <w:t>Table des matières</w:t>
-      </w:r>
-    </w:p>
-    <w:p>
-      <w:pPr>
-        <w:rPr>
-          <w:lang w:val="fr-CA"/>
-        </w:rPr>
-      </w:pPr>
-      <w:r>
-        <w:rPr>
-          <w:lang w:val="fr-CA"/>
-        </w:rPr>
-        <w:t>I. Architecture générale d'</w:t>
-      </w:r>
-      <w:proofErr w:type="spellStart"/>
-      <w:r>
-        <w:rPr>
-          <w:lang w:val="fr-CA"/>
-        </w:rPr>
-        <w:t>OpenVLA</w:t>
-      </w:r>
-      <w:proofErr w:type="spellEnd"/>
-    </w:p>
-    <w:p>
-      <w:pPr>
-        <w:rPr>
-          <w:lang w:val="fr-CA"/>
-        </w:rPr>
-      </w:pPr>
-      <w:r>
-        <w:rPr>
-          <w:lang w:val="fr-CA"/>
-        </w:rPr>
-        <w:t xml:space="preserve">   </w:t>
-      </w:r>
-      <w:proofErr w:type="gramStart"/>
-      <w:r>
-        <w:rPr>
-          <w:lang w:val="fr-CA"/>
-        </w:rPr>
-        <w:t>I.1  Définition</w:t>
-      </w:r>
-      <w:proofErr w:type="gramEnd"/>
-      <w:r>
-        <w:rPr>
-          <w:lang w:val="fr-CA"/>
-        </w:rPr>
-        <w:t xml:space="preserve"> et positionnement du modèle</w:t>
-      </w:r>
-    </w:p>
-    <w:p>
-      <w:pPr>
-        <w:rPr>
-          <w:lang w:val="fr-CA"/>
-        </w:rPr>
-      </w:pPr>
-      <w:r>
-        <w:rPr>
-          <w:lang w:val="fr-CA"/>
-        </w:rPr>
-        <w:t xml:space="preserve">   </w:t>
-      </w:r>
-      <w:proofErr w:type="gramStart"/>
-      <w:r>
-        <w:rPr>
-          <w:lang w:val="fr-CA"/>
-        </w:rPr>
-        <w:t>I.2  Architecture</w:t>
-      </w:r>
-      <w:proofErr w:type="gramEnd"/>
-      <w:r>
-        <w:rPr>
-          <w:lang w:val="fr-CA"/>
-        </w:rPr>
-        <w:t xml:space="preserve"> technique (encodeur, projecteur, LLM)</w:t>
-      </w:r>
-    </w:p>
-    <w:p>
-      <w:pPr>
-        <w:rPr>
-          <w:lang w:val="fr-CA"/>
-        </w:rPr>
-      </w:pPr>
-      <w:r>
-        <w:rPr>
-          <w:lang w:val="fr-CA"/>
-        </w:rPr>
-        <w:t xml:space="preserve">   </w:t>
-      </w:r>
-      <w:proofErr w:type="gramStart"/>
-      <w:r>
-        <w:rPr>
-          <w:lang w:val="fr-CA"/>
-        </w:rPr>
-        <w:t>I.3  Boucle</w:t>
-      </w:r>
-      <w:proofErr w:type="gramEnd"/>
-      <w:r>
-        <w:rPr>
-          <w:lang w:val="fr-CA"/>
-        </w:rPr>
-        <w:t xml:space="preserve"> Vision — Langage — Action</w:t>
-      </w:r>
-    </w:p>
-    <w:p>
-      <w:pPr>
-        <w:rPr>
-          <w:lang w:val="fr-CA"/>
-        </w:rPr>
-      </w:pPr>
-      <w:r>
-        <w:rPr>
-          <w:lang w:val="fr-CA"/>
-        </w:rPr>
-        <w:t xml:space="preserve">   </w:t>
-      </w:r>
-      <w:proofErr w:type="gramStart"/>
-      <w:r>
-        <w:rPr>
-          <w:lang w:val="fr-CA"/>
-        </w:rPr>
-        <w:t>I.4  Modèle</w:t>
-      </w:r>
-      <w:proofErr w:type="gramEnd"/>
-      <w:r>
-        <w:rPr>
-          <w:lang w:val="fr-CA"/>
-        </w:rPr>
-        <w:t xml:space="preserve"> openvla-7b et contraintes matérielles</w:t>
-      </w:r>
-    </w:p>
-    <w:p>
-      <w:pPr>
-        <w:rPr>
-          <w:lang w:val="fr-CA"/>
-        </w:rPr>
-      </w:pPr>
-      <w:r>
-        <w:rPr>
-          <w:lang w:val="fr-CA"/>
-        </w:rPr>
-        <w:t xml:space="preserve">II. Composantes </w:t>
-      </w:r>
-      <w:proofErr w:type="gramStart"/>
-      <w:r>
-        <w:rPr>
-          <w:lang w:val="fr-CA"/>
-        </w:rPr>
-        <w:t>de la pipeline</w:t>
-      </w:r>
-      <w:proofErr w:type="gramEnd"/>
-      <w:r>
-        <w:rPr>
-          <w:lang w:val="fr-CA"/>
-        </w:rPr>
-        <w:t xml:space="preserve"> du démonstrateur</w:t>
-      </w:r>
-    </w:p>
-    <w:p>
-      <w:pPr>
-        <w:rPr>
-          <w:lang w:val="fr-CA"/>
-        </w:rPr>
-      </w:pPr>
-      <w:r>
-        <w:rPr>
-          <w:lang w:val="fr-CA"/>
-        </w:rPr>
-        <w:t xml:space="preserve">   </w:t>
-      </w:r>
-      <w:proofErr w:type="gramStart"/>
-      <w:r>
-        <w:rPr>
-          <w:lang w:val="fr-CA"/>
-        </w:rPr>
-        <w:t>II.1  Perception</w:t>
-      </w:r>
-      <w:proofErr w:type="gramEnd"/>
-      <w:r>
-        <w:rPr>
-          <w:lang w:val="fr-CA"/>
-        </w:rPr>
-        <w:t xml:space="preserve"> : caméra </w:t>
-      </w:r>
-      <w:proofErr w:type="spellStart"/>
-      <w:r>
-        <w:rPr>
-          <w:lang w:val="fr-CA"/>
-        </w:rPr>
-        <w:t>Zivid</w:t>
-      </w:r>
-      <w:proofErr w:type="spellEnd"/>
-      <w:r>
-        <w:rPr>
-          <w:lang w:val="fr-CA"/>
-        </w:rPr>
-        <w:t xml:space="preserve"> MR130</w:t>
-      </w:r>
-    </w:p>
-    <w:p>
-      <w:pPr>
-        <w:rPr>
-          <w:lang w:val="fr-CA"/>
-        </w:rPr>
-      </w:pPr>
-      <w:r>
-        <w:rPr>
-          <w:lang w:val="fr-CA"/>
-        </w:rPr>
-        <w:t xml:space="preserve">   </w:t>
-      </w:r>
-      <w:proofErr w:type="gramStart"/>
-      <w:r>
-        <w:rPr>
-          <w:lang w:val="fr-CA"/>
-        </w:rPr>
-        <w:t>II.2  Inférence</w:t>
-      </w:r>
-      <w:proofErr w:type="gramEnd"/>
-      <w:r>
-        <w:rPr>
-          <w:lang w:val="fr-CA"/>
-        </w:rPr>
-        <w:t xml:space="preserve"> : </w:t>
-      </w:r>
-      <w:proofErr w:type="spellStart"/>
-      <w:r>
-        <w:rPr>
-          <w:lang w:val="fr-CA"/>
-        </w:rPr>
-        <w:t>OpenVLA</w:t>
-      </w:r>
-      <w:proofErr w:type="spellEnd"/>
-      <w:r>
-        <w:rPr>
-          <w:lang w:val="fr-CA"/>
-        </w:rPr>
-        <w:t xml:space="preserve"> (</w:t>
-      </w:r>
-      <w:proofErr w:type="spellStart"/>
-      <w:r>
-        <w:rPr>
-          <w:lang w:val="fr-CA"/>
-        </w:rPr>
-        <w:t>transformers</w:t>
-      </w:r>
-      <w:proofErr w:type="spellEnd"/>
-      <w:r>
-        <w:rPr>
-          <w:lang w:val="fr-CA"/>
-        </w:rPr>
-        <w:t xml:space="preserve">, </w:t>
-      </w:r>
-      <w:proofErr w:type="spellStart"/>
-      <w:r>
-        <w:rPr>
-          <w:lang w:val="fr-CA"/>
-        </w:rPr>
-        <w:t>predict_action</w:t>
-      </w:r>
-      <w:proofErr w:type="spellEnd"/>
-      <w:r>
-        <w:rPr>
-          <w:lang w:val="fr-CA"/>
-        </w:rPr>
-        <w:t>)</w:t>
-      </w:r>
-    </w:p>
-    <w:p>
-      <w:pPr>
-        <w:rPr>
-          <w:lang w:val="fr-CA"/>
-        </w:rPr>
-      </w:pPr>
-      <w:r>
-        <w:rPr>
-          <w:lang w:val="fr-CA"/>
-        </w:rPr>
-        <w:t xml:space="preserve">   </w:t>
-      </w:r>
-      <w:proofErr w:type="gramStart"/>
-      <w:r>
-        <w:rPr>
-          <w:lang w:val="fr-CA"/>
-        </w:rPr>
-        <w:t>II.3  Génération</w:t>
-      </w:r>
-      <w:proofErr w:type="gramEnd"/>
-      <w:r>
-        <w:rPr>
-          <w:lang w:val="fr-CA"/>
-        </w:rPr>
-        <w:t xml:space="preserve"> d'actions et format de sortie</w:t>
-      </w:r>
-    </w:p>
-    <w:p>
-      <w:pPr>
-        <w:rPr>
-          <w:lang w:val="fr-CA"/>
-        </w:rPr>
-      </w:pPr>
-      <w:r>
-        <w:rPr>
-          <w:lang w:val="fr-CA"/>
-        </w:rPr>
-        <w:t xml:space="preserve">   </w:t>
-      </w:r>
-      <w:proofErr w:type="gramStart"/>
-      <w:r>
-        <w:rPr>
-          <w:lang w:val="fr-CA"/>
-        </w:rPr>
-        <w:t>II.4  Exécution</w:t>
-      </w:r>
-      <w:proofErr w:type="gramEnd"/>
-      <w:r>
-        <w:rPr>
-          <w:lang w:val="fr-CA"/>
-        </w:rPr>
-        <w:t xml:space="preserve"> robotique : UR (</w:t>
-      </w:r>
-      <w:proofErr w:type="spellStart"/>
-      <w:r>
-        <w:rPr>
-          <w:lang w:val="fr-CA"/>
-        </w:rPr>
-        <w:t>URScript</w:t>
-      </w:r>
-      <w:proofErr w:type="spellEnd"/>
-      <w:r>
-        <w:rPr>
-          <w:lang w:val="fr-CA"/>
-        </w:rPr>
-        <w:t xml:space="preserve"> / </w:t>
-      </w:r>
-      <w:proofErr w:type="spellStart"/>
-      <w:r>
-        <w:rPr>
-          <w:lang w:val="fr-CA"/>
-        </w:rPr>
-        <w:t>ur-rtde</w:t>
-      </w:r>
-      <w:proofErr w:type="spellEnd"/>
-      <w:r>
-        <w:rPr>
-          <w:lang w:val="fr-CA"/>
-        </w:rPr>
-        <w:t>)</w:t>
-      </w:r>
-    </w:p>
-    <w:p>
-      <w:pPr>
-        <w:pStyle w:val="Titre2"/>
-      </w:pPr>
-      <w:r>
-        <w:t>II.6 Jour 11 — Calibration caméra → robot (T_tcp_cam)</w:t>
-      </w:r>
-    </w:p>
-    <w:p>
-      <w:r>
-        <w:t>Le 29 mai 2026 (jour 11), le démonstrateur intègre la calibration main-œil (eye-in-hand) UR16e + Zivid. Cette section distingue la création du fichier de calibration (script autonome) de son utilisation à chaque exécution du pipeline OpenVLA.</w:t>
-      </w:r>
-    </w:p>
-    <w:p>
-      <w:pPr>
-        <w:pStyle w:val="Titre3"/>
-      </w:pPr>
-      <w:r>
-        <w:t>I. Le fichier T_tcp_cam.npy — traducteur entre caméra et robot</w:t>
-      </w:r>
-    </w:p>
-    <w:p>
-      <w:r>
-        <w:t>La matrice homogène 4×4 T_tcp_cam relie le repère de la caméra Zivid (montée sur le TCP) au repère outil du robot. Sans ce fichier, les coordonnées 3D issues de Grounding DINO (repère caméra) ne peuvent pas être converties en positions fiables pour le UR16e.</w:t>
-      </w:r>
-    </w:p>
-    <w:p>
-      <w:pPr>
-        <w:pStyle w:val="Listepuces"/>
-      </w:pPr>
-      <w:r>
-        <w:t>Caméra : « l’objet est à gauche et devant moi » (repère optique Zivid).</w:t>
-      </w:r>
-    </w:p>
-    <w:p>
-      <w:pPr>
-        <w:pStyle w:val="Listepuces"/>
-      </w:pPr>
-      <w:r>
-        <w:t>Robot : « je me déplace dans la base UR » — il ne connaît pas la « gauche » de la caméra.</w:t>
-      </w:r>
-    </w:p>
-    <w:p>
-      <w:r>
-        <w:t>Fichier produit : T_tcp_cam.npy (chemin CALIBRATION_FILE dans pipeline/config.py). Sauvegarde avec numpy : np.save(CALIBRATION_FILE, T_tcp_cam) après calibration réussie.</w:t>
-      </w:r>
-    </w:p>
-    <w:p>
-      <w:pPr>
-        <w:pStyle w:val="Titre3"/>
-      </w:pPr>
-      <w:r>
-        <w:t>II. pipeline/calibrer_robot.py — script autonome (création du fichier)</w:t>
-      </w:r>
-    </w:p>
-    <w:p>
-      <w:r>
-        <w:t>Ce script s’exécute seul, indépendamment de main_real.py et main_sim.py. Il sert uniquement à générer ou régénérer T_tcp_cam.npy avant les runs du pipeline.</w:t>
-      </w:r>
-    </w:p>
-    <w:p>
-      <w:pPr>
-        <w:pStyle w:val="Listepuces"/>
-      </w:pPr>
-      <w:r>
-        <w:t>Connexion Zivid (zivid.Application, connect_camera) et UR16e (RTDE).</w:t>
-      </w:r>
-    </w:p>
-    <w:p>
-      <w:pPr>
-        <w:pStyle w:val="Listepuces"/>
-      </w:pPr>
-      <w:r>
-        <w:t>Pour chaque pose de calibration : déplacement moveL, lecture TCP, capture Zivid (camera.capture()), détection de la mire damier noir et blanc via zivid.calibration.detect_feature_points(frame.point_cloud()).</w:t>
-      </w:r>
-    </w:p>
-    <w:p>
-      <w:pPr>
-        <w:pStyle w:val="Listepuces"/>
-      </w:pPr>
-      <w:r>
-        <w:t>Accumulation des échantillons HandEyeInput (pose robot + détection valide), puis zivid.calibration.calibrate_eye_in_hand(detection_results).</w:t>
-      </w:r>
-    </w:p>
-    <w:p>
-      <w:pPr>
-        <w:pStyle w:val="Listepuces"/>
-      </w:pPr>
-      <w:r>
-        <w:t>Si result.valid() : extraction de T_tcp_cam = result.transform() et np.save vers T_tcp_cam.npy.</w:t>
-      </w:r>
-    </w:p>
-    <w:p>
-      <w:r>
-        <w:t>Lancement typique (depuis la racine du projet, environnement Zivid + RTDE) : python -m pipeline.calibrer_robot</w:t>
-      </w:r>
-    </w:p>
-    <w:p>
-      <w:pPr>
-        <w:pStyle w:val="Titre3"/>
-      </w:pPr>
-      <w:r>
-        <w:t>III. pipeline/calibration.py — utilisé à chaque run OpenVLA</w:t>
-      </w:r>
-    </w:p>
-    <w:p>
-      <w:r>
-        <w:t>À chaque exécution du pipeline (main_real.py, boucle adaptative), calibration.py charge T_tcp_cam.npy via load_calibration() et convertit les coordonnées caméra → base robot avec cam_to_robot(xyz_cam_m, tcp_pose, T_tcp_cam) lors des déplacements guidés par OpenVLA.</w:t>
-      </w:r>
-    </w:p>
-    <w:p>
-      <w:pPr>
-        <w:pStyle w:val="Listepuces"/>
-      </w:pPr>
-      <w:r>
-        <w:t>load_calibration() : np.load si le fichier existe ; sinon matrice identité (mode non calibré).</w:t>
-      </w:r>
-    </w:p>
-    <w:p>
-      <w:pPr>
-        <w:pStyle w:val="Listepuces"/>
-      </w:pPr>
-      <w:r>
-        <w:t>cam_to_robot() : chaîne T_base_tcp @ T_tcp_cam @ P_cam pour placer l’objet détecté dans la base UR.</w:t>
-      </w:r>
-    </w:p>
-    <w:p>
-      <w:pPr>
-        <w:pStyle w:val="Listepuces"/>
-      </w:pPr>
-      <w:r>
-        <w:t>compute_distance_tcp_to_object() : distance restante TCP → objet (critère d’arrêt / prompt adaptatif).</w:t>
-      </w:r>
-    </w:p>
-    <w:p>
-      <w:r>
-        <w:t>Distinction essentielle : calibrer_robot.py crée le fichier une fois (ou après déplacement de la caméra) ; calibration.py réutilise ce fichier à chaque cycle perception → OpenVLA → RTDE.</w:t>
-      </w:r>
-    </w:p>
-    <w:p>
-      <w:pPr>
-        <w:pStyle w:val="Titre3"/>
-      </w:pPr>
-      <w:r>
-        <w:t>IV. Les 3 règles d’or pour les poses de calibration</w:t>
-      </w:r>
-    </w:p>
-    <w:p>
-      <w:pPr>
-        <w:pStyle w:val="Listepuces"/>
-      </w:pPr>
-      <w:r>
-        <w:t>Varier l’inclinaison : ne pas rester toujours à la verticale (RX=0, RY=3.14) ; incliner ±15° à ±25°.</w:t>
-      </w:r>
-    </w:p>
-    <w:p>
-      <w:pPr>
-        <w:pStyle w:val="Listepuces"/>
-      </w:pPr>
-      <w:r>
-        <w:t>Varier la hauteur Z : captures à environ 40 cm, 50 cm et 60 cm de la mire.</w:t>
-      </w:r>
-    </w:p>
-    <w:p>
-      <w:pPr>
-        <w:pStyle w:val="Listepuces"/>
-      </w:pPr>
-      <w:r>
-        <w:t>Rotation RZ : faire tourner l’outil sur lui-même pour enrichir les échantillons hand-eye.</w:t>
-      </w:r>
-    </w:p>
-    <w:p>
-      <w:pPr>
-        <w:pStyle w:val="Titre3"/>
-      </w:pPr>
-      <w:r>
-        <w:t>V. Rapport hebdomadaire et livrables jour 11</w:t>
-      </w:r>
-    </w:p>
-    <w:p>
-      <w:r>
-        <w:t>Rapport détaillé : OpenVLA_day11_rapport_hebdomadaire.docx. Dossier rapports_hebdomadaires/ pour les synthèses de fin de semaine.</w:t>
-      </w:r>
-    </w:p>
-    <w:p>
-      <w:pPr>
-        <w:pStyle w:val="Listepuces"/>
-      </w:pPr>
-      <w:r>
-        <w:t>Semaine 26–29 mai : boucle continue (jour 08), interprétation logs (jour 09), refactoring pipeline (jour 10).</w:t>
-      </w:r>
-    </w:p>
-    <w:p>
-      <w:pPr>
-        <w:pStyle w:val="Listepuces"/>
-      </w:pPr>
-      <w:r>
-        <w:t>Correction DINO : mapping pixel image → résolution point cloud Zivid (scale_u, scale_v).</w:t>
-      </w:r>
-    </w:p>
-    <w:p>
-      <w:pPr>
-        <w:pStyle w:val="Listepuces"/>
-      </w:pPr>
-      <w:r>
-        <w:t>Objectif semaine suivante : valider T_tcp_cam.npy en réel et tester main_real.py avec workspace.</w:t>
-      </w:r>
-    </w:p>
-    <w:p>
-      <w:pPr>
-        <w:rPr>
-          <w:lang w:val="fr-CA"/>
-        </w:rPr>
-      </w:pPr>
-      <w:r>
-        <w:rPr>
-          <w:lang w:val="fr-CA"/>
-        </w:rPr>
-        <w:t xml:space="preserve">   </w:t>
-      </w:r>
-      <w:proofErr w:type="gramStart"/>
-      <w:r>
-        <w:rPr>
-          <w:lang w:val="fr-CA"/>
-        </w:rPr>
-        <w:t>II.5  Flux</w:t>
-      </w:r>
-      <w:proofErr w:type="gramEnd"/>
-      <w:r>
-        <w:rPr>
-          <w:lang w:val="fr-CA"/>
-        </w:rPr>
-        <w:t xml:space="preserve"> de données robot, </w:t>
-      </w:r>
-      <w:proofErr w:type="spellStart"/>
-      <w:r>
-        <w:rPr>
-          <w:lang w:val="fr-CA"/>
-        </w:rPr>
-        <w:t>Zivid</w:t>
-      </w:r>
-      <w:proofErr w:type="spellEnd"/>
-      <w:r>
-        <w:rPr>
-          <w:lang w:val="fr-CA"/>
-        </w:rPr>
-        <w:t xml:space="preserve"> et interprétation </w:t>
-      </w:r>
-      <w:proofErr w:type="spellStart"/>
-      <w:r>
-        <w:rPr>
-          <w:lang w:val="fr-CA"/>
-        </w:rPr>
-        <w:t>OpenVLA</w:t>
-      </w:r>
-      <w:proofErr w:type="spellEnd"/>
-      <w:r>
-        <w:rPr>
-          <w:lang w:val="fr-CA"/>
-        </w:rPr>
-        <w:t xml:space="preserve"> (jour 07)</w:t>
-      </w:r>
-    </w:p>
-    <w:p>
-      <w:pPr>
-        <w:rPr>
-          <w:lang w:val="fr-CA"/>
-        </w:rPr>
-      </w:pPr>
-      <w:r>
-        <w:rPr>
-          <w:lang w:val="fr-CA"/>
-        </w:rPr>
-        <w:t xml:space="preserve">III. Comparaison </w:t>
-      </w:r>
-      <w:proofErr w:type="spellStart"/>
-      <w:r>
-        <w:rPr>
-          <w:lang w:val="fr-CA"/>
-        </w:rPr>
-        <w:t>OpenVLA</w:t>
-      </w:r>
-      <w:proofErr w:type="spellEnd"/>
-      <w:r>
-        <w:rPr>
-          <w:lang w:val="fr-CA"/>
-        </w:rPr>
-        <w:t xml:space="preserve"> et robotique traditionnelle</w:t>
-      </w:r>
-    </w:p>
-    <w:p>
-      <w:pPr>
-        <w:rPr>
-          <w:lang w:val="fr-CA"/>
-        </w:rPr>
-      </w:pPr>
-      <w:r>
-        <w:rPr>
-          <w:lang w:val="fr-CA"/>
-        </w:rPr>
-        <w:t xml:space="preserve">   </w:t>
-      </w:r>
-      <w:proofErr w:type="gramStart"/>
-      <w:r>
-        <w:rPr>
-          <w:lang w:val="fr-CA"/>
-        </w:rPr>
-        <w:t>III.1  Programmation</w:t>
-      </w:r>
-      <w:proofErr w:type="gramEnd"/>
-      <w:r>
-        <w:rPr>
-          <w:lang w:val="fr-CA"/>
-        </w:rPr>
-        <w:t xml:space="preserve"> de tâches</w:t>
-      </w:r>
-    </w:p>
-    <w:p>
-      <w:pPr>
-        <w:rPr>
-          <w:lang w:val="fr-CA"/>
-        </w:rPr>
-      </w:pPr>
-      <w:r>
-        <w:rPr>
-          <w:lang w:val="fr-CA"/>
-        </w:rPr>
-        <w:t xml:space="preserve">   </w:t>
-      </w:r>
-      <w:proofErr w:type="gramStart"/>
-      <w:r>
-        <w:rPr>
-          <w:lang w:val="fr-CA"/>
-        </w:rPr>
-        <w:t>III.2  Perception</w:t>
-      </w:r>
-      <w:proofErr w:type="gramEnd"/>
-      <w:r>
-        <w:rPr>
-          <w:lang w:val="fr-CA"/>
-        </w:rPr>
-        <w:t xml:space="preserve"> et représentation de la scène</w:t>
-      </w:r>
-    </w:p>
-    <w:p>
-      <w:pPr>
-        <w:rPr>
-          <w:lang w:val="fr-CA"/>
-        </w:rPr>
-      </w:pPr>
-      <w:r>
-        <w:rPr>
-          <w:lang w:val="fr-CA"/>
-        </w:rPr>
-        <w:t xml:space="preserve">   </w:t>
-      </w:r>
-      <w:proofErr w:type="gramStart"/>
-      <w:r>
-        <w:rPr>
-          <w:lang w:val="fr-CA"/>
-        </w:rPr>
-        <w:t>III.3  Planification</w:t>
-      </w:r>
-      <w:proofErr w:type="gramEnd"/>
-      <w:r>
-        <w:rPr>
-          <w:lang w:val="fr-CA"/>
-        </w:rPr>
-        <w:t>, contrôle et intégration</w:t>
-      </w:r>
-    </w:p>
-    <w:p>
-      <w:pPr>
-        <w:rPr>
-          <w:lang w:val="fr-CA"/>
-        </w:rPr>
-      </w:pPr>
-      <w:r>
-        <w:rPr>
-          <w:lang w:val="fr-CA"/>
-        </w:rPr>
-        <w:t xml:space="preserve">   </w:t>
-      </w:r>
-      <w:proofErr w:type="gramStart"/>
-      <w:r>
-        <w:rPr>
-          <w:lang w:val="fr-CA"/>
-        </w:rPr>
-        <w:t>III.4  Synthèse</w:t>
-      </w:r>
-      <w:proofErr w:type="gramEnd"/>
-      <w:r>
-        <w:rPr>
-          <w:lang w:val="fr-CA"/>
-        </w:rPr>
-        <w:t xml:space="preserve"> pour le démonstrateur CCNB-INNOV</w:t>
-      </w:r>
-    </w:p>
-    <w:p>
-      <w:pPr>
-        <w:rPr>
-          <w:lang w:val="fr-CA"/>
-        </w:rPr>
-      </w:pPr>
-      <w:r>
-        <w:rPr>
-          <w:lang w:val="fr-CA"/>
-        </w:rPr>
+      <w:r>
         <w:br w:type="page"/>
       </w:r>
     </w:p>
@@ -3726,6 +2742,35 @@
     </w:p>
     <w:p>
       <w:pPr>
+        <w:pStyle w:val="Titre1"/>
+        <w:rPr>
+          <w:lang w:val="fr-CA"/>
+        </w:rPr>
+      </w:pPr>
+      <w:r>
+        <w:rPr>
+          <w:lang w:val="fr-CA"/>
+        </w:rPr>
+        <w:lastRenderedPageBreak/>
+        <w:t xml:space="preserve">III. Comparaison </w:t>
+      </w:r>
+      <w:proofErr w:type="spellStart"/>
+      <w:r>
+        <w:rPr>
+          <w:lang w:val="fr-CA"/>
+        </w:rPr>
+        <w:t>OpenVLA</w:t>
+      </w:r>
+      <w:proofErr w:type="spellEnd"/>
+      <w:r>
+        <w:rPr>
+          <w:lang w:val="fr-CA"/>
+        </w:rPr>
+        <w:t xml:space="preserve"> et robotique traditionnelle</w:t>
+      </w:r>
+    </w:p>
+    <w:p>
+      <w:pPr>
         <w:pStyle w:val="Titre2"/>
         <w:rPr>
           <w:lang w:val="fr-CA"/>
@@ -3735,13 +2780,296 @@
         <w:rPr>
           <w:lang w:val="fr-CA"/>
         </w:rPr>
-        <w:t xml:space="preserve">II.5 Flux de données robot, </w:t>
-      </w:r>
+        <w:t>III.1 Programmation de tâches</w:t>
+      </w:r>
+    </w:p>
+    <w:p>
+      <w:pPr>
+        <w:rPr>
+          <w:lang w:val="fr-CA"/>
+        </w:rPr>
+      </w:pPr>
       <w:proofErr w:type="spellStart"/>
       <w:r>
         <w:rPr>
           <w:lang w:val="fr-CA"/>
         </w:rPr>
+        <w:t>OpenVLA</w:t>
+      </w:r>
+      <w:proofErr w:type="spellEnd"/>
+      <w:r>
+        <w:rPr>
+          <w:lang w:val="fr-CA"/>
+        </w:rPr>
+        <w:t xml:space="preserve"> peut aider le robot à : mieux comprendre la scène ; mieux choisir l'action ; mieux adapter le mouvement.</w:t>
+      </w:r>
+    </w:p>
+    <w:p>
+      <w:pPr>
+        <w:pStyle w:val="Titre3"/>
+        <w:rPr>
+          <w:lang w:val="fr-CA"/>
+        </w:rPr>
+      </w:pPr>
+      <w:r>
+        <w:rPr>
+          <w:lang w:val="fr-CA"/>
+        </w:rPr>
+        <w:t>III.1 — Robotique classique seule</w:t>
+      </w:r>
+    </w:p>
+    <w:p>
+      <w:pPr>
+        <w:rPr>
+          <w:lang w:val="fr-CA"/>
+        </w:rPr>
+      </w:pPr>
+      <w:r>
+        <w:rPr>
+          <w:lang w:val="fr-CA"/>
+        </w:rPr>
+        <w:t>En robotique classique seule, le robot peut aller précisément au XYZ. Mais il ne comprend pas forcément quoi prendre, dans quel ordre, ni comment s'adapter au contexte.</w:t>
+      </w:r>
+    </w:p>
+    <w:p>
+      <w:pPr>
+        <w:pStyle w:val="Titre3"/>
+      </w:pPr>
+      <w:r>
+        <w:t xml:space="preserve">III.1 — Ce </w:t>
+      </w:r>
+      <w:proofErr w:type="spellStart"/>
+      <w:r>
+        <w:t>qu'OpenVLA</w:t>
+      </w:r>
+      <w:proofErr w:type="spellEnd"/>
+      <w:r>
+        <w:t xml:space="preserve"> ajoute</w:t>
+      </w:r>
+    </w:p>
+    <w:p>
+      <w:pPr>
+        <w:pStyle w:val="Listepuces"/>
+        <w:rPr>
+          <w:lang w:val="fr-CA"/>
+        </w:rPr>
+      </w:pPr>
+      <w:r>
+        <w:rPr>
+          <w:lang w:val="fr-CA"/>
+        </w:rPr>
+        <w:t>Compréhension du langage (consignes en langage naturel).</w:t>
+      </w:r>
+    </w:p>
+    <w:p>
+      <w:pPr>
+        <w:pStyle w:val="Listepuces"/>
+        <w:rPr>
+          <w:lang w:val="fr-CA"/>
+        </w:rPr>
+      </w:pPr>
+      <w:r>
+        <w:rPr>
+          <w:lang w:val="fr-CA"/>
+        </w:rPr>
+        <w:t>Stratégie et planification implicite dans le modèle VLA.</w:t>
+      </w:r>
+    </w:p>
+    <w:p>
+      <w:pPr>
+        <w:pStyle w:val="Listepuces"/>
+      </w:pPr>
+      <w:r>
+        <w:t xml:space="preserve">Adaptation et </w:t>
+      </w:r>
+      <w:proofErr w:type="spellStart"/>
+      <w:r>
+        <w:t>comportement</w:t>
+      </w:r>
+      <w:proofErr w:type="spellEnd"/>
+      <w:r>
+        <w:t xml:space="preserve"> </w:t>
+      </w:r>
+      <w:proofErr w:type="spellStart"/>
+      <w:r>
+        <w:t>contextuel</w:t>
+      </w:r>
+      <w:proofErr w:type="spellEnd"/>
+      <w:r>
+        <w:t>.</w:t>
+      </w:r>
+    </w:p>
+    <w:p>
+      <w:pPr>
+        <w:rPr>
+          <w:lang w:val="fr-CA"/>
+        </w:rPr>
+      </w:pPr>
+      <w:r>
+        <w:rPr>
+          <w:lang w:val="fr-CA"/>
+        </w:rPr>
+        <w:t>Exemples de consignes que le classique peine à interpréter seul : « la tasse est derrière un obstacle » ; « ouvrir le tiroir avant ».</w:t>
+      </w:r>
+    </w:p>
+    <w:p>
+      <w:pPr>
+        <w:rPr>
+          <w:lang w:val="fr-CA"/>
+        </w:rPr>
+      </w:pPr>
+      <w:r>
+        <w:rPr>
+          <w:lang w:val="fr-CA"/>
+        </w:rPr>
+        <w:t>Le démonstrateur du stage reste hybride : RTDE/</w:t>
+      </w:r>
+      <w:proofErr w:type="spellStart"/>
+      <w:r>
+        <w:rPr>
+          <w:lang w:val="fr-CA"/>
+        </w:rPr>
+        <w:t>URScript</w:t>
+      </w:r>
+      <w:proofErr w:type="spellEnd"/>
+      <w:r>
+        <w:rPr>
+          <w:lang w:val="fr-CA"/>
+        </w:rPr>
+        <w:t xml:space="preserve"> pour l'exécution prévisible, </w:t>
+      </w:r>
+      <w:proofErr w:type="spellStart"/>
+      <w:r>
+        <w:rPr>
+          <w:lang w:val="fr-CA"/>
+        </w:rPr>
+        <w:t>OpenVLA</w:t>
+      </w:r>
+      <w:proofErr w:type="spellEnd"/>
+      <w:r>
+        <w:rPr>
+          <w:lang w:val="fr-CA"/>
+        </w:rPr>
+        <w:t xml:space="preserve"> pour la décision image + langage → action.</w:t>
+      </w:r>
+    </w:p>
+    <w:p/>
+    <w:p>
+      <w:pPr>
+        <w:pStyle w:val="Titre2"/>
+        <w:rPr>
+          <w:lang w:val="fr-CA"/>
+        </w:rPr>
+      </w:pPr>
+      <w:r>
+        <w:rPr>
+          <w:lang w:val="fr-CA"/>
+        </w:rPr>
+        <w:t>III.2 Perception et représentation de la scène</w:t>
+      </w:r>
+    </w:p>
+    <w:p>
+      <w:pPr>
+        <w:rPr>
+          <w:lang w:val="fr-CA"/>
+        </w:rPr>
+      </w:pPr>
+      <w:r>
+        <w:rPr>
+          <w:lang w:val="fr-CA"/>
+        </w:rPr>
+        <w:t>Robot classique — il sait où est la cible (ex. où est la balle), mais il peut heurter l'obstacle, ne pas comprendre la scène dans son ensemble, ou échouer si la trajectoire change.</w:t>
+      </w:r>
+    </w:p>
+    <w:p>
+      <w:pPr>
+        <w:rPr>
+          <w:lang w:val="fr-CA"/>
+        </w:rPr>
+      </w:pPr>
+      <w:proofErr w:type="spellStart"/>
+      <w:r>
+        <w:rPr>
+          <w:lang w:val="fr-CA"/>
+        </w:rPr>
+        <w:t>OpenVLA</w:t>
+      </w:r>
+      <w:proofErr w:type="spellEnd"/>
+      <w:r>
+        <w:rPr>
+          <w:lang w:val="fr-CA"/>
+        </w:rPr>
+        <w:t xml:space="preserve"> peut comprendre une consigne du type « il y a un obstacle » et orienter la décision : contourner, déplacer un objet, changer l'approche, réessayer autrement.</w:t>
+      </w:r>
+    </w:p>
+    <w:p>
+      <w:pPr>
+        <w:pStyle w:val="Listepuces"/>
+        <w:rPr>
+          <w:lang w:val="fr-CA"/>
+        </w:rPr>
+      </w:pPr>
+      <w:r>
+        <w:rPr>
+          <w:lang w:val="fr-CA"/>
+        </w:rPr>
+        <w:t>Traditionnel : calibration caméra-robot, extraction de primitives (contours, nuage de points PLY), règles ou algorithmes dédiés.</w:t>
+      </w:r>
+    </w:p>
+    <w:p>
+      <w:pPr>
+        <w:pStyle w:val="Listepuces"/>
+        <w:rPr>
+          <w:lang w:val="fr-CA"/>
+        </w:rPr>
+      </w:pPr>
+      <w:proofErr w:type="spellStart"/>
+      <w:r>
+        <w:rPr>
+          <w:lang w:val="fr-CA"/>
+        </w:rPr>
+        <w:t>OpenVLA</w:t>
+      </w:r>
+      <w:proofErr w:type="spellEnd"/>
+      <w:r>
+        <w:rPr>
+          <w:lang w:val="fr-CA"/>
+        </w:rPr>
+        <w:t xml:space="preserve"> : end-to-end à partir d'une image RGB ; le modèle apprend implicitement les corrélations </w:t>
+      </w:r>
+      <w:proofErr w:type="spellStart"/>
+      <w:r>
+        <w:rPr>
+          <w:lang w:val="fr-CA"/>
+        </w:rPr>
+        <w:t>visuo-motrices</w:t>
+      </w:r>
+      <w:proofErr w:type="spellEnd"/>
+      <w:r>
+        <w:rPr>
+          <w:lang w:val="fr-CA"/>
+        </w:rPr>
+        <w:t>.</w:t>
+      </w:r>
+    </w:p>
+    <w:p>
+      <w:pPr>
+        <w:pStyle w:val="Listepuces"/>
+        <w:rPr>
+          <w:lang w:val="fr-CA"/>
+        </w:rPr>
+      </w:pPr>
+      <w:r>
+        <w:rPr>
+          <w:lang w:val="fr-CA"/>
+        </w:rPr>
+        <w:t xml:space="preserve">Stage : </w:t>
+      </w:r>
+      <w:proofErr w:type="spellStart"/>
+      <w:r>
+        <w:rPr>
+          <w:lang w:val="fr-CA"/>
+        </w:rPr>
         <w:t>Zivid</w:t>
       </w:r>
       <w:proofErr w:type="spellEnd"/>
@@ -3749,7 +3077,7 @@
         <w:rPr>
           <w:lang w:val="fr-CA"/>
         </w:rPr>
-        <w:t xml:space="preserve"> et interprétation </w:t>
+        <w:t xml:space="preserve"> fournit 2D et 3D ; </w:t>
       </w:r>
       <w:proofErr w:type="spellStart"/>
       <w:r>
@@ -3763,7 +3091,510 @@
         <w:rPr>
           <w:lang w:val="fr-CA"/>
         </w:rPr>
-        <w:t xml:space="preserve"> (jour 07)</w:t>
+        <w:t xml:space="preserve"> consomme le RGB 224×224. YOLOv8n (classes COCO) ou </w:t>
+      </w:r>
+      <w:proofErr w:type="spellStart"/>
+      <w:r>
+        <w:rPr>
+          <w:lang w:val="fr-CA"/>
+        </w:rPr>
+        <w:t>Grounding</w:t>
+      </w:r>
+      <w:proofErr w:type="spellEnd"/>
+      <w:r>
+        <w:rPr>
+          <w:lang w:val="fr-CA"/>
+        </w:rPr>
+        <w:t xml:space="preserve"> DINO (texte libre) relient détection 2D au nuage de points (Figure 2). </w:t>
+      </w:r>
+      <w:r>
+        <w:t xml:space="preserve">Voir </w:t>
+      </w:r>
+      <w:proofErr w:type="spellStart"/>
+      <w:r>
+        <w:t>comparaison</w:t>
+      </w:r>
+      <w:proofErr w:type="spellEnd"/>
+      <w:r>
+        <w:t xml:space="preserve"> jour 07.</w:t>
+      </w:r>
+    </w:p>
+    <w:p>
+      <w:pPr>
+        <w:pStyle w:val="Titre2"/>
+      </w:pPr>
+      <w:r>
+        <w:lastRenderedPageBreak/>
+        <w:t xml:space="preserve">III.3 Planification, </w:t>
+      </w:r>
+      <w:proofErr w:type="spellStart"/>
+      <w:r>
+        <w:t>contrôle</w:t>
+      </w:r>
+      <w:proofErr w:type="spellEnd"/>
+      <w:r>
+        <w:t xml:space="preserve"> et </w:t>
+      </w:r>
+      <w:proofErr w:type="spellStart"/>
+      <w:r>
+        <w:t>intégration</w:t>
+      </w:r>
+      <w:proofErr w:type="spellEnd"/>
+    </w:p>
+    <w:p>
+      <w:r>
+        <w:t>OpenVLA aide surtout à :</w:t>
+      </w:r>
+    </w:p>
+    <w:p>
+      <w:pPr>
+        <w:pStyle w:val="Listepuces"/>
+        <w:rPr>
+          <w:lang w:val="fr-CA"/>
+        </w:rPr>
+      </w:pPr>
+      <w:r>
+        <w:rPr>
+          <w:lang w:val="fr-CA"/>
+        </w:rPr>
+        <w:t>Raisonner et planifier à partir de la scène et du langage.</w:t>
+      </w:r>
+    </w:p>
+    <w:p>
+      <w:pPr>
+        <w:pStyle w:val="Listepuces"/>
+        <w:rPr>
+          <w:lang w:val="fr-CA"/>
+        </w:rPr>
+      </w:pPr>
+      <w:r>
+        <w:rPr>
+          <w:lang w:val="fr-CA"/>
+        </w:rPr>
+        <w:t>Adapter le mouvement et corriger en boucle fermée.</w:t>
+      </w:r>
+    </w:p>
+    <w:p>
+      <w:pPr>
+        <w:pStyle w:val="Listepuces"/>
+        <w:rPr>
+          <w:lang w:val="fr-CA"/>
+        </w:rPr>
+      </w:pPr>
+      <w:r>
+        <w:rPr>
+          <w:lang w:val="fr-CA"/>
+        </w:rPr>
+        <w:t>Gérer des scènes complexes et comprendre le langage humain.</w:t>
+      </w:r>
+    </w:p>
+    <w:p>
+      <w:pPr>
+        <w:pStyle w:val="Listepuces"/>
+        <w:rPr>
+          <w:lang w:val="fr-CA"/>
+        </w:rPr>
+      </w:pPr>
+      <w:r>
+        <w:rPr>
+          <w:lang w:val="fr-CA"/>
+        </w:rPr>
+        <w:t xml:space="preserve">Traditionnel : planification explicite (trajectoires </w:t>
+      </w:r>
+      <w:proofErr w:type="spellStart"/>
+      <w:r>
+        <w:rPr>
+          <w:lang w:val="fr-CA"/>
+        </w:rPr>
+        <w:t>movej</w:t>
+      </w:r>
+      <w:proofErr w:type="spellEnd"/>
+      <w:r>
+        <w:rPr>
+          <w:lang w:val="fr-CA"/>
+        </w:rPr>
+        <w:t>/</w:t>
+      </w:r>
+      <w:proofErr w:type="spellStart"/>
+      <w:r>
+        <w:rPr>
+          <w:lang w:val="fr-CA"/>
+        </w:rPr>
+        <w:t>movel</w:t>
+      </w:r>
+      <w:proofErr w:type="spellEnd"/>
+      <w:r>
+        <w:rPr>
+          <w:lang w:val="fr-CA"/>
+        </w:rPr>
+        <w:t>), contrôle PID ou servos RTDE, séquence déterministe.</w:t>
+      </w:r>
+    </w:p>
+    <w:p>
+      <w:pPr>
+        <w:pStyle w:val="Listepuces"/>
+        <w:rPr>
+          <w:lang w:val="fr-CA"/>
+        </w:rPr>
+      </w:pPr>
+      <w:proofErr w:type="spellStart"/>
+      <w:r>
+        <w:rPr>
+          <w:lang w:val="fr-CA"/>
+        </w:rPr>
+        <w:t>OpenVLA</w:t>
+      </w:r>
+      <w:proofErr w:type="spellEnd"/>
+      <w:r>
+        <w:rPr>
+          <w:lang w:val="fr-CA"/>
+        </w:rPr>
+        <w:t xml:space="preserve"> : planification implicite dans le LLM ; sortie = delta d'action instantané, adapté au contrôle itératif (</w:t>
+      </w:r>
+      <w:proofErr w:type="spellStart"/>
+      <w:r>
+        <w:rPr>
+          <w:lang w:val="fr-CA"/>
+        </w:rPr>
+        <w:t>receding</w:t>
+      </w:r>
+      <w:proofErr w:type="spellEnd"/>
+      <w:r>
+        <w:rPr>
+          <w:lang w:val="fr-CA"/>
+        </w:rPr>
+        <w:t xml:space="preserve"> horizon).</w:t>
+      </w:r>
+    </w:p>
+    <w:p>
+      <w:pPr>
+        <w:pStyle w:val="Listepuces"/>
+        <w:rPr>
+          <w:lang w:val="fr-CA"/>
+        </w:rPr>
+      </w:pPr>
+      <w:r>
+        <w:rPr>
+          <w:lang w:val="fr-CA"/>
+        </w:rPr>
+        <w:t>Avantage traditionnel : prévisibilité, sécurité, traçabilité des mouvements (validé jour 03 — tracé A).</w:t>
+      </w:r>
+    </w:p>
+    <w:p>
+      <w:pPr>
+        <w:pStyle w:val="Listepuces"/>
+        <w:rPr>
+          <w:lang w:val="fr-CA"/>
+        </w:rPr>
+      </w:pPr>
+      <w:r>
+        <w:rPr>
+          <w:lang w:val="fr-CA"/>
+        </w:rPr>
+        <w:t xml:space="preserve">Avantage </w:t>
+      </w:r>
+      <w:proofErr w:type="spellStart"/>
+      <w:r>
+        <w:rPr>
+          <w:lang w:val="fr-CA"/>
+        </w:rPr>
+        <w:t>OpenVLA</w:t>
+      </w:r>
+      <w:proofErr w:type="spellEnd"/>
+      <w:r>
+        <w:rPr>
+          <w:lang w:val="fr-CA"/>
+        </w:rPr>
+        <w:t xml:space="preserve"> : flexibilité sémantique, </w:t>
+      </w:r>
+      <w:proofErr w:type="spellStart"/>
+      <w:r>
+        <w:rPr>
+          <w:lang w:val="fr-CA"/>
+        </w:rPr>
+        <w:t>generalisation</w:t>
+      </w:r>
+      <w:proofErr w:type="spellEnd"/>
+      <w:r>
+        <w:rPr>
+          <w:lang w:val="fr-CA"/>
+        </w:rPr>
+        <w:t xml:space="preserve"> à de nouvelles consignes sans reprogrammation complète.</w:t>
+      </w:r>
+    </w:p>
+    <w:p>
+      <w:pPr>
+        <w:pStyle w:val="Titre2"/>
+        <w:rPr>
+          <w:lang w:val="fr-CA"/>
+        </w:rPr>
+      </w:pPr>
+      <w:r>
+        <w:rPr>
+          <w:lang w:val="fr-CA"/>
+        </w:rPr>
+        <w:t>III.4 Synthèse pour le démonstrateur CCNB-INNOV</w:t>
+      </w:r>
+    </w:p>
+    <w:p>
+      <w:pPr>
+        <w:rPr>
+          <w:lang w:val="fr-CA"/>
+        </w:rPr>
+      </w:pPr>
+      <w:r>
+        <w:rPr>
+          <w:lang w:val="fr-CA"/>
+        </w:rPr>
+        <w:t xml:space="preserve">Tandis que Zivid + nuage de points fournissent la géométrie précise (RGB, profondeur, XYZ en mètres), </w:t>
+      </w:r>
+      <w:proofErr w:type="spellStart"/>
+      <w:r>
+        <w:rPr>
+          <w:lang w:val="fr-CA"/>
+        </w:rPr>
+        <w:t>OpenVLA</w:t>
+      </w:r>
+      <w:proofErr w:type="spellEnd"/>
+      <w:r>
+        <w:rPr>
+          <w:lang w:val="fr-CA"/>
+        </w:rPr>
+        <w:t xml:space="preserve"> apporte la couche sémantique et décisionnelle au-dessus de cette perception.</w:t>
+      </w:r>
+    </w:p>
+    <w:p>
+      <w:pPr>
+        <w:rPr>
+          <w:lang w:val="fr-CA"/>
+        </w:rPr>
+      </w:pPr>
+      <w:r>
+        <w:rPr>
+          <w:lang w:val="fr-CA"/>
+        </w:rPr>
+        <w:t>Le démonstrateur du stage adopte une approche hybride pragmatique :</w:t>
+      </w:r>
+    </w:p>
+    <w:p>
+      <w:pPr>
+        <w:pStyle w:val="Listepuces"/>
+        <w:rPr>
+          <w:lang w:val="fr-CA"/>
+        </w:rPr>
+      </w:pPr>
+      <w:r>
+        <w:rPr>
+          <w:lang w:val="fr-CA"/>
+        </w:rPr>
+        <w:t>Robotique classique pour valider l'exécution (</w:t>
+      </w:r>
+      <w:proofErr w:type="spellStart"/>
+      <w:r>
+        <w:rPr>
+          <w:lang w:val="fr-CA"/>
+        </w:rPr>
+        <w:t>URScript</w:t>
+      </w:r>
+      <w:proofErr w:type="spellEnd"/>
+      <w:r>
+        <w:rPr>
+          <w:lang w:val="fr-CA"/>
+        </w:rPr>
+        <w:t>, RTDE) et sécuriser les mouvements.</w:t>
+      </w:r>
+    </w:p>
+    <w:p>
+      <w:pPr>
+        <w:pStyle w:val="Listepuces"/>
+        <w:rPr>
+          <w:lang w:val="fr-CA"/>
+        </w:rPr>
+      </w:pPr>
+      <w:proofErr w:type="spellStart"/>
+      <w:r>
+        <w:rPr>
+          <w:lang w:val="fr-CA"/>
+        </w:rPr>
+        <w:t>OpenVLA</w:t>
+      </w:r>
+      <w:proofErr w:type="spellEnd"/>
+      <w:r>
+        <w:rPr>
+          <w:lang w:val="fr-CA"/>
+        </w:rPr>
+        <w:t xml:space="preserve"> pour la couche décisionnelle haute niveau (image + langage → action).</w:t>
+      </w:r>
+    </w:p>
+    <w:p>
+      <w:pPr>
+        <w:pStyle w:val="Listepuces"/>
+        <w:rPr>
+          <w:lang w:val="fr-CA"/>
+        </w:rPr>
+      </w:pPr>
+      <w:r>
+        <w:rPr>
+          <w:lang w:val="fr-CA"/>
+        </w:rPr>
+        <w:t>Zivid comme capteur riche (2D/3D) alimentant la perception.</w:t>
+      </w:r>
+    </w:p>
+    <w:p>
+      <w:pPr>
+        <w:pStyle w:val="Listepuces"/>
+        <w:rPr>
+          <w:lang w:val="fr-CA"/>
+        </w:rPr>
+      </w:pPr>
+      <w:r>
+        <w:rPr>
+          <w:lang w:val="fr-CA"/>
+        </w:rPr>
+        <w:t>Environnements Conda Python 3.11 séparés (</w:t>
+      </w:r>
+      <w:proofErr w:type="spellStart"/>
+      <w:r>
+        <w:rPr>
+          <w:lang w:val="fr-CA"/>
+        </w:rPr>
+        <w:t>env_zivid</w:t>
+      </w:r>
+      <w:proofErr w:type="spellEnd"/>
+      <w:r>
+        <w:rPr>
+          <w:lang w:val="fr-CA"/>
+        </w:rPr>
+        <w:t xml:space="preserve">, </w:t>
+      </w:r>
+      <w:proofErr w:type="spellStart"/>
+      <w:r>
+        <w:rPr>
+          <w:lang w:val="fr-CA"/>
+        </w:rPr>
+        <w:t>env_ur</w:t>
+      </w:r>
+      <w:proofErr w:type="spellEnd"/>
+      <w:r>
+        <w:rPr>
+          <w:lang w:val="fr-CA"/>
+        </w:rPr>
+        <w:t xml:space="preserve">, </w:t>
+      </w:r>
+      <w:proofErr w:type="spellStart"/>
+      <w:r>
+        <w:rPr>
+          <w:lang w:val="fr-CA"/>
+        </w:rPr>
+        <w:t>env_integration</w:t>
+      </w:r>
+      <w:proofErr w:type="spellEnd"/>
+      <w:r>
+        <w:rPr>
+          <w:lang w:val="fr-CA"/>
+        </w:rPr>
+        <w:t xml:space="preserve">, </w:t>
+      </w:r>
+      <w:proofErr w:type="spellStart"/>
+      <w:r>
+        <w:rPr>
+          <w:lang w:val="fr-CA"/>
+        </w:rPr>
+        <w:t>env_openvla</w:t>
+      </w:r>
+      <w:proofErr w:type="spellEnd"/>
+      <w:r>
+        <w:rPr>
+          <w:lang w:val="fr-CA"/>
+        </w:rPr>
+        <w:t>) puis convergence vers l'intégration.</w:t>
+      </w:r>
+    </w:p>
+    <w:p>
+      <w:pPr>
+        <w:pStyle w:val="Titre1"/>
+      </w:pPr>
+      <w:r>
+        <w:t>IV. Tests et intégration</w:t>
+      </w:r>
+    </w:p>
+    <w:p>
+      <w:pPr>
+        <w:pStyle w:val="Titre2"/>
+        <w:rPr>
+          <w:lang w:val="fr-CA"/>
+        </w:rPr>
+      </w:pPr>
+      <w:r>
+        <w:rPr>
+          <w:lang w:val="fr-CA"/>
+        </w:rPr>
+        <w:t>IV.1 Flux de données robot, Zivid et interprétation OpenVLA (jour 07)</w:t>
+      </w:r>
+      <w:proofErr w:type="spellStart"/>
+      <w:r>
+        <w:rPr>
+          <w:lang w:val="fr-CA"/>
+        </w:rPr>
+      </w:r>
+      <w:proofErr w:type="spellEnd"/>
+      <w:r>
+        <w:rPr>
+          <w:lang w:val="fr-CA"/>
+        </w:rPr>
+      </w:r>
+      <w:proofErr w:type="spellStart"/>
+      <w:r>
+        <w:rPr>
+          <w:lang w:val="fr-CA"/>
+        </w:rPr>
+      </w:r>
+      <w:proofErr w:type="spellEnd"/>
+      <w:r>
+        <w:rPr>
+          <w:lang w:val="fr-CA"/>
+        </w:rPr>
+      </w:r>
+    </w:p>
+    <w:p>
+      <w:pPr>
+        <w:pStyle w:val="Titre1"/>
+      </w:pPr>
+      <w:r>
+        <w:t>V. Pipeline final du démonstrateur</w:t>
+      </w:r>
+    </w:p>
+    <w:p>
+      <w:pPr>
+        <w:pStyle w:val="Titre2"/>
+      </w:pPr>
+      <w:r>
+        <w:t>V.1 Jour 10 — Refactoring pipeline (modules pipeline/)</w:t>
+      </w:r>
+    </w:p>
+    <w:p>
+      <w:pPr/>
+      <w:r>
+        <w:t>Objectif : découper le démonstrateur en modules indépendants (config, capture Zivid avec distance max, détection Grounding DINO avec sauvegarde (u,v), calibration caméra→robot obligatoire, contrôleur UR16e avec limites workspace, pince Robotiq, contrôleur OpenVLA avec prompt dynamique basé sur la distance TCP→objet).</w:t>
+      </w:r>
+    </w:p>
+    <w:p>
+      <w:pPr/>
+      <w:r>
+        <w:t>Points critiques : (1) calibration main-œil absente = bug majeur ; (2) ajouter une limite de workspace côté UR ; (3) réintégrer DINO périodiquement dans la boucle pour corriger la dérive ; (4) préférer un prompt relatif (distance restante) aux coordonnées absolues.</w:t>
+      </w:r>
+    </w:p>
+    <w:p>
+      <w:pPr>
+        <w:pStyle w:val="Titre2"/>
+      </w:pPr>
+      <w:r>
+        <w:t>V.2 Jour 11 — Calibration caméra → robot (T_tcp_cam)</w:t>
+      </w:r>
+    </w:p>
+    <w:p>
+      <w:r>
+        <w:t>Le 29 mai 2026 (jour 11), le démonstrateur intègre la calibration main-œil (eye-in-hand) UR16e + Zivid. Cette section distingue la création du fichier de calibration (script autonome) de son utilisation à chaque exécution du pipeline OpenVLA.</w:t>
       </w:r>
     </w:p>
     <w:p>
@@ -3771,19 +3602,33 @@
         <w:pStyle w:val="Titre3"/>
       </w:pPr>
       <w:r>
-        <w:t>Jour 10 — refactoring pipeline (UR16e, Zivid, DINO, OpenVLA)</w:t>
-      </w:r>
-    </w:p>
-    <w:p>
-      <w:pPr/>
-      <w:r>
-        <w:t>Objectif : découper le démonstrateur en modules indépendants (config, capture Zivid avec distance max, détection Grounding DINO avec sauvegarde (u,v), calibration caméra→robot obligatoire, contrôleur UR16e avec limites workspace, pince Robotiq, contrôleur OpenVLA avec prompt dynamique basé sur la distance TCP→objet).</w:t>
-      </w:r>
-    </w:p>
-    <w:p>
-      <w:pPr/>
-      <w:r>
-        <w:t>Points critiques : (1) calibration main-œil absente = bug majeur ; (2) ajouter une limite de workspace côté UR ; (3) réintégrer DINO périodiquement dans la boucle pour corriger la dérive ; (4) préférer un prompt relatif (distance restante) aux coordonnées absolues.</w:t>
+        <w:t>V.2.1 Le fichier T_tcp_cam.npy — traducteur entre caméra et robot</w:t>
+      </w:r>
+    </w:p>
+    <w:p>
+      <w:r>
+        <w:t>La matrice homogène 4×4 T_tcp_cam relie le repère de la caméra Zivid (montée sur le TCP) au repère outil du robot. Sans ce fichier, les coordonnées 3D issues de Grounding DINO (repère caméra) ne peuvent pas être converties en positions fiables pour le UR16e.</w:t>
+      </w:r>
+    </w:p>
+    <w:p>
+      <w:pPr>
+        <w:pStyle w:val="Listepuces"/>
+      </w:pPr>
+      <w:r>
+        <w:t>Caméra : « l’objet est à gauche et devant moi » (repère optique Zivid).</w:t>
+      </w:r>
+    </w:p>
+    <w:p>
+      <w:pPr>
+        <w:pStyle w:val="Listepuces"/>
+      </w:pPr>
+      <w:r>
+        <w:t>Robot : « je me déplace dans la base UR » — il ne connaît pas la « gauche » de la caméra.</w:t>
+      </w:r>
+    </w:p>
+    <w:p>
+      <w:r>
+        <w:t>Fichier produit : T_tcp_cam.npy (chemin CALIBRATION_FILE dans pipeline/config.py). Sauvegarde avec numpy : np.save(CALIBRATION_FILE, T_tcp_cam) après calibration réussie.</w:t>
       </w:r>
     </w:p>
     <w:p>
@@ -3791,7 +3636,168 @@
         <w:pStyle w:val="Titre3"/>
       </w:pPr>
       <w:r>
-        <w:t>Jour 09 : rapport d'expérimentation et interprétation des résultats de la boucle continue.</w:t>
+        <w:t>V.2.2 pipeline/calibrer_robot.py — script autonome (création du fichier)</w:t>
+      </w:r>
+    </w:p>
+    <w:p>
+      <w:r>
+        <w:t>Ce script s’exécute seul, indépendamment de main_real.py et main_sim.py. Il sert uniquement à générer ou régénérer T_tcp_cam.npy avant les runs du pipeline.</w:t>
+      </w:r>
+    </w:p>
+    <w:p>
+      <w:pPr>
+        <w:pStyle w:val="Listepuces"/>
+      </w:pPr>
+      <w:r>
+        <w:t>Connexion Zivid (zivid.Application, connect_camera) et UR16e (RTDE).</w:t>
+      </w:r>
+    </w:p>
+    <w:p>
+      <w:pPr>
+        <w:pStyle w:val="Listepuces"/>
+      </w:pPr>
+      <w:r>
+        <w:t>Pour chaque pose de calibration : déplacement moveL, lecture TCP, capture Zivid (camera.capture()), détection de la mire damier noir et blanc via zivid.calibration.detect_feature_points(frame.point_cloud()).</w:t>
+      </w:r>
+    </w:p>
+    <w:p>
+      <w:pPr>
+        <w:pStyle w:val="Listepuces"/>
+      </w:pPr>
+      <w:r>
+        <w:t>Accumulation des échantillons HandEyeInput (pose robot + détection valide), puis zivid.calibration.calibrate_eye_in_hand(detection_results).</w:t>
+      </w:r>
+    </w:p>
+    <w:p>
+      <w:pPr>
+        <w:pStyle w:val="Listepuces"/>
+      </w:pPr>
+      <w:r>
+        <w:t>Si result.valid() : extraction de T_tcp_cam = result.transform() et np.save vers T_tcp_cam.npy.</w:t>
+      </w:r>
+    </w:p>
+    <w:p>
+      <w:r>
+        <w:t>Lancement typique (depuis la racine du projet, environnement Zivid + RTDE) : python -m pipeline.calibrer_robot</w:t>
+      </w:r>
+    </w:p>
+    <w:p>
+      <w:pPr>
+        <w:pStyle w:val="Titre3"/>
+      </w:pPr>
+      <w:r>
+        <w:t>V.2.3 pipeline/calibration.py — utilisé à chaque run OpenVLA</w:t>
+      </w:r>
+    </w:p>
+    <w:p>
+      <w:r>
+        <w:t>À chaque exécution du pipeline (main_real.py, boucle adaptative), calibration.py charge T_tcp_cam.npy via load_calibration() et convertit les coordonnées caméra → base robot avec cam_to_robot(xyz_cam_m, tcp_pose, T_tcp_cam) lors des déplacements guidés par OpenVLA.</w:t>
+      </w:r>
+    </w:p>
+    <w:p>
+      <w:pPr>
+        <w:pStyle w:val="Listepuces"/>
+      </w:pPr>
+      <w:r>
+        <w:t>load_calibration() : np.load si le fichier existe ; sinon matrice identité (mode non calibré).</w:t>
+      </w:r>
+    </w:p>
+    <w:p>
+      <w:pPr>
+        <w:pStyle w:val="Listepuces"/>
+      </w:pPr>
+      <w:r>
+        <w:t>cam_to_robot() : chaîne T_base_tcp @ T_tcp_cam @ P_cam pour placer l’objet détecté dans la base UR.</w:t>
+      </w:r>
+    </w:p>
+    <w:p>
+      <w:pPr>
+        <w:pStyle w:val="Listepuces"/>
+      </w:pPr>
+      <w:r>
+        <w:t>compute_distance_tcp_to_object() : distance restante TCP → objet (critère d’arrêt / prompt adaptatif).</w:t>
+      </w:r>
+    </w:p>
+    <w:p>
+      <w:r>
+        <w:t>Distinction essentielle : calibrer_robot.py crée le fichier une fois (ou après déplacement de la caméra) ; calibration.py réutilise ce fichier à chaque cycle perception → OpenVLA → RTDE.</w:t>
+      </w:r>
+    </w:p>
+    <w:p>
+      <w:pPr>
+        <w:pStyle w:val="Titre3"/>
+      </w:pPr>
+      <w:r>
+        <w:t>V.2.4 Les 3 règles d’or pour les poses de calibration</w:t>
+      </w:r>
+    </w:p>
+    <w:p>
+      <w:pPr>
+        <w:pStyle w:val="Listepuces"/>
+      </w:pPr>
+      <w:r>
+        <w:t>Varier l’inclinaison : ne pas rester toujours à la verticale (RX=0, RY=3.14) ; incliner ±15° à ±25°.</w:t>
+      </w:r>
+    </w:p>
+    <w:p>
+      <w:pPr>
+        <w:pStyle w:val="Listepuces"/>
+      </w:pPr>
+      <w:r>
+        <w:t>Varier la hauteur Z : captures à environ 40 cm, 50 cm et 60 cm de la mire.</w:t>
+      </w:r>
+    </w:p>
+    <w:p>
+      <w:pPr>
+        <w:pStyle w:val="Listepuces"/>
+      </w:pPr>
+      <w:r>
+        <w:t>Rotation RZ : faire tourner l’outil sur lui-même pour enrichir les échantillons hand-eye.</w:t>
+      </w:r>
+    </w:p>
+    <w:p>
+      <w:pPr>
+        <w:pStyle w:val="Titre3"/>
+      </w:pPr>
+      <w:r>
+        <w:t>V.2.5 Rapport hebdomadaire et livrables jour 11</w:t>
+      </w:r>
+    </w:p>
+    <w:p>
+      <w:r>
+        <w:t>Rapport détaillé : OpenVLA_day11_rapport_hebdomadaire.docx. Dossier rapports_hebdomadaires/ pour les synthèses de fin de semaine.</w:t>
+      </w:r>
+    </w:p>
+    <w:p>
+      <w:pPr>
+        <w:pStyle w:val="Listepuces"/>
+      </w:pPr>
+      <w:r>
+        <w:t>Semaine 26–29 mai : boucle continue (jour 08), interprétation logs (jour 09), refactoring pipeline (jour 10).</w:t>
+      </w:r>
+    </w:p>
+    <w:p>
+      <w:pPr>
+        <w:pStyle w:val="Listepuces"/>
+      </w:pPr>
+      <w:r>
+        <w:t>Correction DINO : mapping pixel image → résolution point cloud Zivid (scale_u, scale_v).</w:t>
+      </w:r>
+    </w:p>
+    <w:p>
+      <w:pPr>
+        <w:pStyle w:val="Listepuces"/>
+      </w:pPr>
+      <w:r>
+        <w:t>Objectif semaine suivante : valider T_tcp_cam.npy en réel et tester main_real.py avec workspace.</w:t>
+      </w:r>
+    </w:p>
+    <w:p>
+      <w:pPr>
+        <w:pStyle w:val="Titre2"/>
+      </w:pPr>
+      <w:r>
+        <w:t>IV.3 Jour 09 — Interprétation des résultats de la boucle continue</w:t>
       </w:r>
     </w:p>
     <w:p>
@@ -4025,251 +4031,250 @@
     </w:p>
     <w:p>
       <w:pPr>
-        <w:pStyle w:val="Titre3"/>
-        <w:rPr>
-          <w:lang w:val="fr-CA"/>
-        </w:rPr>
-      </w:pPr>
-      <w:r>
-        <w:rPr>
-          <w:lang w:val="fr-CA"/>
-        </w:rPr>
-        <w:t xml:space="preserve">Jour 08 — boucle continue perception → action → </w:t>
+        <w:pStyle w:val="Titre2"/>
+        <w:rPr>
+          <w:lang w:val="fr-CA"/>
+        </w:rPr>
+      </w:pPr>
+      <w:r>
+        <w:rPr>
+          <w:lang w:val="fr-CA"/>
+        </w:rPr>
+        <w:t>IV.2 Jour 08 — Boucle continue perception → action → réinférence</w:t>
       </w:r>
       <w:proofErr w:type="spellStart"/>
       <w:r>
         <w:rPr>
           <w:lang w:val="fr-CA"/>
         </w:rPr>
+      </w:r>
+      <w:proofErr w:type="spellEnd"/>
+    </w:p>
+    <w:p>
+      <w:pPr>
+        <w:rPr>
+          <w:lang w:val="fr-CA"/>
+        </w:rPr>
+      </w:pPr>
+      <w:r>
+        <w:rPr>
+          <w:lang w:val="fr-CA"/>
+        </w:rPr>
+        <w:t xml:space="preserve">Jour 08 : test d'une boucle continue perception → action → </w:t>
+      </w:r>
+      <w:proofErr w:type="spellStart"/>
+      <w:r>
+        <w:rPr>
+          <w:lang w:val="fr-CA"/>
+        </w:rPr>
         <w:t>réinférence</w:t>
       </w:r>
       <w:proofErr w:type="spellEnd"/>
-    </w:p>
-    <w:p>
-      <w:pPr>
-        <w:rPr>
-          <w:lang w:val="fr-CA"/>
-        </w:rPr>
-      </w:pPr>
-      <w:r>
-        <w:rPr>
-          <w:lang w:val="fr-CA"/>
-        </w:rPr>
-        <w:t xml:space="preserve">Jour 08 : test d'une boucle continue perception → action → </w:t>
+      <w:r>
+        <w:rPr>
+          <w:lang w:val="fr-CA"/>
+        </w:rPr>
+        <w:t xml:space="preserve"> pour rendre le comportement plus adaptatif (correction itérative à chaque nouvelle observation).</w:t>
+      </w:r>
+    </w:p>
+    <w:p>
+      <w:pPr>
+        <w:rPr>
+          <w:lang w:val="fr-CA"/>
+        </w:rPr>
+      </w:pPr>
+      <w:r>
+        <w:rPr>
+          <w:lang w:val="fr-CA"/>
+        </w:rPr>
+        <w:t xml:space="preserve">Option d'efficacité : injecter dans l'instruction </w:t>
       </w:r>
       <w:proofErr w:type="spellStart"/>
       <w:r>
         <w:rPr>
           <w:lang w:val="fr-CA"/>
         </w:rPr>
-        <w:t>réinférence</w:t>
+        <w:t>OpenVLA</w:t>
       </w:r>
       <w:proofErr w:type="spellEnd"/>
       <w:r>
         <w:rPr>
           <w:lang w:val="fr-CA"/>
         </w:rPr>
-        <w:t xml:space="preserve"> pour rendre le comportement plus adaptatif (correction itérative à chaque nouvelle observation).</w:t>
-      </w:r>
-    </w:p>
-    <w:p>
-      <w:pPr>
-        <w:rPr>
-          <w:lang w:val="fr-CA"/>
-        </w:rPr>
-      </w:pPr>
-      <w:r>
-        <w:rPr>
-          <w:lang w:val="fr-CA"/>
-        </w:rPr>
-        <w:t xml:space="preserve">Option d'efficacité : injecter dans l'instruction </w:t>
+        <w:t xml:space="preserve"> les coordonnées (</w:t>
+      </w:r>
+      <w:proofErr w:type="gramStart"/>
+      <w:r>
+        <w:rPr>
+          <w:lang w:val="fr-CA"/>
+        </w:rPr>
+        <w:t>X,Y</w:t>
+      </w:r>
+      <w:proofErr w:type="gramEnd"/>
+      <w:r>
+        <w:rPr>
+          <w:lang w:val="fr-CA"/>
+        </w:rPr>
+        <w:t xml:space="preserve">,Z) projetées issues de </w:t>
       </w:r>
       <w:proofErr w:type="spellStart"/>
       <w:r>
         <w:rPr>
           <w:lang w:val="fr-CA"/>
         </w:rPr>
-        <w:t>OpenVLA</w:t>
+        <w:t>Grounding</w:t>
       </w:r>
       <w:proofErr w:type="spellEnd"/>
       <w:r>
         <w:rPr>
           <w:lang w:val="fr-CA"/>
         </w:rPr>
-        <w:t xml:space="preserve"> les coordonnées (</w:t>
-      </w:r>
+        <w:t xml:space="preserve"> DINO + nuage </w:t>
+      </w:r>
+      <w:proofErr w:type="spellStart"/>
+      <w:r>
+        <w:rPr>
+          <w:lang w:val="fr-CA"/>
+        </w:rPr>
+        <w:t>Zivid</w:t>
+      </w:r>
+      <w:proofErr w:type="spellEnd"/>
+      <w:r>
+        <w:rPr>
+          <w:lang w:val="fr-CA"/>
+        </w:rPr>
+        <w:t xml:space="preserve"> (en plus du label), comme la variante YOLO.</w:t>
+      </w:r>
+    </w:p>
+    <w:p>
+      <w:pPr>
+        <w:pStyle w:val="Listepuces"/>
+      </w:pPr>
       <w:proofErr w:type="gramStart"/>
       <w:r>
-        <w:rPr>
-          <w:lang w:val="fr-CA"/>
-        </w:rPr>
-        <w:t>X,Y</w:t>
+        <w:t>Scripts :</w:t>
       </w:r>
       <w:proofErr w:type="gramEnd"/>
       <w:r>
-        <w:rPr>
-          <w:lang w:val="fr-CA"/>
-        </w:rPr>
-        <w:t xml:space="preserve">,Z) projetées issues de </w:t>
+        <w:t xml:space="preserve"> demo_adaptatif_openvla.py, demo_adaptatif_openvla_print_value.py.</w:t>
+      </w:r>
+    </w:p>
+    <w:p>
+      <w:pPr>
+        <w:pStyle w:val="Listepuces"/>
+        <w:rPr>
+          <w:lang w:val="fr-CA"/>
+        </w:rPr>
+      </w:pPr>
+      <w:r>
+        <w:rPr>
+          <w:lang w:val="fr-CA"/>
+        </w:rPr>
+        <w:t xml:space="preserve">Sortie modèle : 7D (dx, </w:t>
       </w:r>
       <w:proofErr w:type="spellStart"/>
       <w:r>
         <w:rPr>
           <w:lang w:val="fr-CA"/>
         </w:rPr>
-        <w:t>Grounding</w:t>
+        <w:t>dy</w:t>
       </w:r>
       <w:proofErr w:type="spellEnd"/>
       <w:r>
         <w:rPr>
           <w:lang w:val="fr-CA"/>
         </w:rPr>
-        <w:t xml:space="preserve"> DINO + nuage </w:t>
+        <w:t xml:space="preserve">, dz, </w:t>
       </w:r>
       <w:proofErr w:type="spellStart"/>
       <w:r>
         <w:rPr>
           <w:lang w:val="fr-CA"/>
         </w:rPr>
-        <w:t>Zivid</w:t>
+        <w:t>rx</w:t>
       </w:r>
       <w:proofErr w:type="spellEnd"/>
       <w:r>
         <w:rPr>
           <w:lang w:val="fr-CA"/>
         </w:rPr>
-        <w:t xml:space="preserve"> (en plus du label), comme la variante YOLO.</w:t>
+        <w:t xml:space="preserve">, </w:t>
+      </w:r>
+      <w:proofErr w:type="spellStart"/>
+      <w:r>
+        <w:rPr>
+          <w:lang w:val="fr-CA"/>
+        </w:rPr>
+        <w:t>ry</w:t>
+      </w:r>
+      <w:proofErr w:type="spellEnd"/>
+      <w:r>
+        <w:rPr>
+          <w:lang w:val="fr-CA"/>
+        </w:rPr>
+        <w:t xml:space="preserve">, </w:t>
+      </w:r>
+      <w:proofErr w:type="spellStart"/>
+      <w:r>
+        <w:rPr>
+          <w:lang w:val="fr-CA"/>
+        </w:rPr>
+        <w:t>rz</w:t>
+      </w:r>
+      <w:proofErr w:type="spellEnd"/>
+      <w:r>
+        <w:rPr>
+          <w:lang w:val="fr-CA"/>
+        </w:rPr>
+        <w:t xml:space="preserve">, gripper), dénormalisation </w:t>
+      </w:r>
+      <w:proofErr w:type="spellStart"/>
+      <w:r>
+        <w:rPr>
+          <w:lang w:val="fr-CA"/>
+        </w:rPr>
+        <w:t>bridge_orig</w:t>
+      </w:r>
+      <w:proofErr w:type="spellEnd"/>
+      <w:r>
+        <w:rPr>
+          <w:lang w:val="fr-CA"/>
+        </w:rPr>
+        <w:t>.</w:t>
       </w:r>
     </w:p>
     <w:p>
       <w:pPr>
         <w:pStyle w:val="Listepuces"/>
-      </w:pPr>
+        <w:rPr>
+          <w:lang w:val="fr-CA"/>
+        </w:rPr>
+      </w:pPr>
+      <w:r>
+        <w:rPr>
+          <w:lang w:val="fr-CA"/>
+        </w:rPr>
+        <w:t>Données robot : pose TCP et commandes RTDE — exécution uniquement, pas d'inférence directe.</w:t>
+      </w:r>
+    </w:p>
+    <w:p>
+      <w:r>
+        <w:t xml:space="preserve">Rapport </w:t>
+      </w:r>
+      <w:proofErr w:type="spellStart"/>
+      <w:r>
+        <w:t>détaillé</w:t>
+      </w:r>
+      <w:proofErr w:type="spellEnd"/>
+      <w:r>
+        <w:t xml:space="preserve"> jour </w:t>
+      </w:r>
       <w:proofErr w:type="gramStart"/>
       <w:r>
-        <w:t>Scripts :</w:t>
+        <w:t>07 :</w:t>
       </w:r>
       <w:proofErr w:type="gramEnd"/>
       <w:r>
-        <w:t xml:space="preserve"> demo_adaptatif_openvla.py, demo_adaptatif_openvla_print_value.py.</w:t>
-      </w:r>
-    </w:p>
-    <w:p>
-      <w:pPr>
-        <w:pStyle w:val="Listepuces"/>
-        <w:rPr>
-          <w:lang w:val="fr-CA"/>
-        </w:rPr>
-      </w:pPr>
-      <w:r>
-        <w:rPr>
-          <w:lang w:val="fr-CA"/>
-        </w:rPr>
-        <w:t xml:space="preserve">Sortie modèle : 7D (dx, </w:t>
-      </w:r>
-      <w:proofErr w:type="spellStart"/>
-      <w:r>
-        <w:rPr>
-          <w:lang w:val="fr-CA"/>
-        </w:rPr>
-        <w:t>dy</w:t>
-      </w:r>
-      <w:proofErr w:type="spellEnd"/>
-      <w:r>
-        <w:rPr>
-          <w:lang w:val="fr-CA"/>
-        </w:rPr>
-        <w:t xml:space="preserve">, dz, </w:t>
-      </w:r>
-      <w:proofErr w:type="spellStart"/>
-      <w:r>
-        <w:rPr>
-          <w:lang w:val="fr-CA"/>
-        </w:rPr>
-        <w:t>rx</w:t>
-      </w:r>
-      <w:proofErr w:type="spellEnd"/>
-      <w:r>
-        <w:rPr>
-          <w:lang w:val="fr-CA"/>
-        </w:rPr>
-        <w:t xml:space="preserve">, </w:t>
-      </w:r>
-      <w:proofErr w:type="spellStart"/>
-      <w:r>
-        <w:rPr>
-          <w:lang w:val="fr-CA"/>
-        </w:rPr>
-        <w:t>ry</w:t>
-      </w:r>
-      <w:proofErr w:type="spellEnd"/>
-      <w:r>
-        <w:rPr>
-          <w:lang w:val="fr-CA"/>
-        </w:rPr>
-        <w:t xml:space="preserve">, </w:t>
-      </w:r>
-      <w:proofErr w:type="spellStart"/>
-      <w:r>
-        <w:rPr>
-          <w:lang w:val="fr-CA"/>
-        </w:rPr>
-        <w:t>rz</w:t>
-      </w:r>
-      <w:proofErr w:type="spellEnd"/>
-      <w:r>
-        <w:rPr>
-          <w:lang w:val="fr-CA"/>
-        </w:rPr>
-        <w:t xml:space="preserve">, gripper), dénormalisation </w:t>
-      </w:r>
-      <w:proofErr w:type="spellStart"/>
-      <w:r>
-        <w:rPr>
-          <w:lang w:val="fr-CA"/>
-        </w:rPr>
-        <w:t>bridge_orig</w:t>
-      </w:r>
-      <w:proofErr w:type="spellEnd"/>
-      <w:r>
-        <w:rPr>
-          <w:lang w:val="fr-CA"/>
-        </w:rPr>
-        <w:t>.</w:t>
-      </w:r>
-    </w:p>
-    <w:p>
-      <w:pPr>
-        <w:pStyle w:val="Listepuces"/>
-        <w:rPr>
-          <w:lang w:val="fr-CA"/>
-        </w:rPr>
-      </w:pPr>
-      <w:r>
-        <w:rPr>
-          <w:lang w:val="fr-CA"/>
-        </w:rPr>
-        <w:t>Données robot : pose TCP et commandes RTDE — exécution uniquement, pas d'inférence directe.</w:t>
-      </w:r>
-    </w:p>
-    <w:p>
-      <w:r>
-        <w:t xml:space="preserve">Rapport </w:t>
-      </w:r>
-      <w:proofErr w:type="spellStart"/>
-      <w:r>
-        <w:t>détaillé</w:t>
-      </w:r>
-      <w:proofErr w:type="spellEnd"/>
-      <w:r>
-        <w:t xml:space="preserve"> jour </w:t>
-      </w:r>
-      <w:proofErr w:type="gramStart"/>
-      <w:r>
-        <w:t>07 :</w:t>
-      </w:r>
-      <w:proofErr w:type="gramEnd"/>
-      <w:r>
         <w:t xml:space="preserve"> OpenVLA_day07_robot_data.docx. Scripts : demoTest.py, test_zivid_openvla.py.</w:t>
       </w:r>
     </w:p>
@@ -4280,1021 +4285,31 @@
     </w:p>
     <w:p>
       <w:pPr>
-        <w:pStyle w:val="Titre1"/>
-        <w:rPr>
-          <w:lang w:val="fr-CA"/>
-        </w:rPr>
-      </w:pPr>
-      <w:r>
-        <w:rPr>
-          <w:lang w:val="fr-CA"/>
-        </w:rPr>
-        <w:lastRenderedPageBreak/>
-        <w:t xml:space="preserve">III. Comparaison </w:t>
-      </w:r>
-      <w:proofErr w:type="spellStart"/>
-      <w:r>
-        <w:rPr>
-          <w:lang w:val="fr-CA"/>
-        </w:rPr>
-        <w:t>OpenVLA</w:t>
-      </w:r>
-      <w:proofErr w:type="spellEnd"/>
-      <w:r>
-        <w:rPr>
-          <w:lang w:val="fr-CA"/>
-        </w:rPr>
-        <w:t xml:space="preserve"> et robotique traditionnelle</w:t>
-      </w:r>
-    </w:p>
-    <w:p>
-      <w:pPr>
-        <w:pStyle w:val="Titre2"/>
-        <w:rPr>
-          <w:lang w:val="fr-CA"/>
-        </w:rPr>
-      </w:pPr>
-      <w:r>
-        <w:rPr>
-          <w:lang w:val="fr-CA"/>
-        </w:rPr>
-        <w:t>III.1 Programmation de tâches</w:t>
-      </w:r>
-    </w:p>
-    <w:p>
-      <w:pPr>
-        <w:rPr>
-          <w:lang w:val="fr-CA"/>
-        </w:rPr>
-      </w:pPr>
-      <w:proofErr w:type="spellStart"/>
-      <w:r>
-        <w:rPr>
-          <w:lang w:val="fr-CA"/>
-        </w:rPr>
-        <w:t>OpenVLA</w:t>
-      </w:r>
-      <w:proofErr w:type="spellEnd"/>
-      <w:r>
-        <w:rPr>
-          <w:lang w:val="fr-CA"/>
-        </w:rPr>
-        <w:t xml:space="preserve"> peut aider le robot à : mieux comprendre la scène ; mieux choisir l'action ; mieux adapter le mouvement.</w:t>
-      </w:r>
-    </w:p>
-    <w:p>
-      <w:pPr>
-        <w:pStyle w:val="Titre3"/>
-        <w:rPr>
-          <w:lang w:val="fr-CA"/>
-        </w:rPr>
-      </w:pPr>
-      <w:r>
-        <w:rPr>
-          <w:lang w:val="fr-CA"/>
-        </w:rPr>
-        <w:t>III.1 — Robotique classique seule</w:t>
-      </w:r>
-    </w:p>
-    <w:p>
-      <w:pPr>
-        <w:rPr>
-          <w:lang w:val="fr-CA"/>
-        </w:rPr>
-      </w:pPr>
-      <w:r>
-        <w:rPr>
-          <w:lang w:val="fr-CA"/>
-        </w:rPr>
-        <w:t>En robotique classique seule, le robot peut aller précisément au XYZ. Mais il ne comprend pas forcément quoi prendre, dans quel ordre, ni comment s'adapter au contexte.</w:t>
-      </w:r>
-    </w:p>
-    <w:p>
-      <w:pPr>
-        <w:pStyle w:val="Titre3"/>
-      </w:pPr>
-      <w:r>
-        <w:t xml:space="preserve">III.1 — Ce </w:t>
-      </w:r>
-      <w:proofErr w:type="spellStart"/>
-      <w:r>
-        <w:t>qu'OpenVLA</w:t>
-      </w:r>
-      <w:proofErr w:type="spellEnd"/>
-      <w:r>
-        <w:t xml:space="preserve"> ajoute</w:t>
-      </w:r>
-    </w:p>
-    <w:p>
-      <w:pPr>
-        <w:pStyle w:val="Listepuces"/>
-        <w:rPr>
-          <w:lang w:val="fr-CA"/>
-        </w:rPr>
-      </w:pPr>
-      <w:r>
-        <w:rPr>
-          <w:lang w:val="fr-CA"/>
-        </w:rPr>
-        <w:t>Compréhension du langage (consignes en langage naturel).</w:t>
-      </w:r>
-    </w:p>
-    <w:p>
-      <w:pPr>
-        <w:pStyle w:val="Listepuces"/>
-        <w:rPr>
-          <w:lang w:val="fr-CA"/>
-        </w:rPr>
-      </w:pPr>
-      <w:r>
-        <w:rPr>
-          <w:lang w:val="fr-CA"/>
-        </w:rPr>
-        <w:t>Stratégie et planification implicite dans le modèle VLA.</w:t>
-      </w:r>
-    </w:p>
-    <w:p>
-      <w:pPr>
-        <w:pStyle w:val="Listepuces"/>
-      </w:pPr>
-      <w:r>
-        <w:t xml:space="preserve">Adaptation et </w:t>
-      </w:r>
-      <w:proofErr w:type="spellStart"/>
-      <w:r>
-        <w:t>comportement</w:t>
-      </w:r>
-      <w:proofErr w:type="spellEnd"/>
-      <w:r>
-        <w:t xml:space="preserve"> </w:t>
-      </w:r>
-      <w:proofErr w:type="spellStart"/>
-      <w:r>
-        <w:t>contextuel</w:t>
-      </w:r>
-      <w:proofErr w:type="spellEnd"/>
-      <w:r>
-        <w:t>.</w:t>
-      </w:r>
-    </w:p>
-    <w:p>
-      <w:pPr>
-        <w:rPr>
-          <w:lang w:val="fr-CA"/>
-        </w:rPr>
-      </w:pPr>
-      <w:r>
-        <w:rPr>
-          <w:lang w:val="fr-CA"/>
-        </w:rPr>
-        <w:t>Exemples de consignes que le classique peine à interpréter seul : « la tasse est derrière un obstacle » ; « ouvrir le tiroir avant ».</w:t>
-      </w:r>
-    </w:p>
-    <w:p>
-      <w:pPr>
-        <w:rPr>
-          <w:lang w:val="fr-CA"/>
-        </w:rPr>
-      </w:pPr>
-      <w:r>
-        <w:rPr>
-          <w:lang w:val="fr-CA"/>
-        </w:rPr>
-        <w:t>Le démonstrateur du stage reste hybride : RTDE/</w:t>
-      </w:r>
-      <w:proofErr w:type="spellStart"/>
-      <w:r>
-        <w:rPr>
-          <w:lang w:val="fr-CA"/>
-        </w:rPr>
-        <w:t>URScript</w:t>
-      </w:r>
-      <w:proofErr w:type="spellEnd"/>
-      <w:r>
-        <w:rPr>
-          <w:lang w:val="fr-CA"/>
-        </w:rPr>
-        <w:t xml:space="preserve"> pour l'exécution prévisible, </w:t>
-      </w:r>
-      <w:proofErr w:type="spellStart"/>
-      <w:r>
-        <w:rPr>
-          <w:lang w:val="fr-CA"/>
-        </w:rPr>
-        <w:t>OpenVLA</w:t>
-      </w:r>
-      <w:proofErr w:type="spellEnd"/>
-      <w:r>
-        <w:rPr>
-          <w:lang w:val="fr-CA"/>
-        </w:rPr>
-        <w:t xml:space="preserve"> pour la décision image + langage → action.</w:t>
-      </w:r>
-    </w:p>
-    <w:tbl>
-      <w:tblPr>
-        <w:tblStyle w:val="Grilledutableau"/>
-        <w:tblW w:w="0" w:type="auto"/>
-        <w:tblLook w:val="04A0" w:firstRow="1" w:lastRow="0" w:firstColumn="1" w:lastColumn="0" w:noHBand="0" w:noVBand="1"/>
-      </w:tblPr>
-      <w:tblGrid>
-        <w:gridCol w:w="2880"/>
-        <w:gridCol w:w="2880"/>
-        <w:gridCol w:w="2880"/>
-      </w:tblGrid>
-      <w:tr>
-        <w:tc>
-          <w:tcPr>
-            <w:tcW w:w="2880" w:type="dxa"/>
-          </w:tcPr>
-          <w:p>
-            <w:proofErr w:type="spellStart"/>
-            <w:r>
-              <w:t>Critère</w:t>
-            </w:r>
-            <w:proofErr w:type="spellEnd"/>
-          </w:p>
-        </w:tc>
-        <w:tc>
-          <w:tcPr>
-            <w:tcW w:w="2880" w:type="dxa"/>
-          </w:tcPr>
-          <w:p>
-            <w:r>
-              <w:t>Robotique traditionnelle</w:t>
-            </w:r>
-          </w:p>
-        </w:tc>
-        <w:tc>
-          <w:tcPr>
-            <w:tcW w:w="2880" w:type="dxa"/>
-          </w:tcPr>
-          <w:p>
-            <w:r>
-              <w:t>OpenVLA</w:t>
-            </w:r>
-          </w:p>
-        </w:tc>
-      </w:tr>
-      <w:tr>
-        <w:tc>
-          <w:tcPr>
-            <w:tcW w:w="2880" w:type="dxa"/>
-          </w:tcPr>
-          <w:p>
-            <w:r>
-              <w:t>Spécification tâche</w:t>
-            </w:r>
-          </w:p>
-        </w:tc>
-        <w:tc>
-          <w:tcPr>
-            <w:tcW w:w="2880" w:type="dxa"/>
-          </w:tcPr>
-          <w:p>
-            <w:r>
-              <w:t>Programme URScript, waypoints, logique if/while</w:t>
-            </w:r>
-          </w:p>
-        </w:tc>
-        <w:tc>
-          <w:tcPr>
-            <w:tcW w:w="2880" w:type="dxa"/>
-          </w:tcPr>
-          <w:p>
-            <w:r>
-              <w:t>Consigne en langage naturel</w:t>
-            </w:r>
-          </w:p>
-        </w:tc>
-      </w:tr>
-      <w:tr>
-        <w:tc>
-          <w:tcPr>
-            <w:tcW w:w="2880" w:type="dxa"/>
-          </w:tcPr>
-          <w:p>
-            <w:r>
-              <w:t>Généricité</w:t>
-            </w:r>
-          </w:p>
-        </w:tc>
-        <w:tc>
-          <w:tcPr>
-            <w:tcW w:w="2880" w:type="dxa"/>
-          </w:tcPr>
-          <w:p>
-            <w:pPr>
-              <w:rPr>
-                <w:lang w:val="fr-CA"/>
-              </w:rPr>
-            </w:pPr>
-            <w:r>
-              <w:rPr>
-                <w:lang w:val="fr-CA"/>
-              </w:rPr>
-              <w:t>Une tâche = un programme dédié</w:t>
-            </w:r>
-          </w:p>
-        </w:tc>
-        <w:tc>
-          <w:tcPr>
-            <w:tcW w:w="2880" w:type="dxa"/>
-          </w:tcPr>
-          <w:p>
-            <w:r>
-              <w:t xml:space="preserve">Politique </w:t>
-            </w:r>
-            <w:proofErr w:type="spellStart"/>
-            <w:r>
-              <w:t>generaliste</w:t>
-            </w:r>
-            <w:proofErr w:type="spellEnd"/>
-            <w:r>
-              <w:t>, fine-tuning possible</w:t>
-            </w:r>
-          </w:p>
-        </w:tc>
-      </w:tr>
-      <w:tr>
-        <w:tc>
-          <w:tcPr>
-            <w:tcW w:w="2880" w:type="dxa"/>
-          </w:tcPr>
-          <w:p>
-            <w:r>
-              <w:t>Itération</w:t>
-            </w:r>
-          </w:p>
-        </w:tc>
-        <w:tc>
-          <w:tcPr>
-            <w:tcW w:w="2880" w:type="dxa"/>
-          </w:tcPr>
-          <w:p>
-            <w:pPr>
-              <w:rPr>
-                <w:lang w:val="fr-CA"/>
-              </w:rPr>
-            </w:pPr>
-            <w:r>
-              <w:rPr>
-                <w:lang w:val="fr-CA"/>
-              </w:rPr>
-              <w:t>Modifier code et poses manuellement</w:t>
-            </w:r>
-          </w:p>
-        </w:tc>
-        <w:tc>
-          <w:tcPr>
-            <w:tcW w:w="2880" w:type="dxa"/>
-          </w:tcPr>
-          <w:p>
-            <w:pPr>
-              <w:rPr>
-                <w:lang w:val="fr-CA"/>
-              </w:rPr>
-            </w:pPr>
-            <w:r>
-              <w:rPr>
-                <w:lang w:val="fr-CA"/>
-              </w:rPr>
-              <w:t>Changer la consigne texte ou fine-tuner</w:t>
-            </w:r>
-          </w:p>
-        </w:tc>
-      </w:tr>
-      <w:tr>
-        <w:tc>
-          <w:tcPr>
-            <w:tcW w:w="2880" w:type="dxa"/>
-          </w:tcPr>
-          <w:p>
-            <w:proofErr w:type="spellStart"/>
-            <w:r>
-              <w:t>Exemple</w:t>
-            </w:r>
-            <w:proofErr w:type="spellEnd"/>
-            <w:r>
-              <w:t xml:space="preserve"> stage</w:t>
-            </w:r>
-          </w:p>
-        </w:tc>
-        <w:tc>
-          <w:tcPr>
-            <w:tcW w:w="2880" w:type="dxa"/>
-          </w:tcPr>
-          <w:p>
-            <w:r>
-              <w:t>trace_A(n) — 5 poses, boucle while</w:t>
-            </w:r>
-          </w:p>
-        </w:tc>
-        <w:tc>
-          <w:tcPr>
-            <w:tcW w:w="2880" w:type="dxa"/>
-          </w:tcPr>
-          <w:p>
-            <w:r>
-              <w:t>predict_action() — instruction « pick up… »</w:t>
-            </w:r>
-          </w:p>
-        </w:tc>
-      </w:tr>
-    </w:tbl>
-    <w:p/>
-    <w:p>
-      <w:pPr>
-        <w:pStyle w:val="Titre2"/>
-        <w:rPr>
-          <w:lang w:val="fr-CA"/>
-        </w:rPr>
-      </w:pPr>
-      <w:r>
-        <w:rPr>
-          <w:lang w:val="fr-CA"/>
-        </w:rPr>
-        <w:t>III.2 Perception et représentation de la scène</w:t>
-      </w:r>
-    </w:p>
-    <w:p>
-      <w:pPr>
-        <w:rPr>
-          <w:lang w:val="fr-CA"/>
-        </w:rPr>
-      </w:pPr>
-      <w:r>
-        <w:rPr>
-          <w:lang w:val="fr-CA"/>
-        </w:rPr>
-        <w:t>Robot classique — il sait où est la cible (ex. où est la balle), mais il peut heurter l'obstacle, ne pas comprendre la scène dans son ensemble, ou échouer si la trajectoire change.</w:t>
-      </w:r>
-    </w:p>
-    <w:p>
-      <w:pPr>
-        <w:rPr>
-          <w:lang w:val="fr-CA"/>
-        </w:rPr>
-      </w:pPr>
-      <w:proofErr w:type="spellStart"/>
-      <w:r>
-        <w:rPr>
-          <w:lang w:val="fr-CA"/>
-        </w:rPr>
-        <w:t>OpenVLA</w:t>
-      </w:r>
-      <w:proofErr w:type="spellEnd"/>
-      <w:r>
-        <w:rPr>
-          <w:lang w:val="fr-CA"/>
-        </w:rPr>
-        <w:t xml:space="preserve"> peut comprendre une consigne du type « il y a un obstacle » et orienter la décision : contourner, déplacer un objet, changer l'approche, réessayer autrement.</w:t>
-      </w:r>
-    </w:p>
-    <w:p>
-      <w:pPr>
-        <w:pStyle w:val="Listepuces"/>
-        <w:rPr>
-          <w:lang w:val="fr-CA"/>
-        </w:rPr>
-      </w:pPr>
-      <w:r>
-        <w:rPr>
-          <w:lang w:val="fr-CA"/>
-        </w:rPr>
-        <w:t>Traditionnel : calibration caméra-robot, extraction de primitives (contours, nuage de points PLY), règles ou algorithmes dédiés.</w:t>
-      </w:r>
-    </w:p>
-    <w:p>
-      <w:pPr>
-        <w:pStyle w:val="Listepuces"/>
-        <w:rPr>
-          <w:lang w:val="fr-CA"/>
-        </w:rPr>
-      </w:pPr>
-      <w:proofErr w:type="spellStart"/>
-      <w:r>
-        <w:rPr>
-          <w:lang w:val="fr-CA"/>
-        </w:rPr>
-        <w:t>OpenVLA</w:t>
-      </w:r>
-      <w:proofErr w:type="spellEnd"/>
-      <w:r>
-        <w:rPr>
-          <w:lang w:val="fr-CA"/>
-        </w:rPr>
-        <w:t xml:space="preserve"> : end-to-end à partir d'une image RGB ; le modèle apprend implicitement les corrélations </w:t>
-      </w:r>
-      <w:proofErr w:type="spellStart"/>
-      <w:r>
-        <w:rPr>
-          <w:lang w:val="fr-CA"/>
-        </w:rPr>
-        <w:t>visuo-motrices</w:t>
-      </w:r>
-      <w:proofErr w:type="spellEnd"/>
-      <w:r>
-        <w:rPr>
-          <w:lang w:val="fr-CA"/>
-        </w:rPr>
-        <w:t>.</w:t>
-      </w:r>
-    </w:p>
-    <w:p>
-      <w:pPr>
-        <w:pStyle w:val="Listepuces"/>
-        <w:rPr>
-          <w:lang w:val="fr-CA"/>
-        </w:rPr>
-      </w:pPr>
-      <w:r>
-        <w:rPr>
-          <w:lang w:val="fr-CA"/>
-        </w:rPr>
-        <w:t xml:space="preserve">Stage : </w:t>
-      </w:r>
-      <w:proofErr w:type="spellStart"/>
-      <w:r>
-        <w:rPr>
-          <w:lang w:val="fr-CA"/>
-        </w:rPr>
-        <w:t>Zivid</w:t>
-      </w:r>
-      <w:proofErr w:type="spellEnd"/>
-      <w:r>
-        <w:rPr>
-          <w:lang w:val="fr-CA"/>
-        </w:rPr>
-        <w:t xml:space="preserve"> fournit 2D et 3D ; </w:t>
-      </w:r>
-      <w:proofErr w:type="spellStart"/>
-      <w:r>
-        <w:rPr>
-          <w:lang w:val="fr-CA"/>
-        </w:rPr>
-        <w:t>OpenVLA</w:t>
-      </w:r>
-      <w:proofErr w:type="spellEnd"/>
-      <w:r>
-        <w:rPr>
-          <w:lang w:val="fr-CA"/>
-        </w:rPr>
-        <w:t xml:space="preserve"> consomme le RGB 224×224. YOLOv8n (classes COCO) ou </w:t>
-      </w:r>
-      <w:proofErr w:type="spellStart"/>
-      <w:r>
-        <w:rPr>
-          <w:lang w:val="fr-CA"/>
-        </w:rPr>
-        <w:t>Grounding</w:t>
-      </w:r>
-      <w:proofErr w:type="spellEnd"/>
-      <w:r>
-        <w:rPr>
-          <w:lang w:val="fr-CA"/>
-        </w:rPr>
-        <w:t xml:space="preserve"> DINO (texte libre) relient détection 2D au nuage de points (Figure 2). </w:t>
-      </w:r>
-      <w:r>
-        <w:t xml:space="preserve">Voir </w:t>
-      </w:r>
-      <w:proofErr w:type="spellStart"/>
-      <w:r>
-        <w:t>comparaison</w:t>
-      </w:r>
-      <w:proofErr w:type="spellEnd"/>
-      <w:r>
-        <w:t xml:space="preserve"> jour 07.</w:t>
-      </w:r>
-    </w:p>
-    <w:p>
-      <w:pPr>
-        <w:pStyle w:val="Titre2"/>
-      </w:pPr>
-      <w:r>
-        <w:lastRenderedPageBreak/>
-        <w:t xml:space="preserve">III.3 Planification, </w:t>
-      </w:r>
-      <w:proofErr w:type="spellStart"/>
-      <w:r>
-        <w:t>contrôle</w:t>
-      </w:r>
-      <w:proofErr w:type="spellEnd"/>
-      <w:r>
-        <w:t xml:space="preserve"> et </w:t>
-      </w:r>
-      <w:proofErr w:type="spellStart"/>
-      <w:r>
-        <w:t>intégration</w:t>
-      </w:r>
-      <w:proofErr w:type="spellEnd"/>
-    </w:p>
-    <w:p>
-      <w:r>
-        <w:t>OpenVLA aide surtout à :</w:t>
-      </w:r>
-    </w:p>
-    <w:p>
-      <w:pPr>
-        <w:pStyle w:val="Listepuces"/>
-        <w:rPr>
-          <w:lang w:val="fr-CA"/>
-        </w:rPr>
-      </w:pPr>
-      <w:r>
-        <w:rPr>
-          <w:lang w:val="fr-CA"/>
-        </w:rPr>
-        <w:t>Raisonner et planifier à partir de la scène et du langage.</w:t>
-      </w:r>
-    </w:p>
-    <w:p>
-      <w:pPr>
-        <w:pStyle w:val="Listepuces"/>
-        <w:rPr>
-          <w:lang w:val="fr-CA"/>
-        </w:rPr>
-      </w:pPr>
-      <w:r>
-        <w:rPr>
-          <w:lang w:val="fr-CA"/>
-        </w:rPr>
-        <w:t>Adapter le mouvement et corriger en boucle fermée.</w:t>
-      </w:r>
-    </w:p>
-    <w:p>
-      <w:pPr>
-        <w:pStyle w:val="Listepuces"/>
-        <w:rPr>
-          <w:lang w:val="fr-CA"/>
-        </w:rPr>
-      </w:pPr>
-      <w:r>
-        <w:rPr>
-          <w:lang w:val="fr-CA"/>
-        </w:rPr>
-        <w:t>Gérer des scènes complexes et comprendre le langage humain.</w:t>
-      </w:r>
-    </w:p>
-    <w:p>
-      <w:pPr>
-        <w:pStyle w:val="Listepuces"/>
-        <w:rPr>
-          <w:lang w:val="fr-CA"/>
-        </w:rPr>
-      </w:pPr>
-      <w:r>
-        <w:rPr>
-          <w:lang w:val="fr-CA"/>
-        </w:rPr>
-        <w:t xml:space="preserve">Traditionnel : planification explicite (trajectoires </w:t>
-      </w:r>
-      <w:proofErr w:type="spellStart"/>
-      <w:r>
-        <w:rPr>
-          <w:lang w:val="fr-CA"/>
-        </w:rPr>
-        <w:t>movej</w:t>
-      </w:r>
-      <w:proofErr w:type="spellEnd"/>
-      <w:r>
-        <w:rPr>
-          <w:lang w:val="fr-CA"/>
-        </w:rPr>
-        <w:t>/</w:t>
-      </w:r>
-      <w:proofErr w:type="spellStart"/>
-      <w:r>
-        <w:rPr>
-          <w:lang w:val="fr-CA"/>
-        </w:rPr>
-        <w:t>movel</w:t>
-      </w:r>
-      <w:proofErr w:type="spellEnd"/>
-      <w:r>
-        <w:rPr>
-          <w:lang w:val="fr-CA"/>
-        </w:rPr>
-        <w:t>), contrôle PID ou servos RTDE, séquence déterministe.</w:t>
-      </w:r>
-    </w:p>
-    <w:p>
-      <w:pPr>
-        <w:pStyle w:val="Listepuces"/>
-        <w:rPr>
-          <w:lang w:val="fr-CA"/>
-        </w:rPr>
-      </w:pPr>
-      <w:proofErr w:type="spellStart"/>
-      <w:r>
-        <w:rPr>
-          <w:lang w:val="fr-CA"/>
-        </w:rPr>
-        <w:t>OpenVLA</w:t>
-      </w:r>
-      <w:proofErr w:type="spellEnd"/>
-      <w:r>
-        <w:rPr>
-          <w:lang w:val="fr-CA"/>
-        </w:rPr>
-        <w:t xml:space="preserve"> : planification implicite dans le LLM ; sortie = delta d'action instantané, adapté au contrôle itératif (</w:t>
-      </w:r>
-      <w:proofErr w:type="spellStart"/>
-      <w:r>
-        <w:rPr>
-          <w:lang w:val="fr-CA"/>
-        </w:rPr>
-        <w:t>receding</w:t>
-      </w:r>
-      <w:proofErr w:type="spellEnd"/>
-      <w:r>
-        <w:rPr>
-          <w:lang w:val="fr-CA"/>
-        </w:rPr>
-        <w:t xml:space="preserve"> horizon).</w:t>
-      </w:r>
-    </w:p>
-    <w:p>
-      <w:pPr>
-        <w:pStyle w:val="Listepuces"/>
-        <w:rPr>
-          <w:lang w:val="fr-CA"/>
-        </w:rPr>
-      </w:pPr>
-      <w:r>
-        <w:rPr>
-          <w:lang w:val="fr-CA"/>
-        </w:rPr>
-        <w:t>Avantage traditionnel : prévisibilité, sécurité, traçabilité des mouvements (validé jour 03 — tracé A).</w:t>
-      </w:r>
-    </w:p>
-    <w:p>
-      <w:pPr>
-        <w:pStyle w:val="Listepuces"/>
-        <w:rPr>
-          <w:lang w:val="fr-CA"/>
-        </w:rPr>
-      </w:pPr>
-      <w:r>
-        <w:rPr>
-          <w:lang w:val="fr-CA"/>
-        </w:rPr>
-        <w:t xml:space="preserve">Avantage </w:t>
-      </w:r>
-      <w:proofErr w:type="spellStart"/>
-      <w:r>
-        <w:rPr>
-          <w:lang w:val="fr-CA"/>
-        </w:rPr>
-        <w:t>OpenVLA</w:t>
-      </w:r>
-      <w:proofErr w:type="spellEnd"/>
-      <w:r>
-        <w:rPr>
-          <w:lang w:val="fr-CA"/>
-        </w:rPr>
-        <w:t xml:space="preserve"> : flexibilité sémantique, </w:t>
-      </w:r>
-      <w:proofErr w:type="spellStart"/>
-      <w:r>
-        <w:rPr>
-          <w:lang w:val="fr-CA"/>
-        </w:rPr>
-        <w:t>generalisation</w:t>
-      </w:r>
-      <w:proofErr w:type="spellEnd"/>
-      <w:r>
-        <w:rPr>
-          <w:lang w:val="fr-CA"/>
-        </w:rPr>
-        <w:t xml:space="preserve"> à de nouvelles consignes sans reprogrammation complète.</w:t>
-      </w:r>
-    </w:p>
-    <w:p>
-      <w:pPr>
-        <w:pStyle w:val="Titre2"/>
-        <w:rPr>
-          <w:lang w:val="fr-CA"/>
-        </w:rPr>
-      </w:pPr>
-      <w:r>
-        <w:rPr>
-          <w:lang w:val="fr-CA"/>
-        </w:rPr>
-        <w:t>III.4 Synthèse pour le démonstrateur CCNB-INNOV</w:t>
-      </w:r>
-    </w:p>
-    <w:p>
-      <w:pPr>
-        <w:rPr>
-          <w:lang w:val="fr-CA"/>
-        </w:rPr>
-      </w:pPr>
-      <w:r>
-        <w:rPr>
-          <w:lang w:val="fr-CA"/>
-        </w:rPr>
-        <w:t xml:space="preserve">Tandis que Zivid + nuage de points fournissent la géométrie précise (RGB, profondeur, XYZ en mètres), </w:t>
-      </w:r>
-      <w:proofErr w:type="spellStart"/>
-      <w:r>
-        <w:rPr>
-          <w:lang w:val="fr-CA"/>
-        </w:rPr>
-        <w:t>OpenVLA</w:t>
-      </w:r>
-      <w:proofErr w:type="spellEnd"/>
-      <w:r>
-        <w:rPr>
-          <w:lang w:val="fr-CA"/>
-        </w:rPr>
-        <w:t xml:space="preserve"> apporte la couche sémantique et décisionnelle au-dessus de cette perception.</w:t>
-      </w:r>
-    </w:p>
-    <w:p>
-      <w:pPr>
-        <w:rPr>
-          <w:lang w:val="fr-CA"/>
-        </w:rPr>
-      </w:pPr>
-      <w:r>
-        <w:rPr>
-          <w:lang w:val="fr-CA"/>
-        </w:rPr>
-        <w:t>Le démonstrateur du stage adopte une approche hybride pragmatique :</w:t>
-      </w:r>
-    </w:p>
-    <w:p>
-      <w:pPr>
-        <w:pStyle w:val="Listepuces"/>
-        <w:rPr>
-          <w:lang w:val="fr-CA"/>
-        </w:rPr>
-      </w:pPr>
-      <w:r>
-        <w:rPr>
-          <w:lang w:val="fr-CA"/>
-        </w:rPr>
-        <w:t>Robotique classique pour valider l'exécution (</w:t>
-      </w:r>
-      <w:proofErr w:type="spellStart"/>
-      <w:r>
-        <w:rPr>
-          <w:lang w:val="fr-CA"/>
-        </w:rPr>
-        <w:t>URScript</w:t>
-      </w:r>
-      <w:proofErr w:type="spellEnd"/>
-      <w:r>
-        <w:rPr>
-          <w:lang w:val="fr-CA"/>
-        </w:rPr>
-        <w:t>, RTDE) et sécuriser les mouvements.</w:t>
-      </w:r>
-    </w:p>
-    <w:p>
-      <w:pPr>
-        <w:pStyle w:val="Listepuces"/>
-        <w:rPr>
-          <w:lang w:val="fr-CA"/>
-        </w:rPr>
-      </w:pPr>
-      <w:proofErr w:type="spellStart"/>
-      <w:r>
-        <w:rPr>
-          <w:lang w:val="fr-CA"/>
-        </w:rPr>
-        <w:t>OpenVLA</w:t>
-      </w:r>
-      <w:proofErr w:type="spellEnd"/>
-      <w:r>
-        <w:rPr>
-          <w:lang w:val="fr-CA"/>
-        </w:rPr>
-        <w:t xml:space="preserve"> pour la couche décisionnelle haute niveau (image + langage → action).</w:t>
-      </w:r>
-    </w:p>
-    <w:p>
-      <w:pPr>
-        <w:pStyle w:val="Listepuces"/>
-        <w:rPr>
-          <w:lang w:val="fr-CA"/>
-        </w:rPr>
-      </w:pPr>
-      <w:r>
-        <w:rPr>
-          <w:lang w:val="fr-CA"/>
-        </w:rPr>
-        <w:t>Zivid comme capteur riche (2D/3D) alimentant la perception.</w:t>
-      </w:r>
-    </w:p>
-    <w:p>
-      <w:pPr>
-        <w:pStyle w:val="Listepuces"/>
-        <w:rPr>
-          <w:lang w:val="fr-CA"/>
-        </w:rPr>
-      </w:pPr>
-      <w:r>
-        <w:rPr>
-          <w:lang w:val="fr-CA"/>
-        </w:rPr>
-        <w:t>Environnements Conda Python 3.11 séparés (</w:t>
-      </w:r>
-      <w:proofErr w:type="spellStart"/>
-      <w:r>
-        <w:rPr>
-          <w:lang w:val="fr-CA"/>
-        </w:rPr>
-        <w:t>env_zivid</w:t>
-      </w:r>
-      <w:proofErr w:type="spellEnd"/>
-      <w:r>
-        <w:rPr>
-          <w:lang w:val="fr-CA"/>
-        </w:rPr>
-        <w:t xml:space="preserve">, </w:t>
-      </w:r>
-      <w:proofErr w:type="spellStart"/>
-      <w:r>
-        <w:rPr>
-          <w:lang w:val="fr-CA"/>
-        </w:rPr>
-        <w:t>env_ur</w:t>
-      </w:r>
-      <w:proofErr w:type="spellEnd"/>
-      <w:r>
-        <w:rPr>
-          <w:lang w:val="fr-CA"/>
-        </w:rPr>
-        <w:t xml:space="preserve">, </w:t>
-      </w:r>
-      <w:proofErr w:type="spellStart"/>
-      <w:r>
-        <w:rPr>
-          <w:lang w:val="fr-CA"/>
-        </w:rPr>
-        <w:t>env_integration</w:t>
-      </w:r>
-      <w:proofErr w:type="spellEnd"/>
-      <w:r>
-        <w:rPr>
-          <w:lang w:val="fr-CA"/>
-        </w:rPr>
-        <w:t xml:space="preserve">, </w:t>
-      </w:r>
-      <w:proofErr w:type="spellStart"/>
-      <w:r>
-        <w:rPr>
-          <w:lang w:val="fr-CA"/>
-        </w:rPr>
-        <w:t>env_openvla</w:t>
-      </w:r>
-      <w:proofErr w:type="spellEnd"/>
-      <w:r>
-        <w:rPr>
-          <w:lang w:val="fr-CA"/>
-        </w:rPr>
-        <w:t>) puis convergence vers l'intégration.</w:t>
-      </w:r>
-    </w:p>
-    <w:p>
-      <w:pPr>
-        <w:rPr>
-          <w:lang w:val="fr-CA"/>
-        </w:rPr>
-      </w:pPr>
-      <w:r>
-        <w:rPr>
-          <w:lang w:val="fr-CA"/>
-        </w:rPr>
-        <w:t>Les parties IV à VII du rapport (démonstrateur expérimental, essais, documentation, présentation) seront complétées au fil des prochaines journées de stage.</w:t>
-      </w:r>
-    </w:p>
-    <w:p>
-      <w:pPr>
-        <w:rPr>
-          <w:lang w:val="fr-CA"/>
-        </w:rPr>
-      </w:pPr>
-    </w:p>
-    <w:p>
-      <w:pPr>
-        <w:rPr>
-          <w:lang w:val="fr-CA"/>
-        </w:rPr>
-      </w:pPr>
-      <w:r>
-        <w:t>Programmeur : Fabrice Kouonang | Projet : OpenVLA — Stage CCNB-INNOV | Rapport final — I à III + jour 11 (calibration T_tcp_cam)</w:t>
-      </w:r>
-    </w:p>
-    <w:sectPr>
-      <w:pgSz w:w="12240" w:h="15840"/>
-      <w:pgMar w:top="1440" w:right="1800" w:bottom="1440" w:left="1800" w:header="720" w:footer="720" w:gutter="0"/>
-      <w:cols w:space="720"/>
-      <w:docGrid w:linePitch="360"/>
-    </w:sectPr>
+        <w:rPr>
+          <w:lang w:val="fr-CA"/>
+        </w:rPr>
+      </w:pPr>
+      <w:r>
+        <w:t>Les parties IV (tests et intégration) et V (pipeline final du démonstrateur, jours 08 à 11) complètent ce rapport. Les sections VI–VII (documentation et présentation) seront finalisées en fin de stage.</w:t>
+      </w:r>
+    </w:p>
+    <w:p>
+      <w:pPr>
+        <w:rPr>
+          <w:lang w:val="fr-CA"/>
+        </w:rPr>
+      </w:pPr>
+    </w:p>
+    <w:p>
+      <w:pPr>
+        <w:rPr>
+          <w:lang w:val="fr-CA"/>
+        </w:rPr>
+      </w:pPr>
+      <w:r>
+        <w:t>Programmeur : Fabrice Kouonang | Projet : OpenVLA — Stage CCNB-INNOV | Rapport final — parties I à V</w:t>
+      </w:r>
+    </w:p>
   </w:body>
 </w:document>
 </file>

</xml_diff>